<commit_message>
Interview-first as default: Step 1 now interviews the user and writes CLAUDE.md progressively
</commit_message>
<xml_diff>
--- a/gtm-audit-bundle-combined.docx
+++ b/gtm-audit-bundle-combined.docx
@@ -831,7 +831,7 @@
       </w:r>
     </w:p>
     <w:bookmarkEnd w:id="18"/>
-    <w:bookmarkStart w:id="19" w:name="step-3-fill-in-claude.md"/>
+    <w:bookmarkStart w:id="19" w:name="Xfd27a84db74deb94109549c423df99f37315a33"/>
     <w:p>
       <w:pPr>
         <w:pStyle w:val="Heading3"/>
@@ -846,7 +846,7 @@
         <w:tab/>
       </w:r>
       <w:r>
-        <w:t xml:space="preserve">Step 3: Fill in CLAUDE.md</w:t>
+        <w:t xml:space="preserve">Step 3: Populate CLAUDE.md (or let Claude interview you)</w:t>
       </w:r>
     </w:p>
     <w:p>
@@ -854,34 +854,7 @@
         <w:pStyle w:val="FirstParagraph"/>
       </w:pPr>
       <w:r>
-        <w:t xml:space="preserve">Open the</w:t>
-      </w:r>
-      <w:r>
-        <w:t xml:space="preserve"> </w:t>
-      </w:r>
-      <w:r>
-        <w:rPr>
-          <w:rStyle w:val="VerbatimChar"/>
-        </w:rPr>
-        <w:t xml:space="preserve">CLAUDE.md</w:t>
-      </w:r>
-      <w:r>
-        <w:t xml:space="preserve"> </w:t>
-      </w:r>
-      <w:r>
-        <w:t xml:space="preserve">file from this bundle and replace every placeholder (anything inside</w:t>
-      </w:r>
-      <w:r>
-        <w:t xml:space="preserve"> </w:t>
-      </w:r>
-      <w:r>
-        <w:rPr>
-          <w:rStyle w:val="VerbatimChar"/>
-        </w:rPr>
-        <w:t xml:space="preserve">{curly braces}</w:t>
-      </w:r>
-      <w:r>
-        <w:t xml:space="preserve">) with your brand’s specifics. Product, audience, positioning, pricing, catalog, tool stack, competitors, constraints, goals. Every field.</w:t>
+        <w:t xml:space="preserve">You have two options:</w:t>
       </w:r>
     </w:p>
     <w:p>
@@ -893,13 +866,117 @@
           <w:b/>
           <w:bCs/>
         </w:rPr>
+        <w:t xml:space="preserve">Option A (recommended, fastest):</w:t>
+      </w:r>
+      <w:r>
+        <w:t xml:space="preserve"> </w:t>
+      </w:r>
+      <w:r>
+        <w:t xml:space="preserve">Leave</w:t>
+      </w:r>
+      <w:r>
+        <w:t xml:space="preserve"> </w:t>
+      </w:r>
+      <w:r>
+        <w:rPr>
+          <w:rStyle w:val="VerbatimChar"/>
+        </w:rPr>
+        <w:t xml:space="preserve">CLAUDE.md</w:t>
+      </w:r>
+      <w:r>
+        <w:t xml:space="preserve"> </w:t>
+      </w:r>
+      <w:r>
+        <w:t xml:space="preserve">as-is. When you run the master prompt in Step 5, Claude will interview you conversationally: brand overview, product, audience, positioning, tool stack, constraints, goals. Claude writes the file for you progressively as you answer. Takes about 10 minutes.</w:t>
+      </w:r>
+    </w:p>
+    <w:p>
+      <w:pPr>
+        <w:pStyle w:val="BodyText"/>
+      </w:pPr>
+      <w:r>
+        <w:rPr>
+          <w:b/>
+          <w:bCs/>
+        </w:rPr>
+        <w:t xml:space="preserve">Option B (DIY):</w:t>
+      </w:r>
+      <w:r>
+        <w:t xml:space="preserve"> </w:t>
+      </w:r>
+      <w:r>
+        <w:t xml:space="preserve">Open</w:t>
+      </w:r>
+      <w:r>
+        <w:t xml:space="preserve"> </w:t>
+      </w:r>
+      <w:r>
+        <w:rPr>
+          <w:rStyle w:val="VerbatimChar"/>
+        </w:rPr>
+        <w:t xml:space="preserve">CLAUDE.md</w:t>
+      </w:r>
+      <w:r>
+        <w:t xml:space="preserve"> </w:t>
+      </w:r>
+      <w:r>
+        <w:t xml:space="preserve">and replace every</w:t>
+      </w:r>
+      <w:r>
+        <w:t xml:space="preserve"> </w:t>
+      </w:r>
+      <w:r>
+        <w:rPr>
+          <w:rStyle w:val="VerbatimChar"/>
+        </w:rPr>
+        <w:t xml:space="preserve">{placeholder}</w:t>
+      </w:r>
+      <w:r>
+        <w:t xml:space="preserve"> </w:t>
+      </w:r>
+      <w:r>
+        <w:t xml:space="preserve">with your brand’s specifics yourself before running the audit. Founder voice, one or two sentences per field.</w:t>
+      </w:r>
+    </w:p>
+    <w:p>
+      <w:pPr>
+        <w:pStyle w:val="BodyText"/>
+      </w:pPr>
+      <w:r>
+        <w:t xml:space="preserve">Either option produces the same end state: a populated</w:t>
+      </w:r>
+      <w:r>
+        <w:t xml:space="preserve"> </w:t>
+      </w:r>
+      <w:r>
+        <w:rPr>
+          <w:rStyle w:val="VerbatimChar"/>
+        </w:rPr>
+        <w:t xml:space="preserve">CLAUDE.md</w:t>
+      </w:r>
+      <w:r>
+        <w:t xml:space="preserve"> </w:t>
+      </w:r>
+      <w:r>
+        <w:t xml:space="preserve">that grounds every playbook you run from this folder.</w:t>
+      </w:r>
+    </w:p>
+    <w:p>
+      <w:pPr>
+        <w:pStyle w:val="BodyText"/>
+      </w:pPr>
+      <w:r>
+        <w:rPr>
+          <w:b/>
+          <w:bCs/>
+        </w:rPr>
         <w:t xml:space="preserve">Gotcha #3:</w:t>
       </w:r>
       <w:r>
         <w:t xml:space="preserve"> </w:t>
       </w:r>
       <w:r>
-        <w:t xml:space="preserve">Don’t skip the competitor URLs. The audit auto-pulls competitor keyword data via DataForSEO. If you don’t supply 3 to 5 competitor URLs, Claude will ask for them mid-run or auto-discover them based on the SERPs for your category, the auto-discovery works but your hand-picked list is always sharper.</w:t>
+        <w:t xml:space="preserve">However you populate it, the three-to-five competitor URLs are load-bearing. The audit auto-pulls competitor keyword data via DataForSEO in Section 3. Without competitor URLs Claude has to auto-discover them from the SERPs, which usually works but your hand-picked list is always sharper.</w:t>
       </w:r>
     </w:p>
     <w:bookmarkEnd w:id="19"/>
@@ -3072,7 +3149,7 @@
         <w:rPr>
           <w:rStyle w:val="FunctionTok"/>
         </w:rPr>
-        <w:t xml:space="preserve"># Business brief — {Your brand}</w:t>
+        <w:t xml:space="preserve"># Business brief: {Your brand}</w:t>
       </w:r>
       <w:r>
         <w:br/>
@@ -3084,7 +3161,61 @@
         <w:rPr>
           <w:rStyle w:val="AttributeTok"/>
         </w:rPr>
-        <w:t xml:space="preserve">&gt; This file is a template. Replace every </w:t>
+        <w:t xml:space="preserve">&gt; This file is the business brief Claude Code loads automatically on every session start. It grounds every playbook you run from this folder in your brand's specifics.</w:t>
+      </w:r>
+      <w:r>
+        <w:br/>
+      </w:r>
+      <w:r>
+        <w:rPr>
+          <w:rStyle w:val="AttributeTok"/>
+        </w:rPr>
+        <w:t xml:space="preserve">&gt;</w:t>
+      </w:r>
+      <w:r>
+        <w:br/>
+      </w:r>
+      <w:r>
+        <w:rPr>
+          <w:rStyle w:val="AttributeTok"/>
+        </w:rPr>
+        <w:t xml:space="preserve">&gt; **Two ways to populate it:**</w:t>
+      </w:r>
+      <w:r>
+        <w:br/>
+      </w:r>
+      <w:r>
+        <w:rPr>
+          <w:rStyle w:val="AttributeTok"/>
+        </w:rPr>
+        <w:t xml:space="preserve">&gt;</w:t>
+      </w:r>
+      <w:r>
+        <w:br/>
+      </w:r>
+      <w:r>
+        <w:rPr>
+          <w:rStyle w:val="AttributeTok"/>
+        </w:rPr>
+        <w:t xml:space="preserve">&gt; **Option A (fastest, recommended).** Leave the file as-is (or delete it entirely). Run the GTM Audit master prompt and Claude will interview you conversationally, ask every question below, and fill in the file for you as you go. Takes about 10 minutes. You answer questions in plain language; Claude writes the structured brief.</w:t>
+      </w:r>
+      <w:r>
+        <w:br/>
+      </w:r>
+      <w:r>
+        <w:rPr>
+          <w:rStyle w:val="AttributeTok"/>
+        </w:rPr>
+        <w:t xml:space="preserve">&gt;</w:t>
+      </w:r>
+      <w:r>
+        <w:br/>
+      </w:r>
+      <w:r>
+        <w:rPr>
+          <w:rStyle w:val="AttributeTok"/>
+        </w:rPr>
+        <w:t xml:space="preserve">&gt; **Option B (DIY).** Fill in every </w:t>
       </w:r>
       <w:r>
         <w:rPr>
@@ -3096,7 +3227,7 @@
         <w:rPr>
           <w:rStyle w:val="AttributeTok"/>
         </w:rPr>
-        <w:t xml:space="preserve"> with your specifics. Claude Code loads this file automatically on every session start, so the audit (and any other work you run in this folder) is grounded in your business rather than generic DTC assumptions.</w:t>
+        <w:t xml:space="preserve"> yourself before running the audit. Keep it tight: one to two sentences per field. Use founder voice over marketing copy.</w:t>
       </w:r>
       <w:r>
         <w:br/>
@@ -3114,7 +3245,19 @@
         <w:rPr>
           <w:rStyle w:val="AttributeTok"/>
         </w:rPr>
-        <w:t xml:space="preserve">&gt; Keep it tight. One to two sentences per field beats a paragraph. Founder voice beats marketing copy.</w:t>
+        <w:t xml:space="preserve">&gt; Either way the end state is the same: a populated </w:t>
+      </w:r>
+      <w:r>
+        <w:rPr>
+          <w:rStyle w:val="InformationTok"/>
+        </w:rPr>
+        <w:t xml:space="preserve">`CLAUDE.md`</w:t>
+      </w:r>
+      <w:r>
+        <w:rPr>
+          <w:rStyle w:val="AttributeTok"/>
+        </w:rPr>
+        <w:t xml:space="preserve"> that every future playbook (GTM audit, SEO audit, weekly review, etc.) reads from.</w:t>
       </w:r>
       <w:r>
         <w:br/>
@@ -4063,7 +4206,7 @@
         <w:rPr>
           <w:rStyle w:val="FunctionTok"/>
         </w:rPr>
-        <w:t xml:space="preserve"># Initial GTM Audit — Master Prompt</w:t>
+        <w:t xml:space="preserve"># Initial GTM Audit: Master Prompt</w:t>
       </w:r>
       <w:r>
         <w:br/>
@@ -4075,306 +4218,477 @@
         <w:rPr>
           <w:rStyle w:val="AttributeTok"/>
         </w:rPr>
-        <w:t xml:space="preserve">&gt; Paste this entire file into Claude Code from a folder containing your </w:t>
+        <w:t xml:space="preserve">&gt; Paste this entire file into Claude Code from a folder containing a </w:t>
       </w:r>
       <w:r>
         <w:rPr>
           <w:rStyle w:val="InformationTok"/>
         </w:rPr>
+        <w:t xml:space="preserve">`.env`</w:t>
+      </w:r>
+      <w:r>
+        <w:rPr>
+          <w:rStyle w:val="AttributeTok"/>
+        </w:rPr>
+        <w:t xml:space="preserve"> (your API keys). If a </w:t>
+      </w:r>
+      <w:r>
+        <w:rPr>
+          <w:rStyle w:val="InformationTok"/>
+        </w:rPr>
         <w:t xml:space="preserve">`CLAUDE.md`</w:t>
       </w:r>
       <w:r>
         <w:rPr>
           <w:rStyle w:val="AttributeTok"/>
         </w:rPr>
-        <w:t xml:space="preserve"> (the business brief) and a </w:t>
+        <w:t xml:space="preserve"> business brief is already present and filled in, Claude loads it and proceeds. Otherwise Claude interviews you conversationally for the business specifics and writes the </w:t>
       </w:r>
       <w:r>
         <w:rPr>
           <w:rStyle w:val="InformationTok"/>
         </w:rPr>
+        <w:t xml:space="preserve">`CLAUDE.md`</w:t>
+      </w:r>
+      <w:r>
+        <w:rPr>
+          <w:rStyle w:val="AttributeTok"/>
+        </w:rPr>
+        <w:t xml:space="preserve"> for you. Either way, Claude runs the audit end-to-end, produces a single consolidated report in markdown and Word formats, and saves supporting data alongside.</w:t>
+      </w:r>
+      <w:r>
+        <w:br/>
+      </w:r>
+      <w:r>
+        <w:rPr>
+          <w:rStyle w:val="AttributeTok"/>
+        </w:rPr>
+        <w:t xml:space="preserve">&gt;</w:t>
+      </w:r>
+      <w:r>
+        <w:br/>
+      </w:r>
+      <w:r>
+        <w:rPr>
+          <w:rStyle w:val="AttributeTok"/>
+        </w:rPr>
+        <w:t xml:space="preserve">&gt; Built by Nishant Kapoor at EntireCommerce AI. Version 2, April 2026.</w:t>
+      </w:r>
+      <w:r>
+        <w:br/>
+      </w:r>
+      <w:r>
+        <w:br/>
+      </w:r>
+      <w:r>
+        <w:rPr>
+          <w:rStyle w:val="NormalTok"/>
+        </w:rPr>
+        <w:t xml:space="preserve">---</w:t>
+      </w:r>
+      <w:r>
+        <w:br/>
+      </w:r>
+      <w:r>
+        <w:br/>
+      </w:r>
+      <w:r>
+        <w:rPr>
+          <w:rStyle w:val="NormalTok"/>
+        </w:rPr>
+        <w:t xml:space="preserve">You are executing the Initial GTM Audit playbook for the brand in the current working directory. Follow these steps in order. Do not skip steps. Do not invent data. Honour the voice conventions in Step 8.</w:t>
+      </w:r>
+      <w:r>
+        <w:br/>
+      </w:r>
+      <w:r>
+        <w:br/>
+      </w:r>
+      <w:r>
+        <w:rPr>
+          <w:rStyle w:val="NormalTok"/>
+        </w:rPr>
+        <w:t xml:space="preserve">---</w:t>
+      </w:r>
+      <w:r>
+        <w:br/>
+      </w:r>
+      <w:r>
+        <w:br/>
+      </w:r>
+      <w:r>
+        <w:rPr>
+          <w:rStyle w:val="FunctionTok"/>
+        </w:rPr>
+        <w:t xml:space="preserve">## Step 1. Load or populate the business brief</w:t>
+      </w:r>
+      <w:r>
+        <w:br/>
+      </w:r>
+      <w:r>
+        <w:br/>
+      </w:r>
+      <w:r>
+        <w:rPr>
+          <w:rStyle w:val="NormalTok"/>
+        </w:rPr>
+        <w:t xml:space="preserve">Look for </w:t>
+      </w:r>
+      <w:r>
+        <w:rPr>
+          <w:rStyle w:val="InformationTok"/>
+        </w:rPr>
+        <w:t xml:space="preserve">`CLAUDE.md`</w:t>
+      </w:r>
+      <w:r>
+        <w:rPr>
+          <w:rStyle w:val="NormalTok"/>
+        </w:rPr>
+        <w:t xml:space="preserve"> in the current working directory.</w:t>
+      </w:r>
+      <w:r>
+        <w:br/>
+      </w:r>
+      <w:r>
+        <w:br/>
+      </w:r>
+      <w:r>
+        <w:rPr>
+          <w:rStyle w:val="NormalTok"/>
+        </w:rPr>
+        <w:t xml:space="preserve">**If `CLAUDE.md` exists and is fully filled in** (no </w:t>
+      </w:r>
+      <w:r>
+        <w:rPr>
+          <w:rStyle w:val="InformationTok"/>
+        </w:rPr>
+        <w:t xml:space="preserve">`{placeholder}`</w:t>
+      </w:r>
+      <w:r>
+        <w:rPr>
+          <w:rStyle w:val="NormalTok"/>
+        </w:rPr>
+        <w:t xml:space="preserve"> text remaining, required fields populated), read it and proceed to Step 2.</w:t>
+      </w:r>
+      <w:r>
+        <w:br/>
+      </w:r>
+      <w:r>
+        <w:br/>
+      </w:r>
+      <w:r>
+        <w:rPr>
+          <w:rStyle w:val="NormalTok"/>
+        </w:rPr>
+        <w:t xml:space="preserve">**If `CLAUDE.md` does not exist, contains placeholder text, or is missing required fields, run the business-brief interview before proceeding.** Do not skip. Do not guess the inputs.</w:t>
+      </w:r>
+      <w:r>
+        <w:br/>
+      </w:r>
+      <w:r>
+        <w:br/>
+      </w:r>
+      <w:r>
+        <w:rPr>
+          <w:rStyle w:val="FunctionTok"/>
+        </w:rPr>
+        <w:t xml:space="preserve">### The business-brief interview</w:t>
+      </w:r>
+      <w:r>
+        <w:br/>
+      </w:r>
+      <w:r>
+        <w:br/>
+      </w:r>
+      <w:r>
+        <w:rPr>
+          <w:rStyle w:val="NormalTok"/>
+        </w:rPr>
+        <w:t xml:space="preserve">Ask the user the following questions conversationally, one batch at a time. After each batch, write the answers into </w:t>
+      </w:r>
+      <w:r>
+        <w:rPr>
+          <w:rStyle w:val="InformationTok"/>
+        </w:rPr>
+        <w:t xml:space="preserve">`CLAUDE.md`</w:t>
+      </w:r>
+      <w:r>
+        <w:rPr>
+          <w:rStyle w:val="NormalTok"/>
+        </w:rPr>
+        <w:t xml:space="preserve"> in the current working directory (create the file if missing) and confirm with the user before moving to the next batch. This is a progressive save: the file grows as the interview proceeds.</w:t>
+      </w:r>
+      <w:r>
+        <w:br/>
+      </w:r>
+      <w:r>
+        <w:br/>
+      </w:r>
+      <w:r>
+        <w:rPr>
+          <w:rStyle w:val="NormalTok"/>
+        </w:rPr>
+        <w:t xml:space="preserve">**Batch 1: Brand overview.** Brand name. Primary URL. How long the domain has been live. Ecommerce platform (Shopify, WooCommerce, custom, something else). Geographic focus. Stage (pre-launch, first year, established with trading history, mature).</w:t>
+      </w:r>
+      <w:r>
+        <w:br/>
+      </w:r>
+      <w:r>
+        <w:br/>
+      </w:r>
+      <w:r>
+        <w:rPr>
+          <w:rStyle w:val="NormalTok"/>
+        </w:rPr>
+        <w:t xml:space="preserve">**Batch 2: Product.** What you sell in one sentence. Price range or AOV. Catalog size (number of active SKUs). Distinctive or patented elements. Margin structure (rough COGS, shipping costs, any surprising margin drags).</w:t>
+      </w:r>
+      <w:r>
+        <w:br/>
+      </w:r>
+      <w:r>
+        <w:br/>
+      </w:r>
+      <w:r>
+        <w:rPr>
+          <w:rStyle w:val="NormalTok"/>
+        </w:rPr>
+        <w:t xml:space="preserve">**Batch 3: Target audience.** Core buyer in one sentence, in your own words. Secondary buyer if relevant. What they hire the product to do (Jobs-to-be-Done framing). Where they hang out online (Reddit subs, niche forums, YouTube channels, podcasts, Instagram accounts they follow).</w:t>
+      </w:r>
+      <w:r>
+        <w:br/>
+      </w:r>
+      <w:r>
+        <w:br/>
+      </w:r>
+      <w:r>
+        <w:rPr>
+          <w:rStyle w:val="NormalTok"/>
+        </w:rPr>
+        <w:t xml:space="preserve">**Batch 4: Positioning.** Why you win in one sentence. Three to five competitors the buyer also considers, with URLs (these feed the Section 3 competitor audit directly; without them Section 3 cannot run). Pricing tier vs category median. What you have tried that did not work.</w:t>
+      </w:r>
+      <w:r>
+        <w:br/>
+      </w:r>
+      <w:r>
+        <w:br/>
+      </w:r>
+      <w:r>
+        <w:rPr>
+          <w:rStyle w:val="NormalTok"/>
+        </w:rPr>
+        <w:t xml:space="preserve">**Batch 5: Tool stack.** Website/CMS. Analytics (GA4 or other). Search Console property. Ad platforms (Meta, Google, TikTok, LinkedIn). Shopping feed (Merchant Center). Email and SMS (Klaviyo, Brevo, Postscript). CRO tools (Clarity, Hotjar, FullStory). Tag management. CRM or back-office (HubSpot, Airtable). AI assistants already in use.</w:t>
+      </w:r>
+      <w:r>
+        <w:br/>
+      </w:r>
+      <w:r>
+        <w:br/>
+      </w:r>
+      <w:r>
+        <w:rPr>
+          <w:rStyle w:val="NormalTok"/>
+        </w:rPr>
+        <w:t xml:space="preserve">**Batch 6: Constraints and goals.** Capital state (funded, bootstrapped, cash-flow runway). Team size by function. Supply-chain constraints. Regulatory or compliance constraints. Founder time available. Twelve-month revenue goal. The single lever you believe unlocks that goal.</w:t>
+      </w:r>
+      <w:r>
+        <w:br/>
+      </w:r>
+      <w:r>
+        <w:br/>
+      </w:r>
+      <w:r>
+        <w:rPr>
+          <w:rStyle w:val="FunctionTok"/>
+        </w:rPr>
+        <w:t xml:space="preserve">### Minimum required to proceed to Step 2</w:t>
+      </w:r>
+      <w:r>
+        <w:br/>
+      </w:r>
+      <w:r>
+        <w:br/>
+      </w:r>
+      <w:r>
+        <w:rPr>
+          <w:rStyle w:val="NormalTok"/>
+        </w:rPr>
+        <w:t xml:space="preserve">If after the interview you still do not have these six fields captured, ask again before proceeding:</w:t>
+      </w:r>
+      <w:r>
+        <w:br/>
+      </w:r>
+      <w:r>
+        <w:br/>
+      </w:r>
+      <w:r>
+        <w:rPr>
+          <w:rStyle w:val="SpecialStringTok"/>
+        </w:rPr>
+        <w:t xml:space="preserve">1. </w:t>
+      </w:r>
+      <w:r>
+        <w:rPr>
+          <w:rStyle w:val="NormalTok"/>
+        </w:rPr>
+        <w:t xml:space="preserve">Brand name</w:t>
+      </w:r>
+      <w:r>
+        <w:br/>
+      </w:r>
+      <w:r>
+        <w:rPr>
+          <w:rStyle w:val="SpecialStringTok"/>
+        </w:rPr>
+        <w:t xml:space="preserve">2. </w:t>
+      </w:r>
+      <w:r>
+        <w:rPr>
+          <w:rStyle w:val="NormalTok"/>
+        </w:rPr>
+        <w:t xml:space="preserve">Primary URL</w:t>
+      </w:r>
+      <w:r>
+        <w:br/>
+      </w:r>
+      <w:r>
+        <w:rPr>
+          <w:rStyle w:val="SpecialStringTok"/>
+        </w:rPr>
+        <w:t xml:space="preserve">3. </w:t>
+      </w:r>
+      <w:r>
+        <w:rPr>
+          <w:rStyle w:val="NormalTok"/>
+        </w:rPr>
+        <w:t xml:space="preserve">What the brand sells (one sentence)</w:t>
+      </w:r>
+      <w:r>
+        <w:br/>
+      </w:r>
+      <w:r>
+        <w:rPr>
+          <w:rStyle w:val="SpecialStringTok"/>
+        </w:rPr>
+        <w:t xml:space="preserve">4. </w:t>
+      </w:r>
+      <w:r>
+        <w:rPr>
+          <w:rStyle w:val="NormalTok"/>
+        </w:rPr>
+        <w:t xml:space="preserve">Core buyer (one sentence)</w:t>
+      </w:r>
+      <w:r>
+        <w:br/>
+      </w:r>
+      <w:r>
+        <w:rPr>
+          <w:rStyle w:val="SpecialStringTok"/>
+        </w:rPr>
+        <w:t xml:space="preserve">5. </w:t>
+      </w:r>
+      <w:r>
+        <w:rPr>
+          <w:rStyle w:val="NormalTok"/>
+        </w:rPr>
+        <w:t xml:space="preserve">Three to five competitor URLs</w:t>
+      </w:r>
+      <w:r>
+        <w:br/>
+      </w:r>
+      <w:r>
+        <w:rPr>
+          <w:rStyle w:val="SpecialStringTok"/>
+        </w:rPr>
+        <w:t xml:space="preserve">6. </w:t>
+      </w:r>
+      <w:r>
+        <w:rPr>
+          <w:rStyle w:val="NormalTok"/>
+        </w:rPr>
+        <w:t xml:space="preserve">Ecommerce platform</w:t>
+      </w:r>
+      <w:r>
+        <w:br/>
+      </w:r>
+      <w:r>
+        <w:br/>
+      </w:r>
+      <w:r>
+        <w:rPr>
+          <w:rStyle w:val="NormalTok"/>
+        </w:rPr>
+        <w:t xml:space="preserve">Optional fields can be marked as "unknown" or "to be confirmed" in </w:t>
+      </w:r>
+      <w:r>
+        <w:rPr>
+          <w:rStyle w:val="InformationTok"/>
+        </w:rPr>
+        <w:t xml:space="preserve">`CLAUDE.md`</w:t>
+      </w:r>
+      <w:r>
+        <w:rPr>
+          <w:rStyle w:val="NormalTok"/>
+        </w:rPr>
+        <w:t xml:space="preserve">. Claude will flag any gaps in the final audit report so the founder knows where the audit leaned on incomplete inputs.</w:t>
+      </w:r>
+      <w:r>
+        <w:br/>
+      </w:r>
+      <w:r>
+        <w:br/>
+      </w:r>
+      <w:r>
+        <w:rPr>
+          <w:rStyle w:val="NormalTok"/>
+        </w:rPr>
+        <w:t xml:space="preserve">Do not invent any value. Ask the user.</w:t>
+      </w:r>
+      <w:r>
+        <w:br/>
+      </w:r>
+      <w:r>
+        <w:br/>
+      </w:r>
+      <w:r>
+        <w:rPr>
+          <w:rStyle w:val="NormalTok"/>
+        </w:rPr>
+        <w:t xml:space="preserve">---</w:t>
+      </w:r>
+      <w:r>
+        <w:br/>
+      </w:r>
+      <w:r>
+        <w:br/>
+      </w:r>
+      <w:r>
+        <w:rPr>
+          <w:rStyle w:val="FunctionTok"/>
+        </w:rPr>
+        <w:t xml:space="preserve">## Step 2. Inventory tool access</w:t>
+      </w:r>
+      <w:r>
+        <w:br/>
+      </w:r>
+      <w:r>
+        <w:br/>
+      </w:r>
+      <w:r>
+        <w:rPr>
+          <w:rStyle w:val="NormalTok"/>
+        </w:rPr>
+        <w:t xml:space="preserve">Read the </w:t>
+      </w:r>
+      <w:r>
+        <w:rPr>
+          <w:rStyle w:val="InformationTok"/>
+        </w:rPr>
         <w:t xml:space="preserve">`.env`</w:t>
       </w:r>
       <w:r>
         <w:rPr>
-          <w:rStyle w:val="AttributeTok"/>
-        </w:rPr>
-        <w:t xml:space="preserve"> (your API keys). Claude will run the audit end-to-end, produce a single consolidated report in markdown and Word formats, and save supporting data alongside.</w:t>
-      </w:r>
-      <w:r>
-        <w:br/>
-      </w:r>
-      <w:r>
-        <w:rPr>
-          <w:rStyle w:val="AttributeTok"/>
-        </w:rPr>
-        <w:t xml:space="preserve">&gt;</w:t>
-      </w:r>
-      <w:r>
-        <w:br/>
-      </w:r>
-      <w:r>
-        <w:rPr>
-          <w:rStyle w:val="AttributeTok"/>
-        </w:rPr>
-        <w:t xml:space="preserve">&gt; Built by Nishant Kapoor at EntireCommerce AI. Version 2, April 2026.</w:t>
-      </w:r>
-      <w:r>
-        <w:br/>
-      </w:r>
-      <w:r>
-        <w:br/>
-      </w:r>
-      <w:r>
-        <w:rPr>
           <w:rStyle w:val="NormalTok"/>
         </w:rPr>
-        <w:t xml:space="preserve">---</w:t>
-      </w:r>
-      <w:r>
-        <w:br/>
-      </w:r>
-      <w:r>
-        <w:br/>
-      </w:r>
-      <w:r>
-        <w:rPr>
-          <w:rStyle w:val="NormalTok"/>
-        </w:rPr>
-        <w:t xml:space="preserve">You are executing the Initial GTM Audit playbook for the brand whose </w:t>
-      </w:r>
-      <w:r>
-        <w:rPr>
-          <w:rStyle w:val="InformationTok"/>
-        </w:rPr>
-        <w:t xml:space="preserve">`CLAUDE.md`</w:t>
-      </w:r>
-      <w:r>
-        <w:rPr>
-          <w:rStyle w:val="NormalTok"/>
-        </w:rPr>
-        <w:t xml:space="preserve"> sits in the current working directory. Follow these steps in order. Do not skip steps. Do not invent data. Honour the voice conventions in Step 8.</w:t>
-      </w:r>
-      <w:r>
-        <w:br/>
-      </w:r>
-      <w:r>
-        <w:br/>
-      </w:r>
-      <w:r>
-        <w:rPr>
-          <w:rStyle w:val="NormalTok"/>
-        </w:rPr>
-        <w:t xml:space="preserve">---</w:t>
-      </w:r>
-      <w:r>
-        <w:br/>
-      </w:r>
-      <w:r>
-        <w:br/>
-      </w:r>
-      <w:r>
-        <w:rPr>
-          <w:rStyle w:val="FunctionTok"/>
-        </w:rPr>
-        <w:t xml:space="preserve">## Step 1. Read the business brief</w:t>
-      </w:r>
-      <w:r>
-        <w:br/>
-      </w:r>
-      <w:r>
-        <w:br/>
-      </w:r>
-      <w:r>
-        <w:rPr>
-          <w:rStyle w:val="NormalTok"/>
-        </w:rPr>
-        <w:t xml:space="preserve">Read </w:t>
-      </w:r>
-      <w:r>
-        <w:rPr>
-          <w:rStyle w:val="InformationTok"/>
-        </w:rPr>
-        <w:t xml:space="preserve">`CLAUDE.md`</w:t>
-      </w:r>
-      <w:r>
-        <w:rPr>
-          <w:rStyle w:val="NormalTok"/>
-        </w:rPr>
-        <w:t xml:space="preserve"> in the current working directory. That file contains the brand's positioning, product, audience, competitors, pricing, tool stack, and goals. If any required field is blank or still contains placeholder text (anything inside </w:t>
-      </w:r>
-      <w:r>
-        <w:rPr>
-          <w:rStyle w:val="InformationTok"/>
-        </w:rPr>
-        <w:t xml:space="preserve">`{curly braces}`</w:t>
-      </w:r>
-      <w:r>
-        <w:rPr>
-          <w:rStyle w:val="NormalTok"/>
-        </w:rPr>
-        <w:t xml:space="preserve">), stop and ask the user to fill it in before proceeding.</w:t>
-      </w:r>
-      <w:r>
-        <w:br/>
-      </w:r>
-      <w:r>
-        <w:br/>
-      </w:r>
-      <w:r>
-        <w:rPr>
-          <w:rStyle w:val="NormalTok"/>
-        </w:rPr>
-        <w:t xml:space="preserve">Confirm you have at minimum:</w:t>
-      </w:r>
-      <w:r>
-        <w:br/>
-      </w:r>
-      <w:r>
-        <w:rPr>
-          <w:rStyle w:val="SpecialStringTok"/>
-        </w:rPr>
-        <w:t xml:space="preserve">- </w:t>
-      </w:r>
-      <w:r>
-        <w:rPr>
-          <w:rStyle w:val="NormalTok"/>
-        </w:rPr>
-        <w:t xml:space="preserve">Brand name</w:t>
-      </w:r>
-      <w:r>
-        <w:br/>
-      </w:r>
-      <w:r>
-        <w:rPr>
-          <w:rStyle w:val="SpecialStringTok"/>
-        </w:rPr>
-        <w:t xml:space="preserve">- </w:t>
-      </w:r>
-      <w:r>
-        <w:rPr>
-          <w:rStyle w:val="NormalTok"/>
-        </w:rPr>
-        <w:t xml:space="preserve">Primary URL</w:t>
-      </w:r>
-      <w:r>
-        <w:br/>
-      </w:r>
-      <w:r>
-        <w:rPr>
-          <w:rStyle w:val="SpecialStringTok"/>
-        </w:rPr>
-        <w:t xml:space="preserve">- </w:t>
-      </w:r>
-      <w:r>
-        <w:rPr>
-          <w:rStyle w:val="NormalTok"/>
-        </w:rPr>
-        <w:t xml:space="preserve">What the brand sells (one sentence)</w:t>
-      </w:r>
-      <w:r>
-        <w:br/>
-      </w:r>
-      <w:r>
-        <w:rPr>
-          <w:rStyle w:val="SpecialStringTok"/>
-        </w:rPr>
-        <w:t xml:space="preserve">- </w:t>
-      </w:r>
-      <w:r>
-        <w:rPr>
-          <w:rStyle w:val="NormalTok"/>
-        </w:rPr>
-        <w:t xml:space="preserve">Core buyer (one sentence)</w:t>
-      </w:r>
-      <w:r>
-        <w:br/>
-      </w:r>
-      <w:r>
-        <w:rPr>
-          <w:rStyle w:val="SpecialStringTok"/>
-        </w:rPr>
-        <w:t xml:space="preserve">- </w:t>
-      </w:r>
-      <w:r>
-        <w:rPr>
-          <w:rStyle w:val="NormalTok"/>
-        </w:rPr>
-        <w:t xml:space="preserve">Three to five competitor URLs</w:t>
-      </w:r>
-      <w:r>
-        <w:br/>
-      </w:r>
-      <w:r>
-        <w:rPr>
-          <w:rStyle w:val="SpecialStringTok"/>
-        </w:rPr>
-        <w:t xml:space="preserve">- </w:t>
-      </w:r>
-      <w:r>
-        <w:rPr>
-          <w:rStyle w:val="NormalTok"/>
-        </w:rPr>
-        <w:t xml:space="preserve">Ecommerce platform</w:t>
-      </w:r>
-      <w:r>
-        <w:br/>
-      </w:r>
-      <w:r>
-        <w:br/>
-      </w:r>
-      <w:r>
-        <w:rPr>
-          <w:rStyle w:val="NormalTok"/>
-        </w:rPr>
-        <w:t xml:space="preserve">Missing any of these? Ask the user. Do not guess.</w:t>
-      </w:r>
-      <w:r>
-        <w:br/>
-      </w:r>
-      <w:r>
-        <w:br/>
-      </w:r>
-      <w:r>
-        <w:rPr>
-          <w:rStyle w:val="NormalTok"/>
-        </w:rPr>
-        <w:t xml:space="preserve">---</w:t>
-      </w:r>
-      <w:r>
-        <w:br/>
-      </w:r>
-      <w:r>
-        <w:br/>
-      </w:r>
-      <w:r>
-        <w:rPr>
-          <w:rStyle w:val="FunctionTok"/>
-        </w:rPr>
-        <w:t xml:space="preserve">## Step 2. Inventory tool access</w:t>
-      </w:r>
-      <w:r>
-        <w:br/>
-      </w:r>
-      <w:r>
-        <w:br/>
-      </w:r>
-      <w:r>
-        <w:rPr>
-          <w:rStyle w:val="NormalTok"/>
-        </w:rPr>
-        <w:t xml:space="preserve">Read the </w:t>
-      </w:r>
-      <w:r>
-        <w:rPr>
-          <w:rStyle w:val="InformationTok"/>
-        </w:rPr>
-        <w:t xml:space="preserve">`.env`</w:t>
-      </w:r>
-      <w:r>
-        <w:rPr>
-          <w:rStyle w:val="NormalTok"/>
-        </w:rPr>
         <w:t xml:space="preserve"> file in the current working directory. Print a credential inventory to the user in this format:</w:t>
       </w:r>
     </w:p>
@@ -4483,7 +4797,7 @@
         <w:rPr>
           <w:rStyle w:val="VerbatimChar"/>
         </w:rPr>
-        <w:t xml:space="preserve">For each internal tool flagged "not configured", the corresponding section of the report will stub out honestly with a "grant access to populate" note. That is expected behaviour, not an error.</w:t>
+        <w:t xml:space="preserve">For each internal tool flagged "not configured", the corresponding section of the report will stub out honestly with a "grant access to populate" note. That is expected behaviour. Missing tools become access-grant items in the final report's checklist.</w:t>
       </w:r>
       <w:r>
         <w:br/>
@@ -5417,7 +5731,7 @@
         <w:tab/>
       </w:r>
       <w:r>
-        <w:t xml:space="preserve">INPUTS (required — refuse if any missing)</w:t>
+        <w:t xml:space="preserve">INPUTS (required; refuse if any missing)</w:t>
       </w:r>
     </w:p>
     <w:p>
@@ -5583,7 +5897,7 @@
         <w:tab/>
       </w:r>
       <w:r>
-        <w:t xml:space="preserve">DELIVERABLE — THE ONE-PAGER</w:t>
+        <w:t xml:space="preserve">DELIVERABLE: THE ONE-PAGER</w:t>
       </w:r>
     </w:p>
     <w:p>
@@ -5772,7 +6086,7 @@
         <w:tab/>
       </w:r>
       <w:r>
-        <w:t xml:space="preserve">APPENDIX — VERBATIM QUOTES (15)</w:t>
+        <w:t xml:space="preserve">APPENDIX: VERBATIM QUOTES (15)</w:t>
       </w:r>
     </w:p>
     <w:p>
@@ -5789,7 +6103,7 @@
         <w:rPr>
           <w:rStyle w:val="VerbatimChar"/>
         </w:rPr>
-        <w:t xml:space="preserve">#N "[verbatim]" — [platform], [date] — [primary emotion] — [recurring phrase if any]</w:t>
+        <w:t xml:space="preserve">#N | "[verbatim]" | [platform], [date] | [primary emotion] | [recurring phrase if any]</w:t>
       </w:r>
       <w:r>
         <w:t xml:space="preserve"> </w:t>
@@ -6128,7 +6442,7 @@
         <w:rPr>
           <w:rStyle w:val="VerbatimChar"/>
         </w:rPr>
-        <w:t xml:space="preserve">- Is a synthesis, not a summary.</w:t>
+        <w:t xml:space="preserve">- Is a synthesis of cross-section implications. Each bullet spans multiple sections.</w:t>
       </w:r>
       <w:r>
         <w:br/>
@@ -6991,7 +7305,7 @@
         <w:rPr>
           <w:rStyle w:val="VerbatimChar"/>
         </w:rPr>
-        <w:t xml:space="preserve">GTM audit: {Brand Name} ({YYYY-MM-DD}) — {biggest lever in 6 words}</w:t>
+        <w:t xml:space="preserve">GTM audit: {Brand Name} ({YYYY-MM-DD}): {biggest lever in 6 words}</w:t>
       </w:r>
     </w:p>
     <w:p>

</xml_diff>

<commit_message>
Banner centered + highlighted; Step 2 now offers on-demand tool setup
</commit_message>
<xml_diff>
--- a/gtm-audit-bundle-combined.docx
+++ b/gtm-audit-bundle-combined.docx
@@ -29,9 +29,32 @@
       </w:sdtContent>
     </w:sdt>
     <w:p>
-      <w:pPr>
-        <w:pStyle w:val="FirstParagraph"/>
-      </w:pPr>
+      <w:r>
+        <w:pict>
+          <v:rect style="width:0;height:1.5pt" o:hralign="center" o:hrstd="t" o:hr="t"/>
+        </w:pict>
+      </w:r>
+    </w:p>
+    <w:bookmarkStart w:id="10" w:name="want-us-to-run-this-for-you-book-a-call"/>
+    <w:p>
+      <w:pPr>
+        <w:pStyle w:val="Heading3"/>
+      </w:pPr>
+      <w:r>
+        <w:rPr>
+          <w:rStyle w:val="SectionNumber"/>
+        </w:rPr>
+        <w:t xml:space="preserve">0.0.1</w:t>
+      </w:r>
+      <w:r>
+        <w:tab/>
+      </w:r>
+      <w:r>
+        <w:t xml:space="preserve">🎯</w:t>
+      </w:r>
+      <w:r>
+        <w:t xml:space="preserve"> </w:t>
+      </w:r>
       <w:hyperlink r:id="rId9">
         <w:r>
           <w:rPr>
@@ -43,42 +66,6 @@
         </w:r>
       </w:hyperlink>
     </w:p>
-    <w:bookmarkStart w:id="35" w:name="initial-gtm-audit-playbook"/>
-    <w:p>
-      <w:pPr>
-        <w:pStyle w:val="Heading1"/>
-      </w:pPr>
-      <w:r>
-        <w:rPr>
-          <w:rStyle w:val="SectionNumber"/>
-        </w:rPr>
-        <w:t xml:space="preserve">1</w:t>
-      </w:r>
-      <w:r>
-        <w:tab/>
-      </w:r>
-      <w:r>
-        <w:t xml:space="preserve">Initial GTM Audit Playbook</w:t>
-      </w:r>
-    </w:p>
-    <w:bookmarkStart w:id="10" w:name="X24dcb0f2bc2ae37fb871fddb05edf99c2d31c3a"/>
-    <w:p>
-      <w:pPr>
-        <w:pStyle w:val="Heading2"/>
-      </w:pPr>
-      <w:r>
-        <w:rPr>
-          <w:rStyle w:val="SectionNumber"/>
-        </w:rPr>
-        <w:t xml:space="preserve">1.1</w:t>
-      </w:r>
-      <w:r>
-        <w:tab/>
-      </w:r>
-      <w:r>
-        <w:t xml:space="preserve">A full marketing diagnostic you can run on your own brand in 20 to 40 minutes inside Claude Code. Produces one consolidated report covering audience, competitors, SEO, AEO, paid ads, email, CRO, analytics, and a ranked action list. Delivered as a Word doc plus the markdown source. Built by Nishant Kapoor at EntireCommerce AI.</w:t>
-      </w:r>
-    </w:p>
     <w:p>
       <w:r>
         <w:pict>
@@ -87,7 +74,25 @@
       </w:r>
     </w:p>
     <w:bookmarkEnd w:id="10"/>
-    <w:bookmarkStart w:id="11" w:name="who-this-playbook-is-for"/>
+    <w:bookmarkStart w:id="36" w:name="initial-gtm-audit-playbook"/>
+    <w:p>
+      <w:pPr>
+        <w:pStyle w:val="Heading1"/>
+      </w:pPr>
+      <w:r>
+        <w:rPr>
+          <w:rStyle w:val="SectionNumber"/>
+        </w:rPr>
+        <w:t xml:space="preserve">1</w:t>
+      </w:r>
+      <w:r>
+        <w:tab/>
+      </w:r>
+      <w:r>
+        <w:t xml:space="preserve">Initial GTM Audit Playbook</w:t>
+      </w:r>
+    </w:p>
+    <w:bookmarkStart w:id="11" w:name="X24dcb0f2bc2ae37fb871fddb05edf99c2d31c3a"/>
     <w:p>
       <w:pPr>
         <w:pStyle w:val="Heading2"/>
@@ -96,83 +101,13 @@
         <w:rPr>
           <w:rStyle w:val="SectionNumber"/>
         </w:rPr>
-        <w:t xml:space="preserve">1.2</w:t>
+        <w:t xml:space="preserve">1.1</w:t>
       </w:r>
       <w:r>
         <w:tab/>
       </w:r>
       <w:r>
-        <w:t xml:space="preserve">Who This Playbook Is For</w:t>
-      </w:r>
-    </w:p>
-    <w:p>
-      <w:pPr>
-        <w:pStyle w:val="FirstParagraph"/>
-      </w:pPr>
-      <w:r>
-        <w:t xml:space="preserve">This playbook is for three people.</w:t>
-      </w:r>
-    </w:p>
-    <w:p>
-      <w:pPr>
-        <w:pStyle w:val="BodyText"/>
-      </w:pPr>
-      <w:r>
-        <w:rPr>
-          <w:b/>
-          <w:bCs/>
-        </w:rPr>
-        <w:t xml:space="preserve">The founder-led DTC brand owner on Shopify</w:t>
-      </w:r>
-      <w:r>
-        <w:t xml:space="preserve"> </w:t>
-      </w:r>
-      <w:r>
-        <w:t xml:space="preserve">who’s been flying blind. You’re growing off a product that’s clearly working, but you don’t have a clear picture of where the binding constraint is right now. You’ve tried an agency, you’ve tried freelancers, you’ve tried doing it yourself. You want a diagnostic that tells you, plainly, in one document, what the single biggest thing holding revenue back is and what to do about it this week.</w:t>
-      </w:r>
-    </w:p>
-    <w:p>
-      <w:pPr>
-        <w:pStyle w:val="BodyText"/>
-      </w:pPr>
-      <w:r>
-        <w:rPr>
-          <w:b/>
-          <w:bCs/>
-        </w:rPr>
-        <w:t xml:space="preserve">The fractional CMO managing multiple DTC clients.</w:t>
-      </w:r>
-      <w:r>
-        <w:t xml:space="preserve"> </w:t>
-      </w:r>
-      <w:r>
-        <w:t xml:space="preserve">You need consistent output across brands and a repeatable diagnostic you can run in week one of every engagement. Your problem is consistency: every client gets a slightly different audit depending on which of your team members produces it. This playbook is the same process every time, with the same ten sections, the same voice, and the same action-ranking logic. Your team reads from one script.</w:t>
-      </w:r>
-    </w:p>
-    <w:p>
-      <w:pPr>
-        <w:pStyle w:val="BodyText"/>
-      </w:pPr>
-      <w:r>
-        <w:rPr>
-          <w:b/>
-          <w:bCs/>
-        </w:rPr>
-        <w:t xml:space="preserve">The in-house growth lead at a funded DTC brand.</w:t>
-      </w:r>
-      <w:r>
-        <w:t xml:space="preserve"> </w:t>
-      </w:r>
-      <w:r>
-        <w:t xml:space="preserve">You have GA4, you have Klaviyo, you have Meta Ads data. You don’t have a single place where all of it gets pulled together with a cross-cutting narrative. You want the deliverable without paying £5,000 to an agency for a deck that takes three weeks. You want it in your GitHub, version-controlled, so next quarter you can re-run it and see what moved.</w:t>
-      </w:r>
-    </w:p>
-    <w:p>
-      <w:pPr>
-        <w:pStyle w:val="BodyText"/>
-      </w:pPr>
-      <w:r>
-        <w:t xml:space="preserve">If you’ve been piecing together a marketing audit by hand, screenshotting Meta Ads Manager, copy-pasting search terms from Search Console, writing positioning frameworks in a Notion doc, this playbook collapses all of that into one consolidated output in a single Claude Code session.</w:t>
+        <w:t xml:space="preserve">A full marketing diagnostic you can run on your own brand in 20 to 40 minutes inside Claude Code. Produces one consolidated report covering audience, competitors, SEO, AEO, paid ads, email, CRO, analytics, and a ranked action list. Delivered as a Word doc plus the markdown source. Built by Nishant Kapoor at EntireCommerce AI.</w:t>
       </w:r>
     </w:p>
     <w:p>
@@ -183,7 +118,7 @@
       </w:r>
     </w:p>
     <w:bookmarkEnd w:id="11"/>
-    <w:bookmarkStart w:id="12" w:name="what-the-gtm-audit-actually-is"/>
+    <w:bookmarkStart w:id="12" w:name="who-this-playbook-is-for"/>
     <w:p>
       <w:pPr>
         <w:pStyle w:val="Heading2"/>
@@ -192,31 +127,39 @@
         <w:rPr>
           <w:rStyle w:val="SectionNumber"/>
         </w:rPr>
-        <w:t xml:space="preserve">1.3</w:t>
+        <w:t xml:space="preserve">1.2</w:t>
       </w:r>
       <w:r>
         <w:tab/>
       </w:r>
       <w:r>
-        <w:t xml:space="preserve">What The GTM Audit Actually Is</w:t>
+        <w:t xml:space="preserve">Who This Playbook Is For</w:t>
       </w:r>
     </w:p>
     <w:p>
       <w:pPr>
         <w:pStyle w:val="FirstParagraph"/>
+      </w:pPr>
+      <w:r>
+        <w:t xml:space="preserve">This playbook is for three people.</w:t>
+      </w:r>
+    </w:p>
+    <w:p>
+      <w:pPr>
+        <w:pStyle w:val="BodyText"/>
       </w:pPr>
       <w:r>
         <w:rPr>
           <w:b/>
           <w:bCs/>
         </w:rPr>
-        <w:t xml:space="preserve">The short version.</w:t>
-      </w:r>
-      <w:r>
-        <w:t xml:space="preserve"> </w:t>
-      </w:r>
-      <w:r>
-        <w:t xml:space="preserve">Ten sections in one consolidated report. Claude Code runs the diagnostic end-to-end: mines your audience, tears down your competitors, maps your SEO and AEO surface, scores your creative, audits your email and analytics (where access is granted), and hands back a ranked action list with the top five items to ship this week. Plus a dedicated synthesis pass that reads the whole draft end-to-end and surfaces three to five cross-cutting themes, the strategic narrative your business reveals when every finding is in view at once.</w:t>
+        <w:t xml:space="preserve">The founder-led DTC brand owner on Shopify</w:t>
+      </w:r>
+      <w:r>
+        <w:t xml:space="preserve"> </w:t>
+      </w:r>
+      <w:r>
+        <w:t xml:space="preserve">who’s been flying blind. You’re growing off a product that’s clearly working, but you don’t have a clear picture of where the binding constraint is right now. You’ve tried an agency, you’ve tried freelancers, you’ve tried doing it yourself. You want a diagnostic that tells you, plainly, in one document, what the single biggest thing holding revenue back is and what to do about it this week.</w:t>
       </w:r>
     </w:p>
     <w:p>
@@ -228,13 +171,13 @@
           <w:b/>
           <w:bCs/>
         </w:rPr>
-        <w:t xml:space="preserve">Best for.</w:t>
-      </w:r>
-      <w:r>
-        <w:t xml:space="preserve"> </w:t>
-      </w:r>
-      <w:r>
-        <w:t xml:space="preserve">Premium DTC brands. AOV £500+ or 2x category median. Founder-led. US, UK, or English-speaking European markets. Established brands with three or more months of trading history, or pre-launch brands getting ready to ship.</w:t>
+        <w:t xml:space="preserve">The fractional CMO managing multiple DTC clients.</w:t>
+      </w:r>
+      <w:r>
+        <w:t xml:space="preserve"> </w:t>
+      </w:r>
+      <w:r>
+        <w:t xml:space="preserve">You need consistent output across brands and a repeatable diagnostic you can run in week one of every engagement. Your problem is consistency: every client gets a slightly different audit depending on which of your team members produces it. This playbook is the same process every time, with the same ten sections, the same voice, and the same action-ranking logic. Your team reads from one script.</w:t>
       </w:r>
     </w:p>
     <w:p>
@@ -246,13 +189,13 @@
           <w:b/>
           <w:bCs/>
         </w:rPr>
-        <w:t xml:space="preserve">How it’s different.</w:t>
-      </w:r>
-      <w:r>
-        <w:t xml:space="preserve"> </w:t>
-      </w:r>
-      <w:r>
-        <w:t xml:space="preserve">Three things most marketing audits skip.</w:t>
+        <w:t xml:space="preserve">The in-house growth lead at a funded DTC brand.</w:t>
+      </w:r>
+      <w:r>
+        <w:t xml:space="preserve"> </w:t>
+      </w:r>
+      <w:r>
+        <w:t xml:space="preserve">You have GA4, you have Klaviyo, you have Meta Ads data. You don’t have a single place where all of it gets pulled together with a cross-cutting narrative. You want the deliverable without paying £5,000 to an agency for a deck that takes three weeks. You want it in your GitHub, version-controlled, so next quarter you can re-run it and see what moved.</w:t>
       </w:r>
     </w:p>
     <w:p>
@@ -260,107 +203,7 @@
         <w:pStyle w:val="BodyText"/>
       </w:pPr>
       <w:r>
-        <w:t xml:space="preserve">First, the</w:t>
-      </w:r>
-      <w:r>
-        <w:t xml:space="preserve"> </w:t>
-      </w:r>
-      <w:r>
-        <w:rPr>
-          <w:b/>
-          <w:bCs/>
-        </w:rPr>
-        <w:t xml:space="preserve">synthesis pass</w:t>
-      </w:r>
-      <w:r>
-        <w:t xml:space="preserve">. Section-by-section analysis gives you a directory of findings. The synthesis pass gives you the story. A competitor whitespace in Section 3 might imply a positioning change in Section 1 which unlocks an SEO content cluster in Section 4 which compounds into AEO authority in Section 5. None of those connections surface from a section-at-a-time read. Claude does the cross-read explicitly, then revises the Executive Summary to lead with the narrative.</w:t>
-      </w:r>
-    </w:p>
-    <w:p>
-      <w:pPr>
-        <w:pStyle w:val="BodyText"/>
-      </w:pPr>
-      <w:r>
-        <w:t xml:space="preserve">Second,</w:t>
-      </w:r>
-      <w:r>
-        <w:t xml:space="preserve"> </w:t>
-      </w:r>
-      <w:r>
-        <w:rPr>
-          <w:b/>
-          <w:bCs/>
-        </w:rPr>
-        <w:t xml:space="preserve">honest stubbing</w:t>
-      </w:r>
-      <w:r>
-        <w:t xml:space="preserve">. Sections 7, 8, and 9 require access to your Klaviyo, Clarity, and GA4. Without that access, they render with a clear access-grant path (what to share, with which service account, to unlock the section). No fabricated numbers. No filler paragraphs pretending to be findings.</w:t>
-      </w:r>
-    </w:p>
-    <w:p>
-      <w:pPr>
-        <w:pStyle w:val="BodyText"/>
-      </w:pPr>
-      <w:r>
-        <w:t xml:space="preserve">Third, the</w:t>
-      </w:r>
-      <w:r>
-        <w:t xml:space="preserve"> </w:t>
-      </w:r>
-      <w:r>
-        <w:rPr>
-          <w:b/>
-          <w:bCs/>
-        </w:rPr>
-        <w:t xml:space="preserve">output format</w:t>
-      </w:r>
-      <w:r>
-        <w:t xml:space="preserve">. One Word doc you can share with your team, plus the markdown source in your GitHub repo. Version-controlled. Re-runnable quarterly. Integrated with your</w:t>
-      </w:r>
-      <w:r>
-        <w:t xml:space="preserve"> </w:t>
-      </w:r>
-      <w:r>
-        <w:rPr>
-          <w:rStyle w:val="VerbatimChar"/>
-        </w:rPr>
-        <w:t xml:space="preserve">actions.md</w:t>
-      </w:r>
-      <w:r>
-        <w:t xml:space="preserve"> </w:t>
-      </w:r>
-      <w:r>
-        <w:t xml:space="preserve">so the top five</w:t>
-      </w:r>
-      <w:r>
-        <w:t xml:space="preserve"> </w:t>
-      </w:r>
-      <w:r>
-        <w:t xml:space="preserve">“this week”</w:t>
-      </w:r>
-      <w:r>
-        <w:t xml:space="preserve"> </w:t>
-      </w:r>
-      <w:r>
-        <w:t xml:space="preserve">items merge straight into your team’s operating plan.</w:t>
-      </w:r>
-    </w:p>
-    <w:p>
-      <w:pPr>
-        <w:pStyle w:val="BodyText"/>
-      </w:pPr>
-      <w:r>
-        <w:rPr>
-          <w:b/>
-          <w:bCs/>
-        </w:rPr>
-        <w:t xml:space="preserve">Skip this playbook if</w:t>
-      </w:r>
-      <w:r>
-        <w:t xml:space="preserve"> </w:t>
-      </w:r>
-      <w:r>
-        <w:t xml:space="preserve">you’re a service business, a B2B SaaS, or a brand selling at the mass-market tier. The audit is tuned for premium DTC and the recommendations will be directionally off for other contexts.</w:t>
+        <w:t xml:space="preserve">If you’ve been piecing together a marketing audit by hand, screenshotting Meta Ads Manager, copy-pasting search terms from Search Console, writing positioning frameworks in a Notion doc, this playbook collapses all of that into one consolidated output in a single Claude Code session.</w:t>
       </w:r>
     </w:p>
     <w:p>
@@ -371,7 +214,7 @@
       </w:r>
     </w:p>
     <w:bookmarkEnd w:id="12"/>
-    <w:bookmarkStart w:id="21" w:name="setup-15-minutes"/>
+    <w:bookmarkStart w:id="13" w:name="what-the-gtm-audit-actually-is"/>
     <w:p>
       <w:pPr>
         <w:pStyle w:val="Heading2"/>
@@ -380,6 +223,194 @@
         <w:rPr>
           <w:rStyle w:val="SectionNumber"/>
         </w:rPr>
+        <w:t xml:space="preserve">1.3</w:t>
+      </w:r>
+      <w:r>
+        <w:tab/>
+      </w:r>
+      <w:r>
+        <w:t xml:space="preserve">What The GTM Audit Actually Is</w:t>
+      </w:r>
+    </w:p>
+    <w:p>
+      <w:pPr>
+        <w:pStyle w:val="FirstParagraph"/>
+      </w:pPr>
+      <w:r>
+        <w:rPr>
+          <w:b/>
+          <w:bCs/>
+        </w:rPr>
+        <w:t xml:space="preserve">The short version.</w:t>
+      </w:r>
+      <w:r>
+        <w:t xml:space="preserve"> </w:t>
+      </w:r>
+      <w:r>
+        <w:t xml:space="preserve">Ten sections in one consolidated report. Claude Code runs the diagnostic end-to-end: mines your audience, tears down your competitors, maps your SEO and AEO surface, scores your creative, audits your email and analytics (where access is granted), and hands back a ranked action list with the top five items to ship this week. Plus a dedicated synthesis pass that reads the whole draft end-to-end and surfaces three to five cross-cutting themes, the strategic narrative your business reveals when every finding is in view at once.</w:t>
+      </w:r>
+    </w:p>
+    <w:p>
+      <w:pPr>
+        <w:pStyle w:val="BodyText"/>
+      </w:pPr>
+      <w:r>
+        <w:rPr>
+          <w:b/>
+          <w:bCs/>
+        </w:rPr>
+        <w:t xml:space="preserve">Best for.</w:t>
+      </w:r>
+      <w:r>
+        <w:t xml:space="preserve"> </w:t>
+      </w:r>
+      <w:r>
+        <w:t xml:space="preserve">Premium DTC brands. AOV £500+ or 2x category median. Founder-led. US, UK, or English-speaking European markets. Established brands with three or more months of trading history, or pre-launch brands getting ready to ship.</w:t>
+      </w:r>
+    </w:p>
+    <w:p>
+      <w:pPr>
+        <w:pStyle w:val="BodyText"/>
+      </w:pPr>
+      <w:r>
+        <w:rPr>
+          <w:b/>
+          <w:bCs/>
+        </w:rPr>
+        <w:t xml:space="preserve">How it’s different.</w:t>
+      </w:r>
+      <w:r>
+        <w:t xml:space="preserve"> </w:t>
+      </w:r>
+      <w:r>
+        <w:t xml:space="preserve">Three things most marketing audits skip.</w:t>
+      </w:r>
+    </w:p>
+    <w:p>
+      <w:pPr>
+        <w:pStyle w:val="BodyText"/>
+      </w:pPr>
+      <w:r>
+        <w:t xml:space="preserve">First, the</w:t>
+      </w:r>
+      <w:r>
+        <w:t xml:space="preserve"> </w:t>
+      </w:r>
+      <w:r>
+        <w:rPr>
+          <w:b/>
+          <w:bCs/>
+        </w:rPr>
+        <w:t xml:space="preserve">synthesis pass</w:t>
+      </w:r>
+      <w:r>
+        <w:t xml:space="preserve">. Section-by-section analysis gives you a directory of findings. The synthesis pass gives you the story. A competitor whitespace in Section 3 might imply a positioning change in Section 1 which unlocks an SEO content cluster in Section 4 which compounds into AEO authority in Section 5. None of those connections surface from a section-at-a-time read. Claude does the cross-read explicitly, then revises the Executive Summary to lead with the narrative.</w:t>
+      </w:r>
+    </w:p>
+    <w:p>
+      <w:pPr>
+        <w:pStyle w:val="BodyText"/>
+      </w:pPr>
+      <w:r>
+        <w:t xml:space="preserve">Second,</w:t>
+      </w:r>
+      <w:r>
+        <w:t xml:space="preserve"> </w:t>
+      </w:r>
+      <w:r>
+        <w:rPr>
+          <w:b/>
+          <w:bCs/>
+        </w:rPr>
+        <w:t xml:space="preserve">honest stubbing</w:t>
+      </w:r>
+      <w:r>
+        <w:t xml:space="preserve">. Sections 7, 8, and 9 require access to your Klaviyo, Clarity, and GA4. Without that access, they render with a clear access-grant path (what to share, with which service account, to unlock the section). No fabricated numbers. No filler paragraphs pretending to be findings.</w:t>
+      </w:r>
+    </w:p>
+    <w:p>
+      <w:pPr>
+        <w:pStyle w:val="BodyText"/>
+      </w:pPr>
+      <w:r>
+        <w:t xml:space="preserve">Third, the</w:t>
+      </w:r>
+      <w:r>
+        <w:t xml:space="preserve"> </w:t>
+      </w:r>
+      <w:r>
+        <w:rPr>
+          <w:b/>
+          <w:bCs/>
+        </w:rPr>
+        <w:t xml:space="preserve">output format</w:t>
+      </w:r>
+      <w:r>
+        <w:t xml:space="preserve">. One Word doc you can share with your team, plus the markdown source in your GitHub repo. Version-controlled. Re-runnable quarterly. Integrated with your</w:t>
+      </w:r>
+      <w:r>
+        <w:t xml:space="preserve"> </w:t>
+      </w:r>
+      <w:r>
+        <w:rPr>
+          <w:rStyle w:val="VerbatimChar"/>
+        </w:rPr>
+        <w:t xml:space="preserve">actions.md</w:t>
+      </w:r>
+      <w:r>
+        <w:t xml:space="preserve"> </w:t>
+      </w:r>
+      <w:r>
+        <w:t xml:space="preserve">so the top five</w:t>
+      </w:r>
+      <w:r>
+        <w:t xml:space="preserve"> </w:t>
+      </w:r>
+      <w:r>
+        <w:t xml:space="preserve">“this week”</w:t>
+      </w:r>
+      <w:r>
+        <w:t xml:space="preserve"> </w:t>
+      </w:r>
+      <w:r>
+        <w:t xml:space="preserve">items merge straight into your team’s operating plan.</w:t>
+      </w:r>
+    </w:p>
+    <w:p>
+      <w:pPr>
+        <w:pStyle w:val="BodyText"/>
+      </w:pPr>
+      <w:r>
+        <w:rPr>
+          <w:b/>
+          <w:bCs/>
+        </w:rPr>
+        <w:t xml:space="preserve">Skip this playbook if</w:t>
+      </w:r>
+      <w:r>
+        <w:t xml:space="preserve"> </w:t>
+      </w:r>
+      <w:r>
+        <w:t xml:space="preserve">you’re a service business, a B2B SaaS, or a brand selling at the mass-market tier. The audit is tuned for premium DTC and the recommendations will be directionally off for other contexts.</w:t>
+      </w:r>
+    </w:p>
+    <w:p>
+      <w:r>
+        <w:pict>
+          <v:rect style="width:0;height:1.5pt" o:hralign="center" o:hrstd="t" o:hr="t"/>
+        </w:pict>
+      </w:r>
+    </w:p>
+    <w:bookmarkEnd w:id="13"/>
+    <w:bookmarkStart w:id="22" w:name="setup-15-minutes"/>
+    <w:p>
+      <w:pPr>
+        <w:pStyle w:val="Heading2"/>
+      </w:pPr>
+      <w:r>
+        <w:rPr>
+          <w:rStyle w:val="SectionNumber"/>
+        </w:rPr>
         <w:t xml:space="preserve">1.4</w:t>
       </w:r>
       <w:r>
@@ -389,7 +420,7 @@
         <w:t xml:space="preserve">Setup (15 Minutes)</w:t>
       </w:r>
     </w:p>
-    <w:bookmarkStart w:id="15" w:name="prerequisites"/>
+    <w:bookmarkStart w:id="16" w:name="prerequisites"/>
     <w:p>
       <w:pPr>
         <w:pStyle w:val="Heading3"/>
@@ -439,7 +470,7 @@
       <w:r>
         <w:t xml:space="preserve"> </w:t>
       </w:r>
-      <w:hyperlink r:id="rId13">
+      <w:hyperlink r:id="rId14">
         <w:r>
           <w:rPr>
             <w:rStyle w:val="Hyperlink"/>
@@ -499,7 +530,7 @@
       <w:r>
         <w:t xml:space="preserve"> </w:t>
       </w:r>
-      <w:hyperlink r:id="rId14">
+      <w:hyperlink r:id="rId15">
         <w:r>
           <w:rPr>
             <w:rStyle w:val="Hyperlink"/>
@@ -545,8 +576,8 @@
         <w:t xml:space="preserve">on your machine. One per brand you audit. Name it after the brand.</w:t>
       </w:r>
     </w:p>
-    <w:bookmarkEnd w:id="15"/>
-    <w:bookmarkStart w:id="16" w:name="step-1-create-the-project-folder"/>
+    <w:bookmarkEnd w:id="16"/>
+    <w:bookmarkStart w:id="17" w:name="step-1-create-the-project-folder"/>
     <w:p>
       <w:pPr>
         <w:pStyle w:val="Heading3"/>
@@ -613,8 +644,8 @@
         <w:t xml:space="preserve">Drop the three files from this bundle (CLAUDE.md, gtm-audit.md, README.md) into the folder.</w:t>
       </w:r>
     </w:p>
-    <w:bookmarkEnd w:id="16"/>
-    <w:bookmarkStart w:id="18" w:name="step-2-set-up-your-.env"/>
+    <w:bookmarkEnd w:id="17"/>
+    <w:bookmarkStart w:id="19" w:name="Xcb368a2042c4e7e90b8e53bd43dc508cb93effb"/>
     <w:p>
       <w:pPr>
         <w:pStyle w:val="Heading3"/>
@@ -629,7 +660,7 @@
         <w:tab/>
       </w:r>
       <w:r>
-        <w:t xml:space="preserve">Step 2: Set up your .env</w:t>
+        <w:t xml:space="preserve">Step 2: Set up your .env (optional: let Claude walk you through)</w:t>
       </w:r>
     </w:p>
     <w:p>
@@ -652,7 +683,30 @@
         <w:t xml:space="preserve"> </w:t>
       </w:r>
       <w:r>
-        <w:t xml:space="preserve">file in the project folder. Add the API keys you have. Minimum recommended:</w:t>
+        <w:t xml:space="preserve">file in the project folder. Add the API keys you have. If you’re missing any, that’s fine: when you run the master prompt in Step 5, Claude will print which tools are configured and which are missing, and offer to look up the current sign-up steps for each missing one. You can wire tools up on first run without leaving the terminal.</w:t>
+      </w:r>
+    </w:p>
+    <w:p>
+      <w:pPr>
+        <w:pStyle w:val="BodyText"/>
+      </w:pPr>
+      <w:r>
+        <w:t xml:space="preserve">Minimum recommended</w:t>
+      </w:r>
+      <w:r>
+        <w:t xml:space="preserve"> </w:t>
+      </w:r>
+      <w:r>
+        <w:rPr>
+          <w:rStyle w:val="VerbatimChar"/>
+        </w:rPr>
+        <w:t xml:space="preserve">.env</w:t>
+      </w:r>
+      <w:r>
+        <w:t xml:space="preserve"> </w:t>
+      </w:r>
+      <w:r>
+        <w:t xml:space="preserve">if you want to set up ahead of time:</w:t>
       </w:r>
     </w:p>
     <w:p>
@@ -740,7 +794,7 @@
       <w:r>
         <w:t xml:space="preserve"> </w:t>
       </w:r>
-      <w:hyperlink r:id="rId17">
+      <w:hyperlink r:id="rId18">
         <w:r>
           <w:rPr>
             <w:rStyle w:val="Hyperlink"/>
@@ -830,8 +884,8 @@
         <w:t xml:space="preserve">before your first commit.</w:t>
       </w:r>
     </w:p>
-    <w:bookmarkEnd w:id="18"/>
-    <w:bookmarkStart w:id="19" w:name="Xfd27a84db74deb94109549c423df99f37315a33"/>
+    <w:bookmarkEnd w:id="19"/>
+    <w:bookmarkStart w:id="20" w:name="Xfd27a84db74deb94109549c423df99f37315a33"/>
     <w:p>
       <w:pPr>
         <w:pStyle w:val="Heading3"/>
@@ -979,8 +1033,8 @@
         <w:t xml:space="preserve">However you populate it, the three-to-five competitor URLs are load-bearing. The audit auto-pulls competitor keyword data via DataForSEO in Section 3. Without competitor URLs Claude has to auto-discover them from the SERPs, which usually works but your hand-picked list is always sharper.</w:t>
       </w:r>
     </w:p>
-    <w:bookmarkEnd w:id="19"/>
-    <w:bookmarkStart w:id="20" w:name="step-4-open-claude-code-in-the-folder"/>
+    <w:bookmarkEnd w:id="20"/>
+    <w:bookmarkStart w:id="21" w:name="step-4-open-claude-code-in-the-folder"/>
     <w:p>
       <w:pPr>
         <w:pStyle w:val="Heading3"/>
@@ -1051,9 +1105,9 @@
         </w:pict>
       </w:r>
     </w:p>
-    <w:bookmarkEnd w:id="20"/>
     <w:bookmarkEnd w:id="21"/>
-    <w:bookmarkStart w:id="25" w:name="the-three-files-in-this-bundle"/>
+    <w:bookmarkEnd w:id="22"/>
+    <w:bookmarkStart w:id="26" w:name="the-three-files-in-this-bundle"/>
     <w:p>
       <w:pPr>
         <w:pStyle w:val="Heading2"/>
@@ -1071,7 +1125,7 @@
         <w:t xml:space="preserve">The Three Files in This Bundle</w:t>
       </w:r>
     </w:p>
-    <w:bookmarkStart w:id="22" w:name="Xc890e52cf3abe4f1818b403252832aa721cc8ce"/>
+    <w:bookmarkStart w:id="23" w:name="Xc890e52cf3abe4f1818b403252832aa721cc8ce"/>
     <w:p>
       <w:pPr>
         <w:pStyle w:val="Heading3"/>
@@ -1157,8 +1211,8 @@
         <w:t xml:space="preserve">with your specifics. Keep it tight, one to two sentences per field beats a paragraph. Founder voice beats marketing copy.</w:t>
       </w:r>
     </w:p>
-    <w:bookmarkEnd w:id="22"/>
-    <w:bookmarkStart w:id="23" w:name="X7c60c6c4885b1dc6ef6cb2de83582875ff4db68"/>
+    <w:bookmarkEnd w:id="23"/>
+    <w:bookmarkStart w:id="24" w:name="X7c60c6c4885b1dc6ef6cb2de83582875ff4db68"/>
     <w:p>
       <w:pPr>
         <w:pStyle w:val="Heading3"/>
@@ -1229,8 +1283,8 @@
         <w:t xml:space="preserve">Paste its entire contents into Claude Code and hit enter. Don’t edit it unless you know what you’re doing, the structure is load-bearing.</w:t>
       </w:r>
     </w:p>
-    <w:bookmarkEnd w:id="23"/>
-    <w:bookmarkStart w:id="24" w:name="file-3-readme.md"/>
+    <w:bookmarkEnd w:id="24"/>
+    <w:bookmarkStart w:id="25" w:name="file-3-readme.md"/>
     <w:p>
       <w:pPr>
         <w:pStyle w:val="Heading3"/>
@@ -1292,9 +1346,9 @@
         </w:pict>
       </w:r>
     </w:p>
-    <w:bookmarkEnd w:id="24"/>
     <w:bookmarkEnd w:id="25"/>
-    <w:bookmarkStart w:id="26" w:name="your-first-run"/>
+    <w:bookmarkEnd w:id="26"/>
+    <w:bookmarkStart w:id="27" w:name="your-first-run"/>
     <w:p>
       <w:pPr>
         <w:pStyle w:val="Heading2"/>
@@ -1517,8 +1571,8 @@
         </w:pict>
       </w:r>
     </w:p>
-    <w:bookmarkEnd w:id="26"/>
-    <w:bookmarkStart w:id="27" w:name="what-youll-get"/>
+    <w:bookmarkEnd w:id="27"/>
+    <w:bookmarkStart w:id="28" w:name="what-youll-get"/>
     <w:p>
       <w:pPr>
         <w:pStyle w:val="Heading2"/>
@@ -1819,8 +1873,8 @@
         </w:pict>
       </w:r>
     </w:p>
-    <w:bookmarkEnd w:id="27"/>
-    <w:bookmarkStart w:id="28" w:name="modes"/>
+    <w:bookmarkEnd w:id="28"/>
+    <w:bookmarkStart w:id="29" w:name="modes"/>
     <w:p>
       <w:pPr>
         <w:pStyle w:val="Heading2"/>
@@ -2079,8 +2133,8 @@
         </w:pict>
       </w:r>
     </w:p>
-    <w:bookmarkEnd w:id="28"/>
-    <w:bookmarkStart w:id="29" w:name="honest-caveats"/>
+    <w:bookmarkEnd w:id="29"/>
+    <w:bookmarkStart w:id="30" w:name="honest-caveats"/>
     <w:p>
       <w:pPr>
         <w:pStyle w:val="Heading2"/>
@@ -2249,8 +2303,8 @@
         </w:pict>
       </w:r>
     </w:p>
-    <w:bookmarkEnd w:id="29"/>
-    <w:bookmarkStart w:id="30" w:name="quick-start-checklist"/>
+    <w:bookmarkEnd w:id="30"/>
+    <w:bookmarkStart w:id="31" w:name="quick-start-checklist"/>
     <w:p>
       <w:pPr>
         <w:pStyle w:val="Heading2"/>
@@ -2588,8 +2642,8 @@
         </w:pict>
       </w:r>
     </w:p>
-    <w:bookmarkEnd w:id="30"/>
-    <w:bookmarkStart w:id="31" w:name="troubleshooting"/>
+    <w:bookmarkEnd w:id="31"/>
+    <w:bookmarkStart w:id="32" w:name="troubleshooting"/>
     <w:p>
       <w:pPr>
         <w:pStyle w:val="Heading2"/>
@@ -2707,7 +2761,7 @@
             <w:r>
               <w:t xml:space="preserve"> </w:t>
             </w:r>
-            <w:hyperlink r:id="rId14">
+            <w:hyperlink r:id="rId15">
               <w:r>
                 <w:rPr>
                   <w:rStyle w:val="Hyperlink"/>
@@ -2943,8 +2997,8 @@
         </w:pict>
       </w:r>
     </w:p>
-    <w:bookmarkEnd w:id="31"/>
-    <w:bookmarkStart w:id="34" w:name="credit"/>
+    <w:bookmarkEnd w:id="32"/>
+    <w:bookmarkStart w:id="35" w:name="credit"/>
     <w:p>
       <w:pPr>
         <w:pStyle w:val="Heading2"/>
@@ -2991,7 +3045,7 @@
       <w:r>
         <w:t xml:space="preserve"> </w:t>
       </w:r>
-      <w:hyperlink r:id="rId32">
+      <w:hyperlink r:id="rId33">
         <w:r>
           <w:rPr>
             <w:rStyle w:val="Hyperlink"/>
@@ -3073,7 +3127,7 @@
       <w:r>
         <w:t xml:space="preserve"> </w:t>
       </w:r>
-      <w:hyperlink r:id="rId33">
+      <w:hyperlink r:id="rId34">
         <w:r>
           <w:rPr>
             <w:rStyle w:val="Hyperlink"/>
@@ -3098,9 +3152,9 @@
         <w:t xml:space="preserve">================================================================================</w:t>
       </w:r>
     </w:p>
-    <w:bookmarkEnd w:id="34"/>
     <w:bookmarkEnd w:id="35"/>
-    <w:bookmarkStart w:id="36" w:name="X527a1c952b73df6849f10da3ff4461cc53fe709"/>
+    <w:bookmarkEnd w:id="36"/>
+    <w:bookmarkStart w:id="37" w:name="X527a1c952b73df6849f10da3ff4461cc53fe709"/>
     <w:p>
       <w:pPr>
         <w:pStyle w:val="Heading1"/>
@@ -4156,8 +4210,8 @@
         <w:t xml:space="preserve">================================================================================</w:t>
       </w:r>
     </w:p>
-    <w:bookmarkEnd w:id="36"/>
-    <w:bookmarkStart w:id="44" w:name="X4e7d28ab2fdd2b5e27aced169d72f72ff40f684"/>
+    <w:bookmarkEnd w:id="37"/>
+    <w:bookmarkStart w:id="45" w:name="X4e7d28ab2fdd2b5e27aced169d72f72ff40f684"/>
     <w:p>
       <w:pPr>
         <w:pStyle w:val="Heading1"/>
@@ -4809,6 +4863,102 @@
         <w:rPr>
           <w:rStyle w:val="VerbatimChar"/>
         </w:rPr>
+        <w:t xml:space="preserve">### Offer setup instructions for missing tools</w:t>
+      </w:r>
+      <w:r>
+        <w:br/>
+      </w:r>
+      <w:r>
+        <w:br/>
+      </w:r>
+      <w:r>
+        <w:rPr>
+          <w:rStyle w:val="VerbatimChar"/>
+        </w:rPr>
+        <w:t xml:space="preserve">After printing the inventory, go through each tool flagged "not configured" (External and Internal both). For each one, ask the user:</w:t>
+      </w:r>
+      <w:r>
+        <w:br/>
+      </w:r>
+      <w:r>
+        <w:br/>
+      </w:r>
+      <w:r>
+        <w:rPr>
+          <w:rStyle w:val="VerbatimChar"/>
+        </w:rPr>
+        <w:t xml:space="preserve">&gt; "`{Tool}` is not configured. Want me to look up the current sign-up steps and API-key retrieval flow, so you can wire it in and we can populate more of the audit? Answer `yes`, `no`, or `skip all`."</w:t>
+      </w:r>
+      <w:r>
+        <w:br/>
+      </w:r>
+      <w:r>
+        <w:br/>
+      </w:r>
+      <w:r>
+        <w:rPr>
+          <w:rStyle w:val="VerbatimChar"/>
+        </w:rPr>
+        <w:t xml:space="preserve">If the user answers `yes`, use WebSearch and WebFetch to pull the current sign-up flow for that specific tool (pricing tiers, free-tier availability, where the API key lives in the account settings, and the exact `.env` variable name this playbook expects). Produce step-by-step instructions the user can follow in ~5 minutes. Include a one-line estimate of credit cost for a typical audit run where known (for example, DataForSEO: under $10 per full run).</w:t>
+      </w:r>
+      <w:r>
+        <w:br/>
+      </w:r>
+      <w:r>
+        <w:br/>
+      </w:r>
+      <w:r>
+        <w:rPr>
+          <w:rStyle w:val="VerbatimChar"/>
+        </w:rPr>
+        <w:t xml:space="preserve">If the user answers `no` for a specific tool, skip that one and ask about the next missing tool.</w:t>
+      </w:r>
+      <w:r>
+        <w:br/>
+      </w:r>
+      <w:r>
+        <w:br/>
+      </w:r>
+      <w:r>
+        <w:rPr>
+          <w:rStyle w:val="VerbatimChar"/>
+        </w:rPr>
+        <w:t xml:space="preserve">If the user answers `skip all` at any point, stop offering and proceed to Step 3.</w:t>
+      </w:r>
+      <w:r>
+        <w:br/>
+      </w:r>
+      <w:r>
+        <w:br/>
+      </w:r>
+      <w:r>
+        <w:rPr>
+          <w:rStyle w:val="VerbatimChar"/>
+        </w:rPr>
+        <w:t xml:space="preserve">After the user adds any new credentials to `.env`, reprint the updated credential inventory before continuing. Confirm the new tool is now flagged "configured".</w:t>
+      </w:r>
+      <w:r>
+        <w:br/>
+      </w:r>
+      <w:r>
+        <w:br/>
+      </w:r>
+      <w:r>
+        <w:rPr>
+          <w:rStyle w:val="VerbatimChar"/>
+        </w:rPr>
+        <w:t xml:space="preserve">Never hardcode sign-up URLs or pricing numbers from memory. Pull fresh from the web every time. Sign-up flows, pricing tiers, and UI navigation change frequently.</w:t>
+      </w:r>
+      <w:r>
+        <w:br/>
+      </w:r>
+      <w:r>
+        <w:br/>
+      </w:r>
+      <w:r>
+        <w:rPr>
+          <w:rStyle w:val="VerbatimChar"/>
+        </w:rPr>
         <w:t xml:space="preserve">---</w:t>
       </w:r>
       <w:r>
@@ -5295,7 +5445,7 @@
         <w:t xml:space="preserve">Internal-heavy. If Klaviyo or Brevo is not configured, render the stub:</w:t>
       </w:r>
     </w:p>
-    <w:bookmarkStart w:id="37" w:name="email-lifecycle-and-crm"/>
+    <w:bookmarkStart w:id="38" w:name="email-lifecycle-and-crm"/>
     <w:p>
       <w:pPr>
         <w:pStyle w:val="Heading2"/>
@@ -5676,8 +5826,8 @@
         <w:t xml:space="preserve">### Audience Insights prompt (inlined for Section 1)</w:t>
       </w:r>
     </w:p>
-    <w:bookmarkEnd w:id="37"/>
-    <w:bookmarkStart w:id="38" w:name="role"/>
+    <w:bookmarkEnd w:id="38"/>
+    <w:bookmarkStart w:id="39" w:name="role"/>
     <w:p>
       <w:pPr>
         <w:pStyle w:val="Heading2"/>
@@ -5715,8 +5865,8 @@
         <w:t xml:space="preserve">founder reviews in under 5 minutes and approves or redirects section by section.</w:t>
       </w:r>
     </w:p>
-    <w:bookmarkEnd w:id="38"/>
-    <w:bookmarkStart w:id="39" w:name="inputs-required-refuse-if-any-missing"/>
+    <w:bookmarkEnd w:id="39"/>
+    <w:bookmarkStart w:id="40" w:name="inputs-required-refuse-if-any-missing"/>
     <w:p>
       <w:pPr>
         <w:pStyle w:val="Heading2"/>
@@ -5784,8 +5934,8 @@
         <w:t xml:space="preserve">“Unable to proceed without audience, struggle, and product.”</w:t>
       </w:r>
     </w:p>
-    <w:bookmarkEnd w:id="39"/>
-    <w:bookmarkStart w:id="40" w:name="research-method"/>
+    <w:bookmarkEnd w:id="40"/>
+    <w:bookmarkStart w:id="41" w:name="research-method"/>
     <w:p>
       <w:pPr>
         <w:pStyle w:val="Heading2"/>
@@ -5881,8 +6031,8 @@
         <w:t xml:space="preserve">recurs across multiple quotes.</w:t>
       </w:r>
     </w:p>
-    <w:bookmarkEnd w:id="40"/>
-    <w:bookmarkStart w:id="41" w:name="deliverable-the-one-pager"/>
+    <w:bookmarkEnd w:id="41"/>
+    <w:bookmarkStart w:id="42" w:name="deliverable-the-one-pager"/>
     <w:p>
       <w:pPr>
         <w:pStyle w:val="Heading2"/>
@@ -6070,8 +6220,8 @@
         <w:t xml:space="preserve">buying.</w:t>
       </w:r>
     </w:p>
-    <w:bookmarkEnd w:id="41"/>
-    <w:bookmarkStart w:id="42" w:name="appendix-verbatim-quotes-15"/>
+    <w:bookmarkEnd w:id="42"/>
+    <w:bookmarkStart w:id="43" w:name="appendix-verbatim-quotes-15"/>
     <w:p>
       <w:pPr>
         <w:pStyle w:val="Heading2"/>
@@ -6112,8 +6262,8 @@
         <w:t xml:space="preserve">Save to data/gtm-audit/{YYYY-MM-DD}/audience-voc-mining.md</w:t>
       </w:r>
     </w:p>
-    <w:bookmarkEnd w:id="42"/>
-    <w:bookmarkStart w:id="43" w:name="rules"/>
+    <w:bookmarkEnd w:id="43"/>
+    <w:bookmarkStart w:id="44" w:name="rules"/>
     <w:p>
       <w:pPr>
         <w:pStyle w:val="Heading2"/>
@@ -6673,9 +6823,9 @@
         <w:t xml:space="preserve">Report structure (fixed order):</w:t>
       </w:r>
     </w:p>
-    <w:bookmarkEnd w:id="43"/>
     <w:bookmarkEnd w:id="44"/>
-    <w:bookmarkStart w:id="66" w:name="gtm-audit-brand-name-yyyy-mm-dd"/>
+    <w:bookmarkEnd w:id="45"/>
+    <w:bookmarkStart w:id="67" w:name="gtm-audit-brand-name-yyyy-mm-dd"/>
     <w:p>
       <w:pPr>
         <w:pStyle w:val="Heading1"/>
@@ -6707,7 +6857,7 @@
         <w:t xml:space="preserve">Access level: {External only / External + Internal}</w:t>
       </w:r>
     </w:p>
-    <w:bookmarkStart w:id="45" w:name="executive-summary"/>
+    <w:bookmarkStart w:id="46" w:name="executive-summary"/>
     <w:p>
       <w:pPr>
         <w:pStyle w:val="Heading2"/>
@@ -6733,8 +6883,8 @@
         <w:t xml:space="preserve">(3-4 sentences leading with the narrative)</w:t>
       </w:r>
     </w:p>
-    <w:bookmarkEnd w:id="45"/>
-    <w:bookmarkStart w:id="46" w:name="cross-cutting-themes"/>
+    <w:bookmarkEnd w:id="46"/>
+    <w:bookmarkStart w:id="47" w:name="cross-cutting-themes"/>
     <w:p>
       <w:pPr>
         <w:pStyle w:val="Heading2"/>
@@ -6760,8 +6910,8 @@
         <w:t xml:space="preserve">(3-5 synthesis bullets from Step 5)</w:t>
       </w:r>
     </w:p>
-    <w:bookmarkEnd w:id="46"/>
-    <w:bookmarkStart w:id="47" w:name="key-findings"/>
+    <w:bookmarkEnd w:id="47"/>
+    <w:bookmarkStart w:id="48" w:name="key-findings"/>
     <w:p>
       <w:pPr>
         <w:pStyle w:val="Heading2"/>
@@ -6787,8 +6937,8 @@
         <w:t xml:space="preserve">(5-7 one-line bullets across sections)</w:t>
       </w:r>
     </w:p>
-    <w:bookmarkEnd w:id="47"/>
-    <w:bookmarkStart w:id="48" w:name="key-action-items-top-5-this-week"/>
+    <w:bookmarkEnd w:id="48"/>
+    <w:bookmarkStart w:id="49" w:name="key-action-items-top-5-this-week"/>
     <w:p>
       <w:pPr>
         <w:pStyle w:val="Heading2"/>
@@ -6823,8 +6973,8 @@
         <w:t xml:space="preserve">)</w:t>
       </w:r>
     </w:p>
-    <w:bookmarkEnd w:id="48"/>
-    <w:bookmarkStart w:id="49" w:name="audience"/>
+    <w:bookmarkEnd w:id="49"/>
+    <w:bookmarkStart w:id="50" w:name="audience"/>
     <w:p>
       <w:pPr>
         <w:pStyle w:val="Heading2"/>
@@ -6842,8 +6992,8 @@
         <w:t xml:space="preserve">1. Audience</w:t>
       </w:r>
     </w:p>
-    <w:bookmarkEnd w:id="49"/>
-    <w:bookmarkStart w:id="50" w:name="vision"/>
+    <w:bookmarkEnd w:id="50"/>
+    <w:bookmarkStart w:id="51" w:name="vision"/>
     <w:p>
       <w:pPr>
         <w:pStyle w:val="Heading2"/>
@@ -6861,8 +7011,8 @@
         <w:t xml:space="preserve">2. Vision</w:t>
       </w:r>
     </w:p>
-    <w:bookmarkEnd w:id="50"/>
-    <w:bookmarkStart w:id="51" w:name="competitor-audit"/>
+    <w:bookmarkEnd w:id="51"/>
+    <w:bookmarkStart w:id="52" w:name="competitor-audit"/>
     <w:p>
       <w:pPr>
         <w:pStyle w:val="Heading2"/>
@@ -6880,8 +7030,8 @@
         <w:t xml:space="preserve">3. Competitor Audit</w:t>
       </w:r>
     </w:p>
-    <w:bookmarkEnd w:id="51"/>
-    <w:bookmarkStart w:id="52" w:name="seo"/>
+    <w:bookmarkEnd w:id="52"/>
+    <w:bookmarkStart w:id="53" w:name="seo"/>
     <w:p>
       <w:pPr>
         <w:pStyle w:val="Heading2"/>
@@ -6899,8 +7049,8 @@
         <w:t xml:space="preserve">4. SEO</w:t>
       </w:r>
     </w:p>
-    <w:bookmarkEnd w:id="52"/>
-    <w:bookmarkStart w:id="53" w:name="aeo"/>
+    <w:bookmarkEnd w:id="53"/>
+    <w:bookmarkStart w:id="54" w:name="aeo"/>
     <w:p>
       <w:pPr>
         <w:pStyle w:val="Heading2"/>
@@ -6918,8 +7068,8 @@
         <w:t xml:space="preserve">5. AEO</w:t>
       </w:r>
     </w:p>
-    <w:bookmarkEnd w:id="53"/>
-    <w:bookmarkStart w:id="54" w:name="paid-ad-recommendations"/>
+    <w:bookmarkEnd w:id="54"/>
+    <w:bookmarkStart w:id="55" w:name="paid-ad-recommendations"/>
     <w:p>
       <w:pPr>
         <w:pStyle w:val="Heading2"/>
@@ -6937,8 +7087,8 @@
         <w:t xml:space="preserve">6. Paid Ad Recommendations</w:t>
       </w:r>
     </w:p>
-    <w:bookmarkEnd w:id="54"/>
-    <w:bookmarkStart w:id="55" w:name="email-lifecycle-and-crm-1"/>
+    <w:bookmarkEnd w:id="55"/>
+    <w:bookmarkStart w:id="56" w:name="email-lifecycle-and-crm-1"/>
     <w:p>
       <w:pPr>
         <w:pStyle w:val="Heading2"/>
@@ -6956,8 +7106,8 @@
         <w:t xml:space="preserve">7. Email, Lifecycle, and CRM</w:t>
       </w:r>
     </w:p>
-    <w:bookmarkEnd w:id="55"/>
-    <w:bookmarkStart w:id="56" w:name="conversion-optimisation"/>
+    <w:bookmarkEnd w:id="56"/>
+    <w:bookmarkStart w:id="57" w:name="conversion-optimisation"/>
     <w:p>
       <w:pPr>
         <w:pStyle w:val="Heading2"/>
@@ -6975,8 +7125,8 @@
         <w:t xml:space="preserve">8. Conversion Optimisation</w:t>
       </w:r>
     </w:p>
-    <w:bookmarkEnd w:id="56"/>
-    <w:bookmarkStart w:id="57" w:name="analytics-and-tracking"/>
+    <w:bookmarkEnd w:id="57"/>
+    <w:bookmarkStart w:id="58" w:name="analytics-and-tracking"/>
     <w:p>
       <w:pPr>
         <w:pStyle w:val="Heading2"/>
@@ -6994,8 +7144,8 @@
         <w:t xml:space="preserve">9. Analytics and Tracking</w:t>
       </w:r>
     </w:p>
-    <w:bookmarkEnd w:id="57"/>
-    <w:bookmarkStart w:id="58" w:name="prioritised-action-items"/>
+    <w:bookmarkEnd w:id="58"/>
+    <w:bookmarkStart w:id="59" w:name="prioritised-action-items"/>
     <w:p>
       <w:pPr>
         <w:pStyle w:val="Heading2"/>
@@ -7013,8 +7163,8 @@
         <w:t xml:space="preserve">10. Prioritised Action Items</w:t>
       </w:r>
     </w:p>
-    <w:bookmarkEnd w:id="58"/>
-    <w:bookmarkStart w:id="59" w:name="access-grant-checklist"/>
+    <w:bookmarkEnd w:id="59"/>
+    <w:bookmarkStart w:id="60" w:name="access-grant-checklist"/>
     <w:p>
       <w:pPr>
         <w:pStyle w:val="Heading2"/>
@@ -7040,8 +7190,8 @@
         <w:t xml:space="preserve">(Only appears if any Internal-layer section is stubbed)</w:t>
       </w:r>
     </w:p>
-    <w:bookmarkEnd w:id="59"/>
-    <w:bookmarkStart w:id="60" w:name="conclusion"/>
+    <w:bookmarkEnd w:id="60"/>
+    <w:bookmarkStart w:id="61" w:name="conclusion"/>
     <w:p>
       <w:pPr>
         <w:pStyle w:val="Heading2"/>
@@ -7209,8 +7359,8 @@
         </w:pict>
       </w:r>
     </w:p>
-    <w:bookmarkEnd w:id="60"/>
-    <w:bookmarkStart w:id="61" w:name="step-8.-merge-into-actions.md"/>
+    <w:bookmarkEnd w:id="61"/>
+    <w:bookmarkStart w:id="62" w:name="step-8.-merge-into-actions.md"/>
     <w:p>
       <w:pPr>
         <w:pStyle w:val="Heading2"/>
@@ -7270,8 +7420,8 @@
         </w:pict>
       </w:r>
     </w:p>
-    <w:bookmarkEnd w:id="61"/>
-    <w:bookmarkStart w:id="62" w:name="step-9.-commit-optional"/>
+    <w:bookmarkEnd w:id="62"/>
+    <w:bookmarkStart w:id="63" w:name="step-9.-commit-optional"/>
     <w:p>
       <w:pPr>
         <w:pStyle w:val="Heading2"/>
@@ -7315,8 +7465,8 @@
         </w:pict>
       </w:r>
     </w:p>
-    <w:bookmarkEnd w:id="62"/>
-    <w:bookmarkStart w:id="63" w:name="Xeca2479b337d7d1fd5c99a168897a2be1cc83b5"/>
+    <w:bookmarkEnd w:id="63"/>
+    <w:bookmarkStart w:id="64" w:name="Xeca2479b337d7d1fd5c99a168897a2be1cc83b5"/>
     <w:p>
       <w:pPr>
         <w:pStyle w:val="Heading2"/>
@@ -7446,8 +7596,8 @@
         </w:pict>
       </w:r>
     </w:p>
-    <w:bookmarkEnd w:id="63"/>
-    <w:bookmarkStart w:id="64" w:name="acceptance-criteria"/>
+    <w:bookmarkEnd w:id="64"/>
+    <w:bookmarkStart w:id="65" w:name="acceptance-criteria"/>
     <w:p>
       <w:pPr>
         <w:pStyle w:val="Heading2"/>
@@ -7544,8 +7694,8 @@
         </w:pict>
       </w:r>
     </w:p>
-    <w:bookmarkEnd w:id="64"/>
-    <w:bookmarkStart w:id="65" w:name="what-to-do-with-the-output"/>
+    <w:bookmarkEnd w:id="65"/>
+    <w:bookmarkStart w:id="66" w:name="what-to-do-with-the-output"/>
     <w:p>
       <w:pPr>
         <w:pStyle w:val="Heading2"/>
@@ -7609,8 +7759,8 @@
         <w:t xml:space="preserve">```</w:t>
       </w:r>
     </w:p>
-    <w:bookmarkEnd w:id="65"/>
     <w:bookmarkEnd w:id="66"/>
+    <w:bookmarkEnd w:id="67"/>
     <w:sectPr>
       <w:footnotePr>
         <w:numRestart w:val="eachSect"/>

</xml_diff>

<commit_message>
Add cost overview table to README so prospects can budget upfront
</commit_message>
<xml_diff>
--- a/gtm-audit-bundle-combined.docx
+++ b/gtm-audit-bundle-combined.docx
@@ -74,7 +74,7 @@
       </w:r>
     </w:p>
     <w:bookmarkEnd w:id="10"/>
-    <w:bookmarkStart w:id="36" w:name="initial-gtm-audit-playbook"/>
+    <w:bookmarkStart w:id="37" w:name="initial-gtm-audit-playbook"/>
     <w:p>
       <w:pPr>
         <w:pStyle w:val="Heading1"/>
@@ -402,7 +402,7 @@
       </w:r>
     </w:p>
     <w:bookmarkEnd w:id="13"/>
-    <w:bookmarkStart w:id="22" w:name="setup-15-minutes"/>
+    <w:bookmarkStart w:id="23" w:name="setup-15-minutes"/>
     <w:p>
       <w:pPr>
         <w:pStyle w:val="Heading2"/>
@@ -577,7 +577,7 @@
       </w:r>
     </w:p>
     <w:bookmarkEnd w:id="16"/>
-    <w:bookmarkStart w:id="17" w:name="step-1-create-the-project-folder"/>
+    <w:bookmarkStart w:id="17" w:name="cost-overview"/>
     <w:p>
       <w:pPr>
         <w:pStyle w:val="Heading3"/>
@@ -592,48 +592,7 @@
         <w:tab/>
       </w:r>
       <w:r>
-        <w:t xml:space="preserve">Step 1: Create the project folder</w:t>
-      </w:r>
-    </w:p>
-    <w:p>
-      <w:pPr>
-        <w:pStyle w:val="SourceCode"/>
-      </w:pPr>
-      <w:r>
-        <w:rPr>
-          <w:rStyle w:val="FunctionTok"/>
-        </w:rPr>
-        <w:t xml:space="preserve">mkdir</w:t>
-      </w:r>
-      <w:r>
-        <w:rPr>
-          <w:rStyle w:val="NormalTok"/>
-        </w:rPr>
-        <w:t xml:space="preserve"> my-brand-audit </w:t>
-      </w:r>
-      <w:r>
-        <w:rPr>
-          <w:rStyle w:val="KeywordTok"/>
-        </w:rPr>
-        <w:t xml:space="preserve">&amp;&amp;</w:t>
-      </w:r>
-      <w:r>
-        <w:rPr>
-          <w:rStyle w:val="NormalTok"/>
-        </w:rPr>
-        <w:t xml:space="preserve"> </w:t>
-      </w:r>
-      <w:r>
-        <w:rPr>
-          <w:rStyle w:val="BuiltInTok"/>
-        </w:rPr>
-        <w:t xml:space="preserve">cd</w:t>
-      </w:r>
-      <w:r>
-        <w:rPr>
-          <w:rStyle w:val="NormalTok"/>
-        </w:rPr>
-        <w:t xml:space="preserve"> my-brand-audit</w:t>
+        <w:t xml:space="preserve">Cost overview</w:t>
       </w:r>
     </w:p>
     <w:p>
@@ -641,148 +600,870 @@
         <w:pStyle w:val="FirstParagraph"/>
       </w:pPr>
       <w:r>
-        <w:t xml:space="preserve">Drop the three files from this bundle (CLAUDE.md, gtm-audit.md, README.md) into the folder.</w:t>
-      </w:r>
-    </w:p>
-    <w:bookmarkEnd w:id="17"/>
-    <w:bookmarkStart w:id="19" w:name="Xcb368a2042c4e7e90b8e53bd43dc508cb93effb"/>
-    <w:p>
-      <w:pPr>
-        <w:pStyle w:val="Heading3"/>
-      </w:pPr>
-      <w:r>
-        <w:rPr>
-          <w:rStyle w:val="SectionNumber"/>
-        </w:rPr>
-        <w:t xml:space="preserve">1.4.3</w:t>
-      </w:r>
-      <w:r>
-        <w:tab/>
-      </w:r>
-      <w:r>
-        <w:t xml:space="preserve">Step 2: Set up your .env (optional: let Claude walk you through)</w:t>
-      </w:r>
-    </w:p>
-    <w:p>
-      <w:pPr>
-        <w:pStyle w:val="FirstParagraph"/>
-      </w:pPr>
-      <w:r>
-        <w:t xml:space="preserve">Create a</w:t>
-      </w:r>
-      <w:r>
-        <w:t xml:space="preserve"> </w:t>
-      </w:r>
-      <w:r>
-        <w:rPr>
-          <w:rStyle w:val="VerbatimChar"/>
-        </w:rPr>
-        <w:t xml:space="preserve">.env</w:t>
-      </w:r>
-      <w:r>
-        <w:t xml:space="preserve"> </w:t>
-      </w:r>
-      <w:r>
-        <w:t xml:space="preserve">file in the project folder. Add the API keys you have. If you’re missing any, that’s fine: when you run the master prompt in Step 5, Claude will print which tools are configured and which are missing, and offer to look up the current sign-up steps for each missing one. You can wire tools up on first run without leaving the terminal.</w:t>
-      </w:r>
-    </w:p>
+        <w:t xml:space="preserve">The playbook itself is free. You pay for API credits consumed by tools the audit uses. Most are free or near-free. The one with a meaningful per-run cost is DataForSEO.</w:t>
+      </w:r>
+    </w:p>
+    <w:tbl>
+      <w:tblPr>
+        <w:tblStyle w:val="Table"/>
+        <w:tblW w:type="pct" w:w="5000"/>
+        <w:tblLayout w:type="fixed"/>
+        <w:tblLook w:firstRow="1" w:lastRow="0" w:firstColumn="0" w:lastColumn="0" w:noHBand="0" w:noVBand="0" w:val="0020"/>
+      </w:tblPr>
+      <w:tblGrid>
+        <w:gridCol w:w="1980"/>
+        <w:gridCol w:w="1980"/>
+        <w:gridCol w:w="1980"/>
+        <w:gridCol w:w="1980"/>
+      </w:tblGrid>
+      <w:tr>
+        <w:trPr>
+          <w:tblHeader w:val="on"/>
+        </w:trPr>
+        <w:tc>
+          <w:tcPr/>
+          <w:p>
+            <w:pPr>
+              <w:pStyle w:val="Compact"/>
+            </w:pPr>
+            <w:r>
+              <w:t xml:space="preserve">Tool</w:t>
+            </w:r>
+          </w:p>
+        </w:tc>
+        <w:tc>
+          <w:tcPr/>
+          <w:p>
+            <w:pPr>
+              <w:pStyle w:val="Compact"/>
+            </w:pPr>
+            <w:r>
+              <w:t xml:space="preserve">Subscription model</w:t>
+            </w:r>
+          </w:p>
+        </w:tc>
+        <w:tc>
+          <w:tcPr/>
+          <w:p>
+            <w:pPr>
+              <w:pStyle w:val="Compact"/>
+            </w:pPr>
+            <w:r>
+              <w:t xml:space="preserve">Typical per-run cost</w:t>
+            </w:r>
+          </w:p>
+        </w:tc>
+        <w:tc>
+          <w:tcPr/>
+          <w:p>
+            <w:pPr>
+              <w:pStyle w:val="Compact"/>
+            </w:pPr>
+            <w:r>
+              <w:t xml:space="preserve">Role</w:t>
+            </w:r>
+          </w:p>
+        </w:tc>
+      </w:tr>
+      <w:tr>
+        <w:tc>
+          <w:tcPr/>
+          <w:p>
+            <w:pPr>
+              <w:pStyle w:val="Compact"/>
+            </w:pPr>
+            <w:r>
+              <w:t xml:space="preserve">DataForSEO</w:t>
+            </w:r>
+          </w:p>
+        </w:tc>
+        <w:tc>
+          <w:tcPr/>
+          <w:p>
+            <w:pPr>
+              <w:pStyle w:val="Compact"/>
+            </w:pPr>
+            <w:r>
+              <w:t xml:space="preserve">Pay-as-you-go, no monthly fee</w:t>
+            </w:r>
+          </w:p>
+        </w:tc>
+        <w:tc>
+          <w:tcPr/>
+          <w:p>
+            <w:pPr>
+              <w:pStyle w:val="Compact"/>
+            </w:pPr>
+            <w:r>
+              <w:rPr>
+                <w:b/>
+                <w:bCs/>
+              </w:rPr>
+              <w:t xml:space="preserve">$1 to $10</w:t>
+            </w:r>
+          </w:p>
+        </w:tc>
+        <w:tc>
+          <w:tcPr/>
+          <w:p>
+            <w:pPr>
+              <w:pStyle w:val="Compact"/>
+            </w:pPr>
+            <w:r>
+              <w:t xml:space="preserve">Recommended. Heaviest spender. Powers competitor keyword footprints and SEO diagnostics.</w:t>
+            </w:r>
+          </w:p>
+        </w:tc>
+      </w:tr>
+      <w:tr>
+        <w:tc>
+          <w:tcPr/>
+          <w:p>
+            <w:pPr>
+              <w:pStyle w:val="Compact"/>
+            </w:pPr>
+            <w:r>
+              <w:t xml:space="preserve">Serper</w:t>
+            </w:r>
+          </w:p>
+        </w:tc>
+        <w:tc>
+          <w:tcPr/>
+          <w:p>
+            <w:pPr>
+              <w:pStyle w:val="Compact"/>
+            </w:pPr>
+            <w:r>
+              <w:t xml:space="preserve">Free tier gives 2,500 credits</w:t>
+            </w:r>
+          </w:p>
+        </w:tc>
+        <w:tc>
+          <w:tcPr/>
+          <w:p>
+            <w:pPr>
+              <w:pStyle w:val="Compact"/>
+            </w:pPr>
+            <w:r>
+              <w:t xml:space="preserve">Under $0.50</w:t>
+            </w:r>
+          </w:p>
+        </w:tc>
+        <w:tc>
+          <w:tcPr/>
+          <w:p>
+            <w:pPr>
+              <w:pStyle w:val="Compact"/>
+            </w:pPr>
+            <w:r>
+              <w:t xml:space="preserve">Recommended. Effectively free unless you run 100+ audits a month.</w:t>
+            </w:r>
+          </w:p>
+        </w:tc>
+      </w:tr>
+      <w:tr>
+        <w:tc>
+          <w:tcPr/>
+          <w:p>
+            <w:pPr>
+              <w:pStyle w:val="Compact"/>
+            </w:pPr>
+            <w:r>
+              <w:t xml:space="preserve">Keywords Everywhere</w:t>
+            </w:r>
+          </w:p>
+        </w:tc>
+        <w:tc>
+          <w:tcPr/>
+          <w:p>
+            <w:pPr>
+              <w:pStyle w:val="Compact"/>
+            </w:pPr>
+            <w:r>
+              <w:t xml:space="preserve">~$10 one-time for 100K credits</w:t>
+            </w:r>
+          </w:p>
+        </w:tc>
+        <w:tc>
+          <w:tcPr/>
+          <w:p>
+            <w:pPr>
+              <w:pStyle w:val="Compact"/>
+            </w:pPr>
+            <w:r>
+              <w:t xml:space="preserve">Under $0.50</w:t>
+            </w:r>
+          </w:p>
+        </w:tc>
+        <w:tc>
+          <w:tcPr/>
+          <w:p>
+            <w:pPr>
+              <w:pStyle w:val="Compact"/>
+            </w:pPr>
+            <w:r>
+              <w:t xml:space="preserve">Recommended. Used for keyword volume lookups.</w:t>
+            </w:r>
+          </w:p>
+        </w:tc>
+      </w:tr>
+      <w:tr>
+        <w:tc>
+          <w:tcPr/>
+          <w:p>
+            <w:pPr>
+              <w:pStyle w:val="Compact"/>
+            </w:pPr>
+            <w:r>
+              <w:t xml:space="preserve">Ahrefs</w:t>
+            </w:r>
+          </w:p>
+        </w:tc>
+        <w:tc>
+          <w:tcPr/>
+          <w:p>
+            <w:pPr>
+              <w:pStyle w:val="Compact"/>
+            </w:pPr>
+            <w:r>
+              <w:t xml:space="preserve">$129+ per month</w:t>
+            </w:r>
+          </w:p>
+        </w:tc>
+        <w:tc>
+          <w:tcPr/>
+          <w:p>
+            <w:pPr>
+              <w:pStyle w:val="Compact"/>
+            </w:pPr>
+            <w:r>
+              <w:t xml:space="preserve">Optional</w:t>
+            </w:r>
+          </w:p>
+        </w:tc>
+        <w:tc>
+          <w:tcPr/>
+          <w:p>
+            <w:pPr>
+              <w:pStyle w:val="Compact"/>
+            </w:pPr>
+            <w:r>
+              <w:t xml:space="preserve">Skip unless you already have an account. DataForSEO covers most of the same ground.</w:t>
+            </w:r>
+          </w:p>
+        </w:tc>
+      </w:tr>
+      <w:tr>
+        <w:tc>
+          <w:tcPr/>
+          <w:p>
+            <w:pPr>
+              <w:pStyle w:val="Compact"/>
+            </w:pPr>
+            <w:r>
+              <w:t xml:space="preserve">Google PageSpeed Insights</w:t>
+            </w:r>
+          </w:p>
+        </w:tc>
+        <w:tc>
+          <w:tcPr/>
+          <w:p>
+            <w:pPr>
+              <w:pStyle w:val="Compact"/>
+            </w:pPr>
+            <w:r>
+              <w:t xml:space="preserve">Free</w:t>
+            </w:r>
+          </w:p>
+        </w:tc>
+        <w:tc>
+          <w:tcPr/>
+          <w:p>
+            <w:pPr>
+              <w:pStyle w:val="Compact"/>
+            </w:pPr>
+            <w:r>
+              <w:t xml:space="preserve">$0</w:t>
+            </w:r>
+          </w:p>
+        </w:tc>
+        <w:tc>
+          <w:tcPr/>
+          <w:p>
+            <w:pPr>
+              <w:pStyle w:val="Compact"/>
+            </w:pPr>
+            <w:r>
+              <w:t xml:space="preserve">Uses a free Google Cloud API key (</w:t>
+            </w:r>
+            <w:r>
+              <w:rPr>
+                <w:rStyle w:val="VerbatimChar"/>
+              </w:rPr>
+              <w:t xml:space="preserve">GOOGLE_AI_KEY</w:t>
+            </w:r>
+            <w:r>
+              <w:t xml:space="preserve">).</w:t>
+            </w:r>
+          </w:p>
+        </w:tc>
+      </w:tr>
+      <w:tr>
+        <w:tc>
+          <w:tcPr/>
+          <w:p>
+            <w:pPr>
+              <w:pStyle w:val="Compact"/>
+            </w:pPr>
+            <w:r>
+              <w:t xml:space="preserve">Google Analytics 4</w:t>
+            </w:r>
+          </w:p>
+        </w:tc>
+        <w:tc>
+          <w:tcPr/>
+          <w:p>
+            <w:pPr>
+              <w:pStyle w:val="Compact"/>
+            </w:pPr>
+            <w:r>
+              <w:t xml:space="preserve">Free (your own account)</w:t>
+            </w:r>
+          </w:p>
+        </w:tc>
+        <w:tc>
+          <w:tcPr/>
+          <w:p>
+            <w:pPr>
+              <w:pStyle w:val="Compact"/>
+            </w:pPr>
+            <w:r>
+              <w:t xml:space="preserve">$0</w:t>
+            </w:r>
+          </w:p>
+        </w:tc>
+        <w:tc>
+          <w:tcPr/>
+          <w:p>
+            <w:pPr>
+              <w:pStyle w:val="Compact"/>
+            </w:pPr>
+            <w:r>
+              <w:t xml:space="preserve">Internal tool. Share access via service account.</w:t>
+            </w:r>
+          </w:p>
+        </w:tc>
+      </w:tr>
+      <w:tr>
+        <w:tc>
+          <w:tcPr/>
+          <w:p>
+            <w:pPr>
+              <w:pStyle w:val="Compact"/>
+            </w:pPr>
+            <w:r>
+              <w:t xml:space="preserve">Google Search Console</w:t>
+            </w:r>
+          </w:p>
+        </w:tc>
+        <w:tc>
+          <w:tcPr/>
+          <w:p>
+            <w:pPr>
+              <w:pStyle w:val="Compact"/>
+            </w:pPr>
+            <w:r>
+              <w:t xml:space="preserve">Free</w:t>
+            </w:r>
+          </w:p>
+        </w:tc>
+        <w:tc>
+          <w:tcPr/>
+          <w:p>
+            <w:pPr>
+              <w:pStyle w:val="Compact"/>
+            </w:pPr>
+            <w:r>
+              <w:t xml:space="preserve">$0</w:t>
+            </w:r>
+          </w:p>
+        </w:tc>
+        <w:tc>
+          <w:tcPr/>
+          <w:p>
+            <w:pPr>
+              <w:pStyle w:val="Compact"/>
+            </w:pPr>
+            <w:r>
+              <w:t xml:space="preserve">Internal tool.</w:t>
+            </w:r>
+          </w:p>
+        </w:tc>
+      </w:tr>
+      <w:tr>
+        <w:tc>
+          <w:tcPr/>
+          <w:p>
+            <w:pPr>
+              <w:pStyle w:val="Compact"/>
+            </w:pPr>
+            <w:r>
+              <w:t xml:space="preserve">Google Ads / Meta Ads</w:t>
+            </w:r>
+          </w:p>
+        </w:tc>
+        <w:tc>
+          <w:tcPr/>
+          <w:p>
+            <w:pPr>
+              <w:pStyle w:val="Compact"/>
+            </w:pPr>
+            <w:r>
+              <w:t xml:space="preserve">Free to read</w:t>
+            </w:r>
+          </w:p>
+        </w:tc>
+        <w:tc>
+          <w:tcPr/>
+          <w:p>
+            <w:pPr>
+              <w:pStyle w:val="Compact"/>
+            </w:pPr>
+            <w:r>
+              <w:t xml:space="preserve">$0</w:t>
+            </w:r>
+          </w:p>
+        </w:tc>
+        <w:tc>
+          <w:tcPr/>
+          <w:p>
+            <w:pPr>
+              <w:pStyle w:val="Compact"/>
+            </w:pPr>
+            <w:r>
+              <w:t xml:space="preserve">Internal tool. Read-only access.</w:t>
+            </w:r>
+          </w:p>
+        </w:tc>
+      </w:tr>
+      <w:tr>
+        <w:tc>
+          <w:tcPr/>
+          <w:p>
+            <w:pPr>
+              <w:pStyle w:val="Compact"/>
+            </w:pPr>
+            <w:r>
+              <w:t xml:space="preserve">Google Merchant Center</w:t>
+            </w:r>
+          </w:p>
+        </w:tc>
+        <w:tc>
+          <w:tcPr/>
+          <w:p>
+            <w:pPr>
+              <w:pStyle w:val="Compact"/>
+            </w:pPr>
+            <w:r>
+              <w:t xml:space="preserve">Free to read</w:t>
+            </w:r>
+          </w:p>
+        </w:tc>
+        <w:tc>
+          <w:tcPr/>
+          <w:p>
+            <w:pPr>
+              <w:pStyle w:val="Compact"/>
+            </w:pPr>
+            <w:r>
+              <w:t xml:space="preserve">$0</w:t>
+            </w:r>
+          </w:p>
+        </w:tc>
+        <w:tc>
+          <w:tcPr/>
+          <w:p>
+            <w:pPr>
+              <w:pStyle w:val="Compact"/>
+            </w:pPr>
+            <w:r>
+              <w:t xml:space="preserve">Internal tool.</w:t>
+            </w:r>
+          </w:p>
+        </w:tc>
+      </w:tr>
+      <w:tr>
+        <w:tc>
+          <w:tcPr/>
+          <w:p>
+            <w:pPr>
+              <w:pStyle w:val="Compact"/>
+            </w:pPr>
+            <w:r>
+              <w:t xml:space="preserve">Shopify Admin</w:t>
+            </w:r>
+          </w:p>
+        </w:tc>
+        <w:tc>
+          <w:tcPr/>
+          <w:p>
+            <w:pPr>
+              <w:pStyle w:val="Compact"/>
+            </w:pPr>
+            <w:r>
+              <w:t xml:space="preserve">Included in your Shopify plan</w:t>
+            </w:r>
+          </w:p>
+        </w:tc>
+        <w:tc>
+          <w:tcPr/>
+          <w:p>
+            <w:pPr>
+              <w:pStyle w:val="Compact"/>
+            </w:pPr>
+            <w:r>
+              <w:t xml:space="preserve">$0</w:t>
+            </w:r>
+          </w:p>
+        </w:tc>
+        <w:tc>
+          <w:tcPr/>
+          <w:p>
+            <w:pPr>
+              <w:pStyle w:val="Compact"/>
+            </w:pPr>
+            <w:r>
+              <w:t xml:space="preserve">Internal tool. Custom-app token, read scopes.</w:t>
+            </w:r>
+          </w:p>
+        </w:tc>
+      </w:tr>
+      <w:tr>
+        <w:tc>
+          <w:tcPr/>
+          <w:p>
+            <w:pPr>
+              <w:pStyle w:val="Compact"/>
+            </w:pPr>
+            <w:r>
+              <w:t xml:space="preserve">Klaviyo or Brevo</w:t>
+            </w:r>
+          </w:p>
+        </w:tc>
+        <w:tc>
+          <w:tcPr/>
+          <w:p>
+            <w:pPr>
+              <w:pStyle w:val="Compact"/>
+            </w:pPr>
+            <w:r>
+              <w:t xml:space="preserve">Included in your existing plan</w:t>
+            </w:r>
+          </w:p>
+        </w:tc>
+        <w:tc>
+          <w:tcPr/>
+          <w:p>
+            <w:pPr>
+              <w:pStyle w:val="Compact"/>
+            </w:pPr>
+            <w:r>
+              <w:t xml:space="preserve">$0</w:t>
+            </w:r>
+          </w:p>
+        </w:tc>
+        <w:tc>
+          <w:tcPr/>
+          <w:p>
+            <w:pPr>
+              <w:pStyle w:val="Compact"/>
+            </w:pPr>
+            <w:r>
+              <w:t xml:space="preserve">Internal tool. Read-only API key.</w:t>
+            </w:r>
+          </w:p>
+        </w:tc>
+      </w:tr>
+      <w:tr>
+        <w:tc>
+          <w:tcPr/>
+          <w:p>
+            <w:pPr>
+              <w:pStyle w:val="Compact"/>
+            </w:pPr>
+            <w:r>
+              <w:t xml:space="preserve">Microsoft Clarity</w:t>
+            </w:r>
+          </w:p>
+        </w:tc>
+        <w:tc>
+          <w:tcPr/>
+          <w:p>
+            <w:pPr>
+              <w:pStyle w:val="Compact"/>
+            </w:pPr>
+            <w:r>
+              <w:t xml:space="preserve">Free</w:t>
+            </w:r>
+          </w:p>
+        </w:tc>
+        <w:tc>
+          <w:tcPr/>
+          <w:p>
+            <w:pPr>
+              <w:pStyle w:val="Compact"/>
+            </w:pPr>
+            <w:r>
+              <w:t xml:space="preserve">$0</w:t>
+            </w:r>
+          </w:p>
+        </w:tc>
+        <w:tc>
+          <w:tcPr/>
+          <w:p>
+            <w:pPr>
+              <w:pStyle w:val="Compact"/>
+            </w:pPr>
+            <w:r>
+              <w:t xml:space="preserve">Internal tool. Free project token.</w:t>
+            </w:r>
+          </w:p>
+        </w:tc>
+      </w:tr>
+    </w:tbl>
     <w:p>
       <w:pPr>
         <w:pStyle w:val="BodyText"/>
-      </w:pPr>
-      <w:r>
-        <w:t xml:space="preserve">Minimum recommended</w:t>
-      </w:r>
-      <w:r>
-        <w:t xml:space="preserve"> </w:t>
-      </w:r>
-      <w:r>
-        <w:rPr>
-          <w:rStyle w:val="VerbatimChar"/>
-        </w:rPr>
-        <w:t xml:space="preserve">.env</w:t>
-      </w:r>
-      <w:r>
-        <w:t xml:space="preserve"> </w:t>
-      </w:r>
-      <w:r>
-        <w:t xml:space="preserve">if you want to set up ahead of time:</w:t>
-      </w:r>
-    </w:p>
-    <w:p>
-      <w:pPr>
-        <w:pStyle w:val="SourceCode"/>
-      </w:pPr>
-      <w:r>
-        <w:rPr>
-          <w:rStyle w:val="VerbatimChar"/>
-        </w:rPr>
-        <w:t xml:space="preserve">DATAFORSEO_LOGIN=your_login</w:t>
-      </w:r>
-      <w:r>
-        <w:br/>
-      </w:r>
-      <w:r>
-        <w:rPr>
-          <w:rStyle w:val="VerbatimChar"/>
-        </w:rPr>
-        <w:t xml:space="preserve">DATAFORSEO_PASSWORD=your_password</w:t>
-      </w:r>
-      <w:r>
-        <w:br/>
-      </w:r>
-      <w:r>
-        <w:rPr>
-          <w:rStyle w:val="VerbatimChar"/>
-        </w:rPr>
-        <w:t xml:space="preserve">DATAFORSEO_AUTH_BASE64=your_base64_auth</w:t>
-      </w:r>
-      <w:r>
-        <w:br/>
-      </w:r>
-      <w:r>
-        <w:rPr>
-          <w:rStyle w:val="VerbatimChar"/>
-        </w:rPr>
-        <w:t xml:space="preserve">SERPER_API_KEY=your_key</w:t>
-      </w:r>
-      <w:r>
-        <w:br/>
-      </w:r>
-      <w:r>
-        <w:rPr>
-          <w:rStyle w:val="VerbatimChar"/>
-        </w:rPr>
-        <w:t xml:space="preserve">KEYWORDS_EVERYWHERE_API_KEY=your_key</w:t>
-      </w:r>
-      <w:r>
-        <w:br/>
-      </w:r>
-      <w:r>
-        <w:rPr>
-          <w:rStyle w:val="VerbatimChar"/>
-        </w:rPr>
-        <w:t xml:space="preserve">GOOGLE_AI_KEY=your_google_cloud_api_key_for_pagespeed</w:t>
-      </w:r>
-      <w:r>
-        <w:br/>
-      </w:r>
-      <w:r>
-        <w:rPr>
-          <w:rStyle w:val="VerbatimChar"/>
-        </w:rPr>
-        <w:t xml:space="preserve">AHREFS_API_KEY=your_key_if_you_have_one</w:t>
-      </w:r>
-    </w:p>
-    <w:p>
-      <w:pPr>
-        <w:pStyle w:val="FirstParagraph"/>
       </w:pPr>
       <w:r>
         <w:rPr>
           <w:b/>
           <w:bCs/>
         </w:rPr>
+        <w:t xml:space="preserve">Typical total cost per full audit run: $2 to $15</w:t>
+      </w:r>
+      <w:r>
+        <w:t xml:space="preserve"> </w:t>
+      </w:r>
+      <w:r>
+        <w:t xml:space="preserve">across the paid external tools.</w:t>
+      </w:r>
+    </w:p>
+    <w:p>
+      <w:pPr>
+        <w:pStyle w:val="BodyText"/>
+      </w:pPr>
+      <w:r>
+        <w:t xml:space="preserve">Numbers above are approximate as of April 2026. Pricing changes. When you run the master prompt, Claude will print the credential inventory and offer to look up current sign-up steps and pricing for any tool you’re missing, straight from the web.</w:t>
+      </w:r>
+    </w:p>
+    <w:bookmarkEnd w:id="17"/>
+    <w:bookmarkStart w:id="18" w:name="step-1-create-the-project-folder"/>
+    <w:p>
+      <w:pPr>
+        <w:pStyle w:val="Heading3"/>
+      </w:pPr>
+      <w:r>
+        <w:rPr>
+          <w:rStyle w:val="SectionNumber"/>
+        </w:rPr>
+        <w:t xml:space="preserve">1.4.3</w:t>
+      </w:r>
+      <w:r>
+        <w:tab/>
+      </w:r>
+      <w:r>
+        <w:t xml:space="preserve">Step 1: Create the project folder</w:t>
+      </w:r>
+    </w:p>
+    <w:p>
+      <w:pPr>
+        <w:pStyle w:val="SourceCode"/>
+      </w:pPr>
+      <w:r>
+        <w:rPr>
+          <w:rStyle w:val="FunctionTok"/>
+        </w:rPr>
+        <w:t xml:space="preserve">mkdir</w:t>
+      </w:r>
+      <w:r>
+        <w:rPr>
+          <w:rStyle w:val="NormalTok"/>
+        </w:rPr>
+        <w:t xml:space="preserve"> my-brand-audit </w:t>
+      </w:r>
+      <w:r>
+        <w:rPr>
+          <w:rStyle w:val="KeywordTok"/>
+        </w:rPr>
+        <w:t xml:space="preserve">&amp;&amp;</w:t>
+      </w:r>
+      <w:r>
+        <w:rPr>
+          <w:rStyle w:val="NormalTok"/>
+        </w:rPr>
+        <w:t xml:space="preserve"> </w:t>
+      </w:r>
+      <w:r>
+        <w:rPr>
+          <w:rStyle w:val="BuiltInTok"/>
+        </w:rPr>
+        <w:t xml:space="preserve">cd</w:t>
+      </w:r>
+      <w:r>
+        <w:rPr>
+          <w:rStyle w:val="NormalTok"/>
+        </w:rPr>
+        <w:t xml:space="preserve"> my-brand-audit</w:t>
+      </w:r>
+    </w:p>
+    <w:p>
+      <w:pPr>
+        <w:pStyle w:val="FirstParagraph"/>
+      </w:pPr>
+      <w:r>
+        <w:t xml:space="preserve">Drop the three files from this bundle (CLAUDE.md, gtm-audit.md, README.md) into the folder.</w:t>
+      </w:r>
+    </w:p>
+    <w:bookmarkEnd w:id="18"/>
+    <w:bookmarkStart w:id="20" w:name="Xcb368a2042c4e7e90b8e53bd43dc508cb93effb"/>
+    <w:p>
+      <w:pPr>
+        <w:pStyle w:val="Heading3"/>
+      </w:pPr>
+      <w:r>
+        <w:rPr>
+          <w:rStyle w:val="SectionNumber"/>
+        </w:rPr>
+        <w:t xml:space="preserve">1.4.4</w:t>
+      </w:r>
+      <w:r>
+        <w:tab/>
+      </w:r>
+      <w:r>
+        <w:t xml:space="preserve">Step 2: Set up your .env (optional: let Claude walk you through)</w:t>
+      </w:r>
+    </w:p>
+    <w:p>
+      <w:pPr>
+        <w:pStyle w:val="FirstParagraph"/>
+      </w:pPr>
+      <w:r>
+        <w:t xml:space="preserve">Create a</w:t>
+      </w:r>
+      <w:r>
+        <w:t xml:space="preserve"> </w:t>
+      </w:r>
+      <w:r>
+        <w:rPr>
+          <w:rStyle w:val="VerbatimChar"/>
+        </w:rPr>
+        <w:t xml:space="preserve">.env</w:t>
+      </w:r>
+      <w:r>
+        <w:t xml:space="preserve"> </w:t>
+      </w:r>
+      <w:r>
+        <w:t xml:space="preserve">file in the project folder. Add the API keys you have. If you’re missing any, that’s fine: when you run the master prompt in Step 5, Claude will print which tools are configured and which are missing, and offer to look up the current sign-up steps for each missing one. You can wire tools up on first run without leaving the terminal.</w:t>
+      </w:r>
+    </w:p>
+    <w:p>
+      <w:pPr>
+        <w:pStyle w:val="BodyText"/>
+      </w:pPr>
+      <w:r>
+        <w:t xml:space="preserve">Minimum recommended</w:t>
+      </w:r>
+      <w:r>
+        <w:t xml:space="preserve"> </w:t>
+      </w:r>
+      <w:r>
+        <w:rPr>
+          <w:rStyle w:val="VerbatimChar"/>
+        </w:rPr>
+        <w:t xml:space="preserve">.env</w:t>
+      </w:r>
+      <w:r>
+        <w:t xml:space="preserve"> </w:t>
+      </w:r>
+      <w:r>
+        <w:t xml:space="preserve">if you want to set up ahead of time:</w:t>
+      </w:r>
+    </w:p>
+    <w:p>
+      <w:pPr>
+        <w:pStyle w:val="SourceCode"/>
+      </w:pPr>
+      <w:r>
+        <w:rPr>
+          <w:rStyle w:val="VerbatimChar"/>
+        </w:rPr>
+        <w:t xml:space="preserve">DATAFORSEO_LOGIN=your_login</w:t>
+      </w:r>
+      <w:r>
+        <w:br/>
+      </w:r>
+      <w:r>
+        <w:rPr>
+          <w:rStyle w:val="VerbatimChar"/>
+        </w:rPr>
+        <w:t xml:space="preserve">DATAFORSEO_PASSWORD=your_password</w:t>
+      </w:r>
+      <w:r>
+        <w:br/>
+      </w:r>
+      <w:r>
+        <w:rPr>
+          <w:rStyle w:val="VerbatimChar"/>
+        </w:rPr>
+        <w:t xml:space="preserve">DATAFORSEO_AUTH_BASE64=your_base64_auth</w:t>
+      </w:r>
+      <w:r>
+        <w:br/>
+      </w:r>
+      <w:r>
+        <w:rPr>
+          <w:rStyle w:val="VerbatimChar"/>
+        </w:rPr>
+        <w:t xml:space="preserve">SERPER_API_KEY=your_key</w:t>
+      </w:r>
+      <w:r>
+        <w:br/>
+      </w:r>
+      <w:r>
+        <w:rPr>
+          <w:rStyle w:val="VerbatimChar"/>
+        </w:rPr>
+        <w:t xml:space="preserve">KEYWORDS_EVERYWHERE_API_KEY=your_key</w:t>
+      </w:r>
+      <w:r>
+        <w:br/>
+      </w:r>
+      <w:r>
+        <w:rPr>
+          <w:rStyle w:val="VerbatimChar"/>
+        </w:rPr>
+        <w:t xml:space="preserve">GOOGLE_AI_KEY=your_google_cloud_api_key_for_pagespeed</w:t>
+      </w:r>
+      <w:r>
+        <w:br/>
+      </w:r>
+      <w:r>
+        <w:rPr>
+          <w:rStyle w:val="VerbatimChar"/>
+        </w:rPr>
+        <w:t xml:space="preserve">AHREFS_API_KEY=your_key_if_you_have_one</w:t>
+      </w:r>
+    </w:p>
+    <w:p>
+      <w:pPr>
+        <w:pStyle w:val="FirstParagraph"/>
+      </w:pPr>
+      <w:r>
+        <w:rPr>
+          <w:b/>
+          <w:bCs/>
+        </w:rPr>
         <w:t xml:space="preserve">Gotcha I hit:</w:t>
       </w:r>
       <w:r>
@@ -794,7 +1475,7 @@
       <w:r>
         <w:t xml:space="preserve"> </w:t>
       </w:r>
-      <w:hyperlink r:id="rId18">
+      <w:hyperlink r:id="rId19">
         <w:r>
           <w:rPr>
             <w:rStyle w:val="Hyperlink"/>
@@ -884,8 +1565,8 @@
         <w:t xml:space="preserve">before your first commit.</w:t>
       </w:r>
     </w:p>
-    <w:bookmarkEnd w:id="19"/>
-    <w:bookmarkStart w:id="20" w:name="Xfd27a84db74deb94109549c423df99f37315a33"/>
+    <w:bookmarkEnd w:id="20"/>
+    <w:bookmarkStart w:id="21" w:name="Xfd27a84db74deb94109549c423df99f37315a33"/>
     <w:p>
       <w:pPr>
         <w:pStyle w:val="Heading3"/>
@@ -894,7 +1575,7 @@
         <w:rPr>
           <w:rStyle w:val="SectionNumber"/>
         </w:rPr>
-        <w:t xml:space="preserve">1.4.4</w:t>
+        <w:t xml:space="preserve">1.4.5</w:t>
       </w:r>
       <w:r>
         <w:tab/>
@@ -1033,8 +1714,8 @@
         <w:t xml:space="preserve">However you populate it, the three-to-five competitor URLs are load-bearing. The audit auto-pulls competitor keyword data via DataForSEO in Section 3. Without competitor URLs Claude has to auto-discover them from the SERPs, which usually works but your hand-picked list is always sharper.</w:t>
       </w:r>
     </w:p>
-    <w:bookmarkEnd w:id="20"/>
-    <w:bookmarkStart w:id="21" w:name="step-4-open-claude-code-in-the-folder"/>
+    <w:bookmarkEnd w:id="21"/>
+    <w:bookmarkStart w:id="22" w:name="step-4-open-claude-code-in-the-folder"/>
     <w:p>
       <w:pPr>
         <w:pStyle w:val="Heading3"/>
@@ -1043,7 +1724,7 @@
         <w:rPr>
           <w:rStyle w:val="SectionNumber"/>
         </w:rPr>
-        <w:t xml:space="preserve">1.4.5</w:t>
+        <w:t xml:space="preserve">1.4.6</w:t>
       </w:r>
       <w:r>
         <w:tab/>
@@ -1105,9 +1786,9 @@
         </w:pict>
       </w:r>
     </w:p>
-    <w:bookmarkEnd w:id="21"/>
     <w:bookmarkEnd w:id="22"/>
-    <w:bookmarkStart w:id="26" w:name="the-three-files-in-this-bundle"/>
+    <w:bookmarkEnd w:id="23"/>
+    <w:bookmarkStart w:id="27" w:name="the-three-files-in-this-bundle"/>
     <w:p>
       <w:pPr>
         <w:pStyle w:val="Heading2"/>
@@ -1125,7 +1806,7 @@
         <w:t xml:space="preserve">The Three Files in This Bundle</w:t>
       </w:r>
     </w:p>
-    <w:bookmarkStart w:id="23" w:name="Xc890e52cf3abe4f1818b403252832aa721cc8ce"/>
+    <w:bookmarkStart w:id="24" w:name="Xc890e52cf3abe4f1818b403252832aa721cc8ce"/>
     <w:p>
       <w:pPr>
         <w:pStyle w:val="Heading3"/>
@@ -1211,8 +1892,8 @@
         <w:t xml:space="preserve">with your specifics. Keep it tight, one to two sentences per field beats a paragraph. Founder voice beats marketing copy.</w:t>
       </w:r>
     </w:p>
-    <w:bookmarkEnd w:id="23"/>
-    <w:bookmarkStart w:id="24" w:name="X7c60c6c4885b1dc6ef6cb2de83582875ff4db68"/>
+    <w:bookmarkEnd w:id="24"/>
+    <w:bookmarkStart w:id="25" w:name="X7c60c6c4885b1dc6ef6cb2de83582875ff4db68"/>
     <w:p>
       <w:pPr>
         <w:pStyle w:val="Heading3"/>
@@ -1283,8 +1964,8 @@
         <w:t xml:space="preserve">Paste its entire contents into Claude Code and hit enter. Don’t edit it unless you know what you’re doing, the structure is load-bearing.</w:t>
       </w:r>
     </w:p>
-    <w:bookmarkEnd w:id="24"/>
-    <w:bookmarkStart w:id="25" w:name="file-3-readme.md"/>
+    <w:bookmarkEnd w:id="25"/>
+    <w:bookmarkStart w:id="26" w:name="file-3-readme.md"/>
     <w:p>
       <w:pPr>
         <w:pStyle w:val="Heading3"/>
@@ -1346,9 +2027,9 @@
         </w:pict>
       </w:r>
     </w:p>
-    <w:bookmarkEnd w:id="25"/>
     <w:bookmarkEnd w:id="26"/>
-    <w:bookmarkStart w:id="27" w:name="your-first-run"/>
+    <w:bookmarkEnd w:id="27"/>
+    <w:bookmarkStart w:id="28" w:name="your-first-run"/>
     <w:p>
       <w:pPr>
         <w:pStyle w:val="Heading2"/>
@@ -1571,8 +2252,8 @@
         </w:pict>
       </w:r>
     </w:p>
-    <w:bookmarkEnd w:id="27"/>
-    <w:bookmarkStart w:id="28" w:name="what-youll-get"/>
+    <w:bookmarkEnd w:id="28"/>
+    <w:bookmarkStart w:id="29" w:name="what-youll-get"/>
     <w:p>
       <w:pPr>
         <w:pStyle w:val="Heading2"/>
@@ -1873,8 +2554,8 @@
         </w:pict>
       </w:r>
     </w:p>
-    <w:bookmarkEnd w:id="28"/>
-    <w:bookmarkStart w:id="29" w:name="modes"/>
+    <w:bookmarkEnd w:id="29"/>
+    <w:bookmarkStart w:id="30" w:name="modes"/>
     <w:p>
       <w:pPr>
         <w:pStyle w:val="Heading2"/>
@@ -2133,8 +2814,8 @@
         </w:pict>
       </w:r>
     </w:p>
-    <w:bookmarkEnd w:id="29"/>
-    <w:bookmarkStart w:id="30" w:name="honest-caveats"/>
+    <w:bookmarkEnd w:id="30"/>
+    <w:bookmarkStart w:id="31" w:name="honest-caveats"/>
     <w:p>
       <w:pPr>
         <w:pStyle w:val="Heading2"/>
@@ -2263,19 +2944,7 @@
         <w:t xml:space="preserve"> </w:t>
       </w:r>
       <w:r>
-        <w:t xml:space="preserve">A typical full run costs under $10 in DataForSEO credits plus a few cents of Serper. Budget $15 per run to be safe. Keywords Everywhere has a generous free tier and Ahrefs is optional. PageSpeed Insights is free under quota with a valid</w:t>
-      </w:r>
-      <w:r>
-        <w:t xml:space="preserve"> </w:t>
-      </w:r>
-      <w:r>
-        <w:rPr>
-          <w:rStyle w:val="VerbatimChar"/>
-        </w:rPr>
-        <w:t xml:space="preserve">GOOGLE_AI_KEY</w:t>
-      </w:r>
-      <w:r>
-        <w:t xml:space="preserve">.</w:t>
+        <w:t xml:space="preserve">A typical full run costs $2 to $15 across the paid external tools. Full breakdown in the Cost overview table in the Setup section.</w:t>
       </w:r>
     </w:p>
     <w:p>
@@ -2303,8 +2972,8 @@
         </w:pict>
       </w:r>
     </w:p>
-    <w:bookmarkEnd w:id="30"/>
-    <w:bookmarkStart w:id="31" w:name="quick-start-checklist"/>
+    <w:bookmarkEnd w:id="31"/>
+    <w:bookmarkStart w:id="32" w:name="quick-start-checklist"/>
     <w:p>
       <w:pPr>
         <w:pStyle w:val="Heading2"/>
@@ -2642,8 +3311,8 @@
         </w:pict>
       </w:r>
     </w:p>
-    <w:bookmarkEnd w:id="31"/>
-    <w:bookmarkStart w:id="32" w:name="troubleshooting"/>
+    <w:bookmarkEnd w:id="32"/>
+    <w:bookmarkStart w:id="33" w:name="troubleshooting"/>
     <w:p>
       <w:pPr>
         <w:pStyle w:val="Heading2"/>
@@ -2997,8 +3666,8 @@
         </w:pict>
       </w:r>
     </w:p>
-    <w:bookmarkEnd w:id="32"/>
-    <w:bookmarkStart w:id="35" w:name="credit"/>
+    <w:bookmarkEnd w:id="33"/>
+    <w:bookmarkStart w:id="36" w:name="credit"/>
     <w:p>
       <w:pPr>
         <w:pStyle w:val="Heading2"/>
@@ -3045,7 +3714,7 @@
       <w:r>
         <w:t xml:space="preserve"> </w:t>
       </w:r>
-      <w:hyperlink r:id="rId33">
+      <w:hyperlink r:id="rId34">
         <w:r>
           <w:rPr>
             <w:rStyle w:val="Hyperlink"/>
@@ -3127,7 +3796,7 @@
       <w:r>
         <w:t xml:space="preserve"> </w:t>
       </w:r>
-      <w:hyperlink r:id="rId34">
+      <w:hyperlink r:id="rId35">
         <w:r>
           <w:rPr>
             <w:rStyle w:val="Hyperlink"/>
@@ -3152,9 +3821,9 @@
         <w:t xml:space="preserve">================================================================================</w:t>
       </w:r>
     </w:p>
-    <w:bookmarkEnd w:id="35"/>
     <w:bookmarkEnd w:id="36"/>
-    <w:bookmarkStart w:id="37" w:name="X527a1c952b73df6849f10da3ff4461cc53fe709"/>
+    <w:bookmarkEnd w:id="37"/>
+    <w:bookmarkStart w:id="38" w:name="X527a1c952b73df6849f10da3ff4461cc53fe709"/>
     <w:p>
       <w:pPr>
         <w:pStyle w:val="Heading1"/>
@@ -4210,8 +4879,8 @@
         <w:t xml:space="preserve">================================================================================</w:t>
       </w:r>
     </w:p>
-    <w:bookmarkEnd w:id="37"/>
-    <w:bookmarkStart w:id="45" w:name="X4e7d28ab2fdd2b5e27aced169d72f72ff40f684"/>
+    <w:bookmarkEnd w:id="38"/>
+    <w:bookmarkStart w:id="46" w:name="X4e7d28ab2fdd2b5e27aced169d72f72ff40f684"/>
     <w:p>
       <w:pPr>
         <w:pStyle w:val="Heading1"/>
@@ -5445,7 +6114,7 @@
         <w:t xml:space="preserve">Internal-heavy. If Klaviyo or Brevo is not configured, render the stub:</w:t>
       </w:r>
     </w:p>
-    <w:bookmarkStart w:id="38" w:name="email-lifecycle-and-crm"/>
+    <w:bookmarkStart w:id="39" w:name="email-lifecycle-and-crm"/>
     <w:p>
       <w:pPr>
         <w:pStyle w:val="Heading2"/>
@@ -5826,8 +6495,8 @@
         <w:t xml:space="preserve">### Audience Insights prompt (inlined for Section 1)</w:t>
       </w:r>
     </w:p>
-    <w:bookmarkEnd w:id="38"/>
-    <w:bookmarkStart w:id="39" w:name="role"/>
+    <w:bookmarkEnd w:id="39"/>
+    <w:bookmarkStart w:id="40" w:name="role"/>
     <w:p>
       <w:pPr>
         <w:pStyle w:val="Heading2"/>
@@ -5865,8 +6534,8 @@
         <w:t xml:space="preserve">founder reviews in under 5 minutes and approves or redirects section by section.</w:t>
       </w:r>
     </w:p>
-    <w:bookmarkEnd w:id="39"/>
-    <w:bookmarkStart w:id="40" w:name="inputs-required-refuse-if-any-missing"/>
+    <w:bookmarkEnd w:id="40"/>
+    <w:bookmarkStart w:id="41" w:name="inputs-required-refuse-if-any-missing"/>
     <w:p>
       <w:pPr>
         <w:pStyle w:val="Heading2"/>
@@ -5934,8 +6603,8 @@
         <w:t xml:space="preserve">“Unable to proceed without audience, struggle, and product.”</w:t>
       </w:r>
     </w:p>
-    <w:bookmarkEnd w:id="40"/>
-    <w:bookmarkStart w:id="41" w:name="research-method"/>
+    <w:bookmarkEnd w:id="41"/>
+    <w:bookmarkStart w:id="42" w:name="research-method"/>
     <w:p>
       <w:pPr>
         <w:pStyle w:val="Heading2"/>
@@ -6031,8 +6700,8 @@
         <w:t xml:space="preserve">recurs across multiple quotes.</w:t>
       </w:r>
     </w:p>
-    <w:bookmarkEnd w:id="41"/>
-    <w:bookmarkStart w:id="42" w:name="deliverable-the-one-pager"/>
+    <w:bookmarkEnd w:id="42"/>
+    <w:bookmarkStart w:id="43" w:name="deliverable-the-one-pager"/>
     <w:p>
       <w:pPr>
         <w:pStyle w:val="Heading2"/>
@@ -6220,8 +6889,8 @@
         <w:t xml:space="preserve">buying.</w:t>
       </w:r>
     </w:p>
-    <w:bookmarkEnd w:id="42"/>
-    <w:bookmarkStart w:id="43" w:name="appendix-verbatim-quotes-15"/>
+    <w:bookmarkEnd w:id="43"/>
+    <w:bookmarkStart w:id="44" w:name="appendix-verbatim-quotes-15"/>
     <w:p>
       <w:pPr>
         <w:pStyle w:val="Heading2"/>
@@ -6262,8 +6931,8 @@
         <w:t xml:space="preserve">Save to data/gtm-audit/{YYYY-MM-DD}/audience-voc-mining.md</w:t>
       </w:r>
     </w:p>
-    <w:bookmarkEnd w:id="43"/>
-    <w:bookmarkStart w:id="44" w:name="rules"/>
+    <w:bookmarkEnd w:id="44"/>
+    <w:bookmarkStart w:id="45" w:name="rules"/>
     <w:p>
       <w:pPr>
         <w:pStyle w:val="Heading2"/>
@@ -6823,9 +7492,9 @@
         <w:t xml:space="preserve">Report structure (fixed order):</w:t>
       </w:r>
     </w:p>
-    <w:bookmarkEnd w:id="44"/>
     <w:bookmarkEnd w:id="45"/>
-    <w:bookmarkStart w:id="67" w:name="gtm-audit-brand-name-yyyy-mm-dd"/>
+    <w:bookmarkEnd w:id="46"/>
+    <w:bookmarkStart w:id="68" w:name="gtm-audit-brand-name-yyyy-mm-dd"/>
     <w:p>
       <w:pPr>
         <w:pStyle w:val="Heading1"/>
@@ -6857,7 +7526,7 @@
         <w:t xml:space="preserve">Access level: {External only / External + Internal}</w:t>
       </w:r>
     </w:p>
-    <w:bookmarkStart w:id="46" w:name="executive-summary"/>
+    <w:bookmarkStart w:id="47" w:name="executive-summary"/>
     <w:p>
       <w:pPr>
         <w:pStyle w:val="Heading2"/>
@@ -6883,8 +7552,8 @@
         <w:t xml:space="preserve">(3-4 sentences leading with the narrative)</w:t>
       </w:r>
     </w:p>
-    <w:bookmarkEnd w:id="46"/>
-    <w:bookmarkStart w:id="47" w:name="cross-cutting-themes"/>
+    <w:bookmarkEnd w:id="47"/>
+    <w:bookmarkStart w:id="48" w:name="cross-cutting-themes"/>
     <w:p>
       <w:pPr>
         <w:pStyle w:val="Heading2"/>
@@ -6910,8 +7579,8 @@
         <w:t xml:space="preserve">(3-5 synthesis bullets from Step 5)</w:t>
       </w:r>
     </w:p>
-    <w:bookmarkEnd w:id="47"/>
-    <w:bookmarkStart w:id="48" w:name="key-findings"/>
+    <w:bookmarkEnd w:id="48"/>
+    <w:bookmarkStart w:id="49" w:name="key-findings"/>
     <w:p>
       <w:pPr>
         <w:pStyle w:val="Heading2"/>
@@ -6937,8 +7606,8 @@
         <w:t xml:space="preserve">(5-7 one-line bullets across sections)</w:t>
       </w:r>
     </w:p>
-    <w:bookmarkEnd w:id="48"/>
-    <w:bookmarkStart w:id="49" w:name="key-action-items-top-5-this-week"/>
+    <w:bookmarkEnd w:id="49"/>
+    <w:bookmarkStart w:id="50" w:name="key-action-items-top-5-this-week"/>
     <w:p>
       <w:pPr>
         <w:pStyle w:val="Heading2"/>
@@ -6973,8 +7642,8 @@
         <w:t xml:space="preserve">)</w:t>
       </w:r>
     </w:p>
-    <w:bookmarkEnd w:id="49"/>
-    <w:bookmarkStart w:id="50" w:name="audience"/>
+    <w:bookmarkEnd w:id="50"/>
+    <w:bookmarkStart w:id="51" w:name="audience"/>
     <w:p>
       <w:pPr>
         <w:pStyle w:val="Heading2"/>
@@ -6992,8 +7661,8 @@
         <w:t xml:space="preserve">1. Audience</w:t>
       </w:r>
     </w:p>
-    <w:bookmarkEnd w:id="50"/>
-    <w:bookmarkStart w:id="51" w:name="vision"/>
+    <w:bookmarkEnd w:id="51"/>
+    <w:bookmarkStart w:id="52" w:name="vision"/>
     <w:p>
       <w:pPr>
         <w:pStyle w:val="Heading2"/>
@@ -7011,8 +7680,8 @@
         <w:t xml:space="preserve">2. Vision</w:t>
       </w:r>
     </w:p>
-    <w:bookmarkEnd w:id="51"/>
-    <w:bookmarkStart w:id="52" w:name="competitor-audit"/>
+    <w:bookmarkEnd w:id="52"/>
+    <w:bookmarkStart w:id="53" w:name="competitor-audit"/>
     <w:p>
       <w:pPr>
         <w:pStyle w:val="Heading2"/>
@@ -7030,8 +7699,8 @@
         <w:t xml:space="preserve">3. Competitor Audit</w:t>
       </w:r>
     </w:p>
-    <w:bookmarkEnd w:id="52"/>
-    <w:bookmarkStart w:id="53" w:name="seo"/>
+    <w:bookmarkEnd w:id="53"/>
+    <w:bookmarkStart w:id="54" w:name="seo"/>
     <w:p>
       <w:pPr>
         <w:pStyle w:val="Heading2"/>
@@ -7049,8 +7718,8 @@
         <w:t xml:space="preserve">4. SEO</w:t>
       </w:r>
     </w:p>
-    <w:bookmarkEnd w:id="53"/>
-    <w:bookmarkStart w:id="54" w:name="aeo"/>
+    <w:bookmarkEnd w:id="54"/>
+    <w:bookmarkStart w:id="55" w:name="aeo"/>
     <w:p>
       <w:pPr>
         <w:pStyle w:val="Heading2"/>
@@ -7068,8 +7737,8 @@
         <w:t xml:space="preserve">5. AEO</w:t>
       </w:r>
     </w:p>
-    <w:bookmarkEnd w:id="54"/>
-    <w:bookmarkStart w:id="55" w:name="paid-ad-recommendations"/>
+    <w:bookmarkEnd w:id="55"/>
+    <w:bookmarkStart w:id="56" w:name="paid-ad-recommendations"/>
     <w:p>
       <w:pPr>
         <w:pStyle w:val="Heading2"/>
@@ -7087,8 +7756,8 @@
         <w:t xml:space="preserve">6. Paid Ad Recommendations</w:t>
       </w:r>
     </w:p>
-    <w:bookmarkEnd w:id="55"/>
-    <w:bookmarkStart w:id="56" w:name="email-lifecycle-and-crm-1"/>
+    <w:bookmarkEnd w:id="56"/>
+    <w:bookmarkStart w:id="57" w:name="email-lifecycle-and-crm-1"/>
     <w:p>
       <w:pPr>
         <w:pStyle w:val="Heading2"/>
@@ -7106,8 +7775,8 @@
         <w:t xml:space="preserve">7. Email, Lifecycle, and CRM</w:t>
       </w:r>
     </w:p>
-    <w:bookmarkEnd w:id="56"/>
-    <w:bookmarkStart w:id="57" w:name="conversion-optimisation"/>
+    <w:bookmarkEnd w:id="57"/>
+    <w:bookmarkStart w:id="58" w:name="conversion-optimisation"/>
     <w:p>
       <w:pPr>
         <w:pStyle w:val="Heading2"/>
@@ -7125,8 +7794,8 @@
         <w:t xml:space="preserve">8. Conversion Optimisation</w:t>
       </w:r>
     </w:p>
-    <w:bookmarkEnd w:id="57"/>
-    <w:bookmarkStart w:id="58" w:name="analytics-and-tracking"/>
+    <w:bookmarkEnd w:id="58"/>
+    <w:bookmarkStart w:id="59" w:name="analytics-and-tracking"/>
     <w:p>
       <w:pPr>
         <w:pStyle w:val="Heading2"/>
@@ -7144,8 +7813,8 @@
         <w:t xml:space="preserve">9. Analytics and Tracking</w:t>
       </w:r>
     </w:p>
-    <w:bookmarkEnd w:id="58"/>
-    <w:bookmarkStart w:id="59" w:name="prioritised-action-items"/>
+    <w:bookmarkEnd w:id="59"/>
+    <w:bookmarkStart w:id="60" w:name="prioritised-action-items"/>
     <w:p>
       <w:pPr>
         <w:pStyle w:val="Heading2"/>
@@ -7163,8 +7832,8 @@
         <w:t xml:space="preserve">10. Prioritised Action Items</w:t>
       </w:r>
     </w:p>
-    <w:bookmarkEnd w:id="59"/>
-    <w:bookmarkStart w:id="60" w:name="access-grant-checklist"/>
+    <w:bookmarkEnd w:id="60"/>
+    <w:bookmarkStart w:id="61" w:name="access-grant-checklist"/>
     <w:p>
       <w:pPr>
         <w:pStyle w:val="Heading2"/>
@@ -7190,8 +7859,8 @@
         <w:t xml:space="preserve">(Only appears if any Internal-layer section is stubbed)</w:t>
       </w:r>
     </w:p>
-    <w:bookmarkEnd w:id="60"/>
-    <w:bookmarkStart w:id="61" w:name="conclusion"/>
+    <w:bookmarkEnd w:id="61"/>
+    <w:bookmarkStart w:id="62" w:name="conclusion"/>
     <w:p>
       <w:pPr>
         <w:pStyle w:val="Heading2"/>
@@ -7359,8 +8028,8 @@
         </w:pict>
       </w:r>
     </w:p>
-    <w:bookmarkEnd w:id="61"/>
-    <w:bookmarkStart w:id="62" w:name="step-8.-merge-into-actions.md"/>
+    <w:bookmarkEnd w:id="62"/>
+    <w:bookmarkStart w:id="63" w:name="step-8.-merge-into-actions.md"/>
     <w:p>
       <w:pPr>
         <w:pStyle w:val="Heading2"/>
@@ -7420,8 +8089,8 @@
         </w:pict>
       </w:r>
     </w:p>
-    <w:bookmarkEnd w:id="62"/>
-    <w:bookmarkStart w:id="63" w:name="step-9.-commit-optional"/>
+    <w:bookmarkEnd w:id="63"/>
+    <w:bookmarkStart w:id="64" w:name="step-9.-commit-optional"/>
     <w:p>
       <w:pPr>
         <w:pStyle w:val="Heading2"/>
@@ -7465,8 +8134,8 @@
         </w:pict>
       </w:r>
     </w:p>
-    <w:bookmarkEnd w:id="63"/>
-    <w:bookmarkStart w:id="64" w:name="Xeca2479b337d7d1fd5c99a168897a2be1cc83b5"/>
+    <w:bookmarkEnd w:id="64"/>
+    <w:bookmarkStart w:id="65" w:name="Xeca2479b337d7d1fd5c99a168897a2be1cc83b5"/>
     <w:p>
       <w:pPr>
         <w:pStyle w:val="Heading2"/>
@@ -7596,8 +8265,8 @@
         </w:pict>
       </w:r>
     </w:p>
-    <w:bookmarkEnd w:id="64"/>
-    <w:bookmarkStart w:id="65" w:name="acceptance-criteria"/>
+    <w:bookmarkEnd w:id="65"/>
+    <w:bookmarkStart w:id="66" w:name="acceptance-criteria"/>
     <w:p>
       <w:pPr>
         <w:pStyle w:val="Heading2"/>
@@ -7694,8 +8363,8 @@
         </w:pict>
       </w:r>
     </w:p>
-    <w:bookmarkEnd w:id="65"/>
-    <w:bookmarkStart w:id="66" w:name="what-to-do-with-the-output"/>
+    <w:bookmarkEnd w:id="66"/>
+    <w:bookmarkStart w:id="67" w:name="what-to-do-with-the-output"/>
     <w:p>
       <w:pPr>
         <w:pStyle w:val="Heading2"/>
@@ -7759,8 +8428,8 @@
         <w:t xml:space="preserve">```</w:t>
       </w:r>
     </w:p>
-    <w:bookmarkEnd w:id="66"/>
     <w:bookmarkEnd w:id="67"/>
+    <w:bookmarkEnd w:id="68"/>
     <w:sectPr>
       <w:footnotePr>
         <w:numRestart w:val="eachSect"/>

</xml_diff>

<commit_message>
Surface zero-friction shortcut at the top: paste doc URL into Claude Code
</commit_message>
<xml_diff>
--- a/gtm-audit-bundle-combined.docx
+++ b/gtm-audit-bundle-combined.docx
@@ -74,7 +74,7 @@
       </w:r>
     </w:p>
     <w:bookmarkEnd w:id="10"/>
-    <w:bookmarkStart w:id="37" w:name="initial-gtm-audit-playbook"/>
+    <w:bookmarkStart w:id="38" w:name="initial-gtm-audit-playbook"/>
     <w:p>
       <w:pPr>
         <w:pStyle w:val="Heading1"/>
@@ -92,7 +92,7 @@
         <w:t xml:space="preserve">Initial GTM Audit Playbook</w:t>
       </w:r>
     </w:p>
-    <w:bookmarkStart w:id="11" w:name="X24dcb0f2bc2ae37fb871fddb05edf99c2d31c3a"/>
+    <w:bookmarkStart w:id="12" w:name="X24dcb0f2bc2ae37fb871fddb05edf99c2d31c3a"/>
     <w:p>
       <w:pPr>
         <w:pStyle w:val="Heading2"/>
@@ -117,95 +117,61 @@
         </w:pict>
       </w:r>
     </w:p>
-    <w:bookmarkEnd w:id="11"/>
-    <w:bookmarkStart w:id="12" w:name="who-this-playbook-is-for"/>
-    <w:p>
-      <w:pPr>
-        <w:pStyle w:val="Heading2"/>
+    <w:bookmarkStart w:id="11" w:name="fastest-way-to-use-this-playbook"/>
+    <w:p>
+      <w:pPr>
+        <w:pStyle w:val="Heading3"/>
       </w:pPr>
       <w:r>
         <w:rPr>
           <w:rStyle w:val="SectionNumber"/>
         </w:rPr>
-        <w:t xml:space="preserve">1.2</w:t>
+        <w:t xml:space="preserve">1.1.1</w:t>
       </w:r>
       <w:r>
         <w:tab/>
       </w:r>
       <w:r>
-        <w:t xml:space="preserve">Who This Playbook Is For</w:t>
+        <w:t xml:space="preserve">⚡ Fastest way to use this playbook</w:t>
       </w:r>
     </w:p>
     <w:p>
       <w:pPr>
         <w:pStyle w:val="FirstParagraph"/>
-      </w:pPr>
-      <w:r>
-        <w:t xml:space="preserve">This playbook is for three people.</w:t>
-      </w:r>
-    </w:p>
-    <w:p>
-      <w:pPr>
-        <w:pStyle w:val="BodyText"/>
       </w:pPr>
       <w:r>
         <w:rPr>
           <w:b/>
           <w:bCs/>
         </w:rPr>
-        <w:t xml:space="preserve">The founder-led DTC brand owner on Shopify</w:t>
-      </w:r>
-      <w:r>
-        <w:t xml:space="preserve"> </w:t>
-      </w:r>
-      <w:r>
-        <w:t xml:space="preserve">who’s been flying blind. You’re growing off a product that’s clearly working, but you don’t have a clear picture of where the binding constraint is right now. You’ve tried an agency, you’ve tried freelancers, you’ve tried doing it yourself. You want a diagnostic that tells you, plainly, in one document, what the single biggest thing holding revenue back is and what to do about it this week.</w:t>
-      </w:r>
-    </w:p>
-    <w:p>
-      <w:pPr>
-        <w:pStyle w:val="BodyText"/>
+        <w:t xml:space="preserve">Paste this document’s URL into Claude Code and say:</w:t>
+      </w:r>
+    </w:p>
+    <w:p>
+      <w:pPr>
+        <w:pStyle w:val="BlockText"/>
+      </w:pPr>
+      <w:r>
+        <w:rPr>
+          <w:i/>
+          <w:iCs/>
+        </w:rPr>
+        <w:t xml:space="preserve">“Read this and take me through it step by step.”</w:t>
+      </w:r>
+    </w:p>
+    <w:p>
+      <w:pPr>
+        <w:pStyle w:val="FirstParagraph"/>
       </w:pPr>
       <w:r>
         <w:rPr>
           <w:b/>
           <w:bCs/>
         </w:rPr>
-        <w:t xml:space="preserve">The fractional CMO managing multiple DTC clients.</w:t>
-      </w:r>
-      <w:r>
-        <w:t xml:space="preserve"> </w:t>
-      </w:r>
-      <w:r>
-        <w:t xml:space="preserve">You need consistent output across brands and a repeatable diagnostic you can run in week one of every engagement. Your problem is consistency: every client gets a slightly different audit depending on which of your team members produces it. This playbook is the same process every time, with the same ten sections, the same voice, and the same action-ranking logic. Your team reads from one script.</w:t>
-      </w:r>
-    </w:p>
-    <w:p>
-      <w:pPr>
-        <w:pStyle w:val="BodyText"/>
-      </w:pPr>
-      <w:r>
-        <w:rPr>
-          <w:b/>
-          <w:bCs/>
-        </w:rPr>
-        <w:t xml:space="preserve">The in-house growth lead at a funded DTC brand.</w:t>
-      </w:r>
-      <w:r>
-        <w:t xml:space="preserve"> </w:t>
-      </w:r>
-      <w:r>
-        <w:t xml:space="preserve">You have GA4, you have Klaviyo, you have Meta Ads data. You don’t have a single place where all of it gets pulled together with a cross-cutting narrative. You want the deliverable without paying £5,000 to an agency for a deck that takes three weeks. You want it in your GitHub, version-controlled, so next quarter you can re-run it and see what moved.</w:t>
-      </w:r>
-    </w:p>
-    <w:p>
-      <w:pPr>
-        <w:pStyle w:val="BodyText"/>
-      </w:pPr>
-      <w:r>
-        <w:t xml:space="preserve">If you’ve been piecing together a marketing audit by hand, screenshotting Meta Ads Manager, copy-pasting search terms from Search Console, writing positioning frameworks in a Notion doc, this playbook collapses all of that into one consolidated output in a single Claude Code session.</w:t>
-      </w:r>
-    </w:p>
+        <w:t xml:space="preserve">Claude will interview you for the business context, walk you through any missing API setup, and run the full audit end-to-end. You don’t need to read the rest of this document.</w:t>
+      </w:r>
+    </w:p>
+    <w:bookmarkEnd w:id="11"/>
     <w:p>
       <w:r>
         <w:pict>
@@ -214,7 +180,7 @@
       </w:r>
     </w:p>
     <w:bookmarkEnd w:id="12"/>
-    <w:bookmarkStart w:id="13" w:name="what-the-gtm-audit-actually-is"/>
+    <w:bookmarkStart w:id="13" w:name="who-this-playbook-is-for"/>
     <w:p>
       <w:pPr>
         <w:pStyle w:val="Heading2"/>
@@ -223,31 +189,39 @@
         <w:rPr>
           <w:rStyle w:val="SectionNumber"/>
         </w:rPr>
-        <w:t xml:space="preserve">1.3</w:t>
+        <w:t xml:space="preserve">1.2</w:t>
       </w:r>
       <w:r>
         <w:tab/>
       </w:r>
       <w:r>
-        <w:t xml:space="preserve">What The GTM Audit Actually Is</w:t>
+        <w:t xml:space="preserve">Who This Playbook Is For</w:t>
       </w:r>
     </w:p>
     <w:p>
       <w:pPr>
         <w:pStyle w:val="FirstParagraph"/>
+      </w:pPr>
+      <w:r>
+        <w:t xml:space="preserve">This playbook is for three people.</w:t>
+      </w:r>
+    </w:p>
+    <w:p>
+      <w:pPr>
+        <w:pStyle w:val="BodyText"/>
       </w:pPr>
       <w:r>
         <w:rPr>
           <w:b/>
           <w:bCs/>
         </w:rPr>
-        <w:t xml:space="preserve">The short version.</w:t>
-      </w:r>
-      <w:r>
-        <w:t xml:space="preserve"> </w:t>
-      </w:r>
-      <w:r>
-        <w:t xml:space="preserve">Ten sections in one consolidated report. Claude Code runs the diagnostic end-to-end: mines your audience, tears down your competitors, maps your SEO and AEO surface, scores your creative, audits your email and analytics (where access is granted), and hands back a ranked action list with the top five items to ship this week. Plus a dedicated synthesis pass that reads the whole draft end-to-end and surfaces three to five cross-cutting themes, the strategic narrative your business reveals when every finding is in view at once.</w:t>
+        <w:t xml:space="preserve">The founder-led DTC brand owner on Shopify</w:t>
+      </w:r>
+      <w:r>
+        <w:t xml:space="preserve"> </w:t>
+      </w:r>
+      <w:r>
+        <w:t xml:space="preserve">who’s been flying blind. You’re growing off a product that’s clearly working, but you don’t have a clear picture of where the binding constraint is right now. You’ve tried an agency, you’ve tried freelancers, you’ve tried doing it yourself. You want a diagnostic that tells you, plainly, in one document, what the single biggest thing holding revenue back is and what to do about it this week.</w:t>
       </w:r>
     </w:p>
     <w:p>
@@ -259,13 +233,13 @@
           <w:b/>
           <w:bCs/>
         </w:rPr>
-        <w:t xml:space="preserve">Best for.</w:t>
-      </w:r>
-      <w:r>
-        <w:t xml:space="preserve"> </w:t>
-      </w:r>
-      <w:r>
-        <w:t xml:space="preserve">Premium DTC brands. AOV £500+ or 2x category median. Founder-led. US, UK, or English-speaking European markets. Established brands with three or more months of trading history, or pre-launch brands getting ready to ship.</w:t>
+        <w:t xml:space="preserve">The fractional CMO managing multiple DTC clients.</w:t>
+      </w:r>
+      <w:r>
+        <w:t xml:space="preserve"> </w:t>
+      </w:r>
+      <w:r>
+        <w:t xml:space="preserve">You need consistent output across brands and a repeatable diagnostic you can run in week one of every engagement. Your problem is consistency: every client gets a slightly different audit depending on which of your team members produces it. This playbook is the same process every time, with the same ten sections, the same voice, and the same action-ranking logic. Your team reads from one script.</w:t>
       </w:r>
     </w:p>
     <w:p>
@@ -277,13 +251,13 @@
           <w:b/>
           <w:bCs/>
         </w:rPr>
-        <w:t xml:space="preserve">How it’s different.</w:t>
-      </w:r>
-      <w:r>
-        <w:t xml:space="preserve"> </w:t>
-      </w:r>
-      <w:r>
-        <w:t xml:space="preserve">Three things most marketing audits skip.</w:t>
+        <w:t xml:space="preserve">The in-house growth lead at a funded DTC brand.</w:t>
+      </w:r>
+      <w:r>
+        <w:t xml:space="preserve"> </w:t>
+      </w:r>
+      <w:r>
+        <w:t xml:space="preserve">You have GA4, you have Klaviyo, you have Meta Ads data. You don’t have a single place where all of it gets pulled together with a cross-cutting narrative. You want the deliverable without paying £5,000 to an agency for a deck that takes three weeks. You want it in your GitHub, version-controlled, so next quarter you can re-run it and see what moved.</w:t>
       </w:r>
     </w:p>
     <w:p>
@@ -291,107 +265,7 @@
         <w:pStyle w:val="BodyText"/>
       </w:pPr>
       <w:r>
-        <w:t xml:space="preserve">First, the</w:t>
-      </w:r>
-      <w:r>
-        <w:t xml:space="preserve"> </w:t>
-      </w:r>
-      <w:r>
-        <w:rPr>
-          <w:b/>
-          <w:bCs/>
-        </w:rPr>
-        <w:t xml:space="preserve">synthesis pass</w:t>
-      </w:r>
-      <w:r>
-        <w:t xml:space="preserve">. Section-by-section analysis gives you a directory of findings. The synthesis pass gives you the story. A competitor whitespace in Section 3 might imply a positioning change in Section 1 which unlocks an SEO content cluster in Section 4 which compounds into AEO authority in Section 5. None of those connections surface from a section-at-a-time read. Claude does the cross-read explicitly, then revises the Executive Summary to lead with the narrative.</w:t>
-      </w:r>
-    </w:p>
-    <w:p>
-      <w:pPr>
-        <w:pStyle w:val="BodyText"/>
-      </w:pPr>
-      <w:r>
-        <w:t xml:space="preserve">Second,</w:t>
-      </w:r>
-      <w:r>
-        <w:t xml:space="preserve"> </w:t>
-      </w:r>
-      <w:r>
-        <w:rPr>
-          <w:b/>
-          <w:bCs/>
-        </w:rPr>
-        <w:t xml:space="preserve">honest stubbing</w:t>
-      </w:r>
-      <w:r>
-        <w:t xml:space="preserve">. Sections 7, 8, and 9 require access to your Klaviyo, Clarity, and GA4. Without that access, they render with a clear access-grant path (what to share, with which service account, to unlock the section). No fabricated numbers. No filler paragraphs pretending to be findings.</w:t>
-      </w:r>
-    </w:p>
-    <w:p>
-      <w:pPr>
-        <w:pStyle w:val="BodyText"/>
-      </w:pPr>
-      <w:r>
-        <w:t xml:space="preserve">Third, the</w:t>
-      </w:r>
-      <w:r>
-        <w:t xml:space="preserve"> </w:t>
-      </w:r>
-      <w:r>
-        <w:rPr>
-          <w:b/>
-          <w:bCs/>
-        </w:rPr>
-        <w:t xml:space="preserve">output format</w:t>
-      </w:r>
-      <w:r>
-        <w:t xml:space="preserve">. One Word doc you can share with your team, plus the markdown source in your GitHub repo. Version-controlled. Re-runnable quarterly. Integrated with your</w:t>
-      </w:r>
-      <w:r>
-        <w:t xml:space="preserve"> </w:t>
-      </w:r>
-      <w:r>
-        <w:rPr>
-          <w:rStyle w:val="VerbatimChar"/>
-        </w:rPr>
-        <w:t xml:space="preserve">actions.md</w:t>
-      </w:r>
-      <w:r>
-        <w:t xml:space="preserve"> </w:t>
-      </w:r>
-      <w:r>
-        <w:t xml:space="preserve">so the top five</w:t>
-      </w:r>
-      <w:r>
-        <w:t xml:space="preserve"> </w:t>
-      </w:r>
-      <w:r>
-        <w:t xml:space="preserve">“this week”</w:t>
-      </w:r>
-      <w:r>
-        <w:t xml:space="preserve"> </w:t>
-      </w:r>
-      <w:r>
-        <w:t xml:space="preserve">items merge straight into your team’s operating plan.</w:t>
-      </w:r>
-    </w:p>
-    <w:p>
-      <w:pPr>
-        <w:pStyle w:val="BodyText"/>
-      </w:pPr>
-      <w:r>
-        <w:rPr>
-          <w:b/>
-          <w:bCs/>
-        </w:rPr>
-        <w:t xml:space="preserve">Skip this playbook if</w:t>
-      </w:r>
-      <w:r>
-        <w:t xml:space="preserve"> </w:t>
-      </w:r>
-      <w:r>
-        <w:t xml:space="preserve">you’re a service business, a B2B SaaS, or a brand selling at the mass-market tier. The audit is tuned for premium DTC and the recommendations will be directionally off for other contexts.</w:t>
+        <w:t xml:space="preserve">If you’ve been piecing together a marketing audit by hand, screenshotting Meta Ads Manager, copy-pasting search terms from Search Console, writing positioning frameworks in a Notion doc, this playbook collapses all of that into one consolidated output in a single Claude Code session.</w:t>
       </w:r>
     </w:p>
     <w:p>
@@ -402,7 +276,7 @@
       </w:r>
     </w:p>
     <w:bookmarkEnd w:id="13"/>
-    <w:bookmarkStart w:id="23" w:name="setup-15-minutes"/>
+    <w:bookmarkStart w:id="14" w:name="what-the-gtm-audit-actually-is"/>
     <w:p>
       <w:pPr>
         <w:pStyle w:val="Heading2"/>
@@ -411,6 +285,194 @@
         <w:rPr>
           <w:rStyle w:val="SectionNumber"/>
         </w:rPr>
+        <w:t xml:space="preserve">1.3</w:t>
+      </w:r>
+      <w:r>
+        <w:tab/>
+      </w:r>
+      <w:r>
+        <w:t xml:space="preserve">What The GTM Audit Actually Is</w:t>
+      </w:r>
+    </w:p>
+    <w:p>
+      <w:pPr>
+        <w:pStyle w:val="FirstParagraph"/>
+      </w:pPr>
+      <w:r>
+        <w:rPr>
+          <w:b/>
+          <w:bCs/>
+        </w:rPr>
+        <w:t xml:space="preserve">The short version.</w:t>
+      </w:r>
+      <w:r>
+        <w:t xml:space="preserve"> </w:t>
+      </w:r>
+      <w:r>
+        <w:t xml:space="preserve">Ten sections in one consolidated report. Claude Code runs the diagnostic end-to-end: mines your audience, tears down your competitors, maps your SEO and AEO surface, scores your creative, audits your email and analytics (where access is granted), and hands back a ranked action list with the top five items to ship this week. Plus a dedicated synthesis pass that reads the whole draft end-to-end and surfaces three to five cross-cutting themes, the strategic narrative your business reveals when every finding is in view at once.</w:t>
+      </w:r>
+    </w:p>
+    <w:p>
+      <w:pPr>
+        <w:pStyle w:val="BodyText"/>
+      </w:pPr>
+      <w:r>
+        <w:rPr>
+          <w:b/>
+          <w:bCs/>
+        </w:rPr>
+        <w:t xml:space="preserve">Best for.</w:t>
+      </w:r>
+      <w:r>
+        <w:t xml:space="preserve"> </w:t>
+      </w:r>
+      <w:r>
+        <w:t xml:space="preserve">Premium DTC brands. AOV £500+ or 2x category median. Founder-led. US, UK, or English-speaking European markets. Established brands with three or more months of trading history, or pre-launch brands getting ready to ship.</w:t>
+      </w:r>
+    </w:p>
+    <w:p>
+      <w:pPr>
+        <w:pStyle w:val="BodyText"/>
+      </w:pPr>
+      <w:r>
+        <w:rPr>
+          <w:b/>
+          <w:bCs/>
+        </w:rPr>
+        <w:t xml:space="preserve">How it’s different.</w:t>
+      </w:r>
+      <w:r>
+        <w:t xml:space="preserve"> </w:t>
+      </w:r>
+      <w:r>
+        <w:t xml:space="preserve">Three things most marketing audits skip.</w:t>
+      </w:r>
+    </w:p>
+    <w:p>
+      <w:pPr>
+        <w:pStyle w:val="BodyText"/>
+      </w:pPr>
+      <w:r>
+        <w:t xml:space="preserve">First, the</w:t>
+      </w:r>
+      <w:r>
+        <w:t xml:space="preserve"> </w:t>
+      </w:r>
+      <w:r>
+        <w:rPr>
+          <w:b/>
+          <w:bCs/>
+        </w:rPr>
+        <w:t xml:space="preserve">synthesis pass</w:t>
+      </w:r>
+      <w:r>
+        <w:t xml:space="preserve">. Section-by-section analysis gives you a directory of findings. The synthesis pass gives you the story. A competitor whitespace in Section 3 might imply a positioning change in Section 1 which unlocks an SEO content cluster in Section 4 which compounds into AEO authority in Section 5. None of those connections surface from a section-at-a-time read. Claude does the cross-read explicitly, then revises the Executive Summary to lead with the narrative.</w:t>
+      </w:r>
+    </w:p>
+    <w:p>
+      <w:pPr>
+        <w:pStyle w:val="BodyText"/>
+      </w:pPr>
+      <w:r>
+        <w:t xml:space="preserve">Second,</w:t>
+      </w:r>
+      <w:r>
+        <w:t xml:space="preserve"> </w:t>
+      </w:r>
+      <w:r>
+        <w:rPr>
+          <w:b/>
+          <w:bCs/>
+        </w:rPr>
+        <w:t xml:space="preserve">honest stubbing</w:t>
+      </w:r>
+      <w:r>
+        <w:t xml:space="preserve">. Sections 7, 8, and 9 require access to your Klaviyo, Clarity, and GA4. Without that access, they render with a clear access-grant path (what to share, with which service account, to unlock the section). No fabricated numbers. No filler paragraphs pretending to be findings.</w:t>
+      </w:r>
+    </w:p>
+    <w:p>
+      <w:pPr>
+        <w:pStyle w:val="BodyText"/>
+      </w:pPr>
+      <w:r>
+        <w:t xml:space="preserve">Third, the</w:t>
+      </w:r>
+      <w:r>
+        <w:t xml:space="preserve"> </w:t>
+      </w:r>
+      <w:r>
+        <w:rPr>
+          <w:b/>
+          <w:bCs/>
+        </w:rPr>
+        <w:t xml:space="preserve">output format</w:t>
+      </w:r>
+      <w:r>
+        <w:t xml:space="preserve">. One Word doc you can share with your team, plus the markdown source in your GitHub repo. Version-controlled. Re-runnable quarterly. Integrated with your</w:t>
+      </w:r>
+      <w:r>
+        <w:t xml:space="preserve"> </w:t>
+      </w:r>
+      <w:r>
+        <w:rPr>
+          <w:rStyle w:val="VerbatimChar"/>
+        </w:rPr>
+        <w:t xml:space="preserve">actions.md</w:t>
+      </w:r>
+      <w:r>
+        <w:t xml:space="preserve"> </w:t>
+      </w:r>
+      <w:r>
+        <w:t xml:space="preserve">so the top five</w:t>
+      </w:r>
+      <w:r>
+        <w:t xml:space="preserve"> </w:t>
+      </w:r>
+      <w:r>
+        <w:t xml:space="preserve">“this week”</w:t>
+      </w:r>
+      <w:r>
+        <w:t xml:space="preserve"> </w:t>
+      </w:r>
+      <w:r>
+        <w:t xml:space="preserve">items merge straight into your team’s operating plan.</w:t>
+      </w:r>
+    </w:p>
+    <w:p>
+      <w:pPr>
+        <w:pStyle w:val="BodyText"/>
+      </w:pPr>
+      <w:r>
+        <w:rPr>
+          <w:b/>
+          <w:bCs/>
+        </w:rPr>
+        <w:t xml:space="preserve">Skip this playbook if</w:t>
+      </w:r>
+      <w:r>
+        <w:t xml:space="preserve"> </w:t>
+      </w:r>
+      <w:r>
+        <w:t xml:space="preserve">you’re a service business, a B2B SaaS, or a brand selling at the mass-market tier. The audit is tuned for premium DTC and the recommendations will be directionally off for other contexts.</w:t>
+      </w:r>
+    </w:p>
+    <w:p>
+      <w:r>
+        <w:pict>
+          <v:rect style="width:0;height:1.5pt" o:hralign="center" o:hrstd="t" o:hr="t"/>
+        </w:pict>
+      </w:r>
+    </w:p>
+    <w:bookmarkEnd w:id="14"/>
+    <w:bookmarkStart w:id="24" w:name="setup-15-minutes"/>
+    <w:p>
+      <w:pPr>
+        <w:pStyle w:val="Heading2"/>
+      </w:pPr>
+      <w:r>
+        <w:rPr>
+          <w:rStyle w:val="SectionNumber"/>
+        </w:rPr>
         <w:t xml:space="preserve">1.4</w:t>
       </w:r>
       <w:r>
@@ -420,7 +482,7 @@
         <w:t xml:space="preserve">Setup (15 Minutes)</w:t>
       </w:r>
     </w:p>
-    <w:bookmarkStart w:id="16" w:name="prerequisites"/>
+    <w:bookmarkStart w:id="17" w:name="prerequisites"/>
     <w:p>
       <w:pPr>
         <w:pStyle w:val="Heading3"/>
@@ -470,7 +532,7 @@
       <w:r>
         <w:t xml:space="preserve"> </w:t>
       </w:r>
-      <w:hyperlink r:id="rId14">
+      <w:hyperlink r:id="rId15">
         <w:r>
           <w:rPr>
             <w:rStyle w:val="Hyperlink"/>
@@ -530,7 +592,7 @@
       <w:r>
         <w:t xml:space="preserve"> </w:t>
       </w:r>
-      <w:hyperlink r:id="rId15">
+      <w:hyperlink r:id="rId16">
         <w:r>
           <w:rPr>
             <w:rStyle w:val="Hyperlink"/>
@@ -576,8 +638,8 @@
         <w:t xml:space="preserve">on your machine. One per brand you audit. Name it after the brand.</w:t>
       </w:r>
     </w:p>
-    <w:bookmarkEnd w:id="16"/>
-    <w:bookmarkStart w:id="17" w:name="cost-overview"/>
+    <w:bookmarkEnd w:id="17"/>
+    <w:bookmarkStart w:id="18" w:name="cost-overview"/>
     <w:p>
       <w:pPr>
         <w:pStyle w:val="Heading3"/>
@@ -1257,8 +1319,8 @@
         <w:t xml:space="preserve">Numbers above are approximate as of April 2026. Pricing changes. When you run the master prompt, Claude will print the credential inventory and offer to look up current sign-up steps and pricing for any tool you’re missing, straight from the web.</w:t>
       </w:r>
     </w:p>
-    <w:bookmarkEnd w:id="17"/>
-    <w:bookmarkStart w:id="18" w:name="step-1-create-the-project-folder"/>
+    <w:bookmarkEnd w:id="18"/>
+    <w:bookmarkStart w:id="19" w:name="step-1-create-the-project-folder"/>
     <w:p>
       <w:pPr>
         <w:pStyle w:val="Heading3"/>
@@ -1325,8 +1387,8 @@
         <w:t xml:space="preserve">Drop the three files from this bundle (CLAUDE.md, gtm-audit.md, README.md) into the folder.</w:t>
       </w:r>
     </w:p>
-    <w:bookmarkEnd w:id="18"/>
-    <w:bookmarkStart w:id="20" w:name="Xcb368a2042c4e7e90b8e53bd43dc508cb93effb"/>
+    <w:bookmarkEnd w:id="19"/>
+    <w:bookmarkStart w:id="21" w:name="Xcb368a2042c4e7e90b8e53bd43dc508cb93effb"/>
     <w:p>
       <w:pPr>
         <w:pStyle w:val="Heading3"/>
@@ -1475,7 +1537,7 @@
       <w:r>
         <w:t xml:space="preserve"> </w:t>
       </w:r>
-      <w:hyperlink r:id="rId19">
+      <w:hyperlink r:id="rId20">
         <w:r>
           <w:rPr>
             <w:rStyle w:val="Hyperlink"/>
@@ -1565,8 +1627,8 @@
         <w:t xml:space="preserve">before your first commit.</w:t>
       </w:r>
     </w:p>
-    <w:bookmarkEnd w:id="20"/>
-    <w:bookmarkStart w:id="21" w:name="Xfd27a84db74deb94109549c423df99f37315a33"/>
+    <w:bookmarkEnd w:id="21"/>
+    <w:bookmarkStart w:id="22" w:name="Xfd27a84db74deb94109549c423df99f37315a33"/>
     <w:p>
       <w:pPr>
         <w:pStyle w:val="Heading3"/>
@@ -1714,8 +1776,8 @@
         <w:t xml:space="preserve">However you populate it, the three-to-five competitor URLs are load-bearing. The audit auto-pulls competitor keyword data via DataForSEO in Section 3. Without competitor URLs Claude has to auto-discover them from the SERPs, which usually works but your hand-picked list is always sharper.</w:t>
       </w:r>
     </w:p>
-    <w:bookmarkEnd w:id="21"/>
-    <w:bookmarkStart w:id="22" w:name="step-4-open-claude-code-in-the-folder"/>
+    <w:bookmarkEnd w:id="22"/>
+    <w:bookmarkStart w:id="23" w:name="step-4-open-claude-code-in-the-folder"/>
     <w:p>
       <w:pPr>
         <w:pStyle w:val="Heading3"/>
@@ -1786,9 +1848,9 @@
         </w:pict>
       </w:r>
     </w:p>
-    <w:bookmarkEnd w:id="22"/>
     <w:bookmarkEnd w:id="23"/>
-    <w:bookmarkStart w:id="27" w:name="the-three-files-in-this-bundle"/>
+    <w:bookmarkEnd w:id="24"/>
+    <w:bookmarkStart w:id="28" w:name="the-three-files-in-this-bundle"/>
     <w:p>
       <w:pPr>
         <w:pStyle w:val="Heading2"/>
@@ -1806,7 +1868,7 @@
         <w:t xml:space="preserve">The Three Files in This Bundle</w:t>
       </w:r>
     </w:p>
-    <w:bookmarkStart w:id="24" w:name="Xc890e52cf3abe4f1818b403252832aa721cc8ce"/>
+    <w:bookmarkStart w:id="25" w:name="Xc890e52cf3abe4f1818b403252832aa721cc8ce"/>
     <w:p>
       <w:pPr>
         <w:pStyle w:val="Heading3"/>
@@ -1892,8 +1954,8 @@
         <w:t xml:space="preserve">with your specifics. Keep it tight, one to two sentences per field beats a paragraph. Founder voice beats marketing copy.</w:t>
       </w:r>
     </w:p>
-    <w:bookmarkEnd w:id="24"/>
-    <w:bookmarkStart w:id="25" w:name="X7c60c6c4885b1dc6ef6cb2de83582875ff4db68"/>
+    <w:bookmarkEnd w:id="25"/>
+    <w:bookmarkStart w:id="26" w:name="X7c60c6c4885b1dc6ef6cb2de83582875ff4db68"/>
     <w:p>
       <w:pPr>
         <w:pStyle w:val="Heading3"/>
@@ -1964,8 +2026,8 @@
         <w:t xml:space="preserve">Paste its entire contents into Claude Code and hit enter. Don’t edit it unless you know what you’re doing, the structure is load-bearing.</w:t>
       </w:r>
     </w:p>
-    <w:bookmarkEnd w:id="25"/>
-    <w:bookmarkStart w:id="26" w:name="file-3-readme.md"/>
+    <w:bookmarkEnd w:id="26"/>
+    <w:bookmarkStart w:id="27" w:name="file-3-readme.md"/>
     <w:p>
       <w:pPr>
         <w:pStyle w:val="Heading3"/>
@@ -2027,9 +2089,9 @@
         </w:pict>
       </w:r>
     </w:p>
-    <w:bookmarkEnd w:id="26"/>
     <w:bookmarkEnd w:id="27"/>
-    <w:bookmarkStart w:id="28" w:name="your-first-run"/>
+    <w:bookmarkEnd w:id="28"/>
+    <w:bookmarkStart w:id="29" w:name="your-first-run"/>
     <w:p>
       <w:pPr>
         <w:pStyle w:val="Heading2"/>
@@ -2252,8 +2314,8 @@
         </w:pict>
       </w:r>
     </w:p>
-    <w:bookmarkEnd w:id="28"/>
-    <w:bookmarkStart w:id="29" w:name="what-youll-get"/>
+    <w:bookmarkEnd w:id="29"/>
+    <w:bookmarkStart w:id="30" w:name="what-youll-get"/>
     <w:p>
       <w:pPr>
         <w:pStyle w:val="Heading2"/>
@@ -2554,8 +2616,8 @@
         </w:pict>
       </w:r>
     </w:p>
-    <w:bookmarkEnd w:id="29"/>
-    <w:bookmarkStart w:id="30" w:name="modes"/>
+    <w:bookmarkEnd w:id="30"/>
+    <w:bookmarkStart w:id="31" w:name="modes"/>
     <w:p>
       <w:pPr>
         <w:pStyle w:val="Heading2"/>
@@ -2814,8 +2876,8 @@
         </w:pict>
       </w:r>
     </w:p>
-    <w:bookmarkEnd w:id="30"/>
-    <w:bookmarkStart w:id="31" w:name="honest-caveats"/>
+    <w:bookmarkEnd w:id="31"/>
+    <w:bookmarkStart w:id="32" w:name="honest-caveats"/>
     <w:p>
       <w:pPr>
         <w:pStyle w:val="Heading2"/>
@@ -2972,8 +3034,8 @@
         </w:pict>
       </w:r>
     </w:p>
-    <w:bookmarkEnd w:id="31"/>
-    <w:bookmarkStart w:id="32" w:name="quick-start-checklist"/>
+    <w:bookmarkEnd w:id="32"/>
+    <w:bookmarkStart w:id="33" w:name="quick-start-checklist"/>
     <w:p>
       <w:pPr>
         <w:pStyle w:val="Heading2"/>
@@ -3311,8 +3373,8 @@
         </w:pict>
       </w:r>
     </w:p>
-    <w:bookmarkEnd w:id="32"/>
-    <w:bookmarkStart w:id="33" w:name="troubleshooting"/>
+    <w:bookmarkEnd w:id="33"/>
+    <w:bookmarkStart w:id="34" w:name="troubleshooting"/>
     <w:p>
       <w:pPr>
         <w:pStyle w:val="Heading2"/>
@@ -3430,7 +3492,7 @@
             <w:r>
               <w:t xml:space="preserve"> </w:t>
             </w:r>
-            <w:hyperlink r:id="rId15">
+            <w:hyperlink r:id="rId16">
               <w:r>
                 <w:rPr>
                   <w:rStyle w:val="Hyperlink"/>
@@ -3666,8 +3728,8 @@
         </w:pict>
       </w:r>
     </w:p>
-    <w:bookmarkEnd w:id="33"/>
-    <w:bookmarkStart w:id="36" w:name="credit"/>
+    <w:bookmarkEnd w:id="34"/>
+    <w:bookmarkStart w:id="37" w:name="credit"/>
     <w:p>
       <w:pPr>
         <w:pStyle w:val="Heading2"/>
@@ -3714,7 +3776,7 @@
       <w:r>
         <w:t xml:space="preserve"> </w:t>
       </w:r>
-      <w:hyperlink r:id="rId34">
+      <w:hyperlink r:id="rId35">
         <w:r>
           <w:rPr>
             <w:rStyle w:val="Hyperlink"/>
@@ -3796,7 +3858,7 @@
       <w:r>
         <w:t xml:space="preserve"> </w:t>
       </w:r>
-      <w:hyperlink r:id="rId35">
+      <w:hyperlink r:id="rId36">
         <w:r>
           <w:rPr>
             <w:rStyle w:val="Hyperlink"/>
@@ -3821,9 +3883,9 @@
         <w:t xml:space="preserve">================================================================================</w:t>
       </w:r>
     </w:p>
-    <w:bookmarkEnd w:id="36"/>
     <w:bookmarkEnd w:id="37"/>
-    <w:bookmarkStart w:id="38" w:name="X527a1c952b73df6849f10da3ff4461cc53fe709"/>
+    <w:bookmarkEnd w:id="38"/>
+    <w:bookmarkStart w:id="39" w:name="X527a1c952b73df6849f10da3ff4461cc53fe709"/>
     <w:p>
       <w:pPr>
         <w:pStyle w:val="Heading1"/>
@@ -4879,8 +4941,8 @@
         <w:t xml:space="preserve">================================================================================</w:t>
       </w:r>
     </w:p>
-    <w:bookmarkEnd w:id="38"/>
-    <w:bookmarkStart w:id="46" w:name="X4e7d28ab2fdd2b5e27aced169d72f72ff40f684"/>
+    <w:bookmarkEnd w:id="39"/>
+    <w:bookmarkStart w:id="47" w:name="X4e7d28ab2fdd2b5e27aced169d72f72ff40f684"/>
     <w:p>
       <w:pPr>
         <w:pStyle w:val="Heading1"/>
@@ -6114,7 +6176,7 @@
         <w:t xml:space="preserve">Internal-heavy. If Klaviyo or Brevo is not configured, render the stub:</w:t>
       </w:r>
     </w:p>
-    <w:bookmarkStart w:id="39" w:name="email-lifecycle-and-crm"/>
+    <w:bookmarkStart w:id="40" w:name="email-lifecycle-and-crm"/>
     <w:p>
       <w:pPr>
         <w:pStyle w:val="Heading2"/>
@@ -6495,8 +6557,8 @@
         <w:t xml:space="preserve">### Audience Insights prompt (inlined for Section 1)</w:t>
       </w:r>
     </w:p>
-    <w:bookmarkEnd w:id="39"/>
-    <w:bookmarkStart w:id="40" w:name="role"/>
+    <w:bookmarkEnd w:id="40"/>
+    <w:bookmarkStart w:id="41" w:name="role"/>
     <w:p>
       <w:pPr>
         <w:pStyle w:val="Heading2"/>
@@ -6534,8 +6596,8 @@
         <w:t xml:space="preserve">founder reviews in under 5 minutes and approves or redirects section by section.</w:t>
       </w:r>
     </w:p>
-    <w:bookmarkEnd w:id="40"/>
-    <w:bookmarkStart w:id="41" w:name="inputs-required-refuse-if-any-missing"/>
+    <w:bookmarkEnd w:id="41"/>
+    <w:bookmarkStart w:id="42" w:name="inputs-required-refuse-if-any-missing"/>
     <w:p>
       <w:pPr>
         <w:pStyle w:val="Heading2"/>
@@ -6603,8 +6665,8 @@
         <w:t xml:space="preserve">“Unable to proceed without audience, struggle, and product.”</w:t>
       </w:r>
     </w:p>
-    <w:bookmarkEnd w:id="41"/>
-    <w:bookmarkStart w:id="42" w:name="research-method"/>
+    <w:bookmarkEnd w:id="42"/>
+    <w:bookmarkStart w:id="43" w:name="research-method"/>
     <w:p>
       <w:pPr>
         <w:pStyle w:val="Heading2"/>
@@ -6700,8 +6762,8 @@
         <w:t xml:space="preserve">recurs across multiple quotes.</w:t>
       </w:r>
     </w:p>
-    <w:bookmarkEnd w:id="42"/>
-    <w:bookmarkStart w:id="43" w:name="deliverable-the-one-pager"/>
+    <w:bookmarkEnd w:id="43"/>
+    <w:bookmarkStart w:id="44" w:name="deliverable-the-one-pager"/>
     <w:p>
       <w:pPr>
         <w:pStyle w:val="Heading2"/>
@@ -6889,8 +6951,8 @@
         <w:t xml:space="preserve">buying.</w:t>
       </w:r>
     </w:p>
-    <w:bookmarkEnd w:id="43"/>
-    <w:bookmarkStart w:id="44" w:name="appendix-verbatim-quotes-15"/>
+    <w:bookmarkEnd w:id="44"/>
+    <w:bookmarkStart w:id="45" w:name="appendix-verbatim-quotes-15"/>
     <w:p>
       <w:pPr>
         <w:pStyle w:val="Heading2"/>
@@ -6931,8 +6993,8 @@
         <w:t xml:space="preserve">Save to data/gtm-audit/{YYYY-MM-DD}/audience-voc-mining.md</w:t>
       </w:r>
     </w:p>
-    <w:bookmarkEnd w:id="44"/>
-    <w:bookmarkStart w:id="45" w:name="rules"/>
+    <w:bookmarkEnd w:id="45"/>
+    <w:bookmarkStart w:id="46" w:name="rules"/>
     <w:p>
       <w:pPr>
         <w:pStyle w:val="Heading2"/>
@@ -7492,9 +7554,9 @@
         <w:t xml:space="preserve">Report structure (fixed order):</w:t>
       </w:r>
     </w:p>
-    <w:bookmarkEnd w:id="45"/>
     <w:bookmarkEnd w:id="46"/>
-    <w:bookmarkStart w:id="68" w:name="gtm-audit-brand-name-yyyy-mm-dd"/>
+    <w:bookmarkEnd w:id="47"/>
+    <w:bookmarkStart w:id="69" w:name="gtm-audit-brand-name-yyyy-mm-dd"/>
     <w:p>
       <w:pPr>
         <w:pStyle w:val="Heading1"/>
@@ -7526,7 +7588,7 @@
         <w:t xml:space="preserve">Access level: {External only / External + Internal}</w:t>
       </w:r>
     </w:p>
-    <w:bookmarkStart w:id="47" w:name="executive-summary"/>
+    <w:bookmarkStart w:id="48" w:name="executive-summary"/>
     <w:p>
       <w:pPr>
         <w:pStyle w:val="Heading2"/>
@@ -7552,8 +7614,8 @@
         <w:t xml:space="preserve">(3-4 sentences leading with the narrative)</w:t>
       </w:r>
     </w:p>
-    <w:bookmarkEnd w:id="47"/>
-    <w:bookmarkStart w:id="48" w:name="cross-cutting-themes"/>
+    <w:bookmarkEnd w:id="48"/>
+    <w:bookmarkStart w:id="49" w:name="cross-cutting-themes"/>
     <w:p>
       <w:pPr>
         <w:pStyle w:val="Heading2"/>
@@ -7579,8 +7641,8 @@
         <w:t xml:space="preserve">(3-5 synthesis bullets from Step 5)</w:t>
       </w:r>
     </w:p>
-    <w:bookmarkEnd w:id="48"/>
-    <w:bookmarkStart w:id="49" w:name="key-findings"/>
+    <w:bookmarkEnd w:id="49"/>
+    <w:bookmarkStart w:id="50" w:name="key-findings"/>
     <w:p>
       <w:pPr>
         <w:pStyle w:val="Heading2"/>
@@ -7606,8 +7668,8 @@
         <w:t xml:space="preserve">(5-7 one-line bullets across sections)</w:t>
       </w:r>
     </w:p>
-    <w:bookmarkEnd w:id="49"/>
-    <w:bookmarkStart w:id="50" w:name="key-action-items-top-5-this-week"/>
+    <w:bookmarkEnd w:id="50"/>
+    <w:bookmarkStart w:id="51" w:name="key-action-items-top-5-this-week"/>
     <w:p>
       <w:pPr>
         <w:pStyle w:val="Heading2"/>
@@ -7642,8 +7704,8 @@
         <w:t xml:space="preserve">)</w:t>
       </w:r>
     </w:p>
-    <w:bookmarkEnd w:id="50"/>
-    <w:bookmarkStart w:id="51" w:name="audience"/>
+    <w:bookmarkEnd w:id="51"/>
+    <w:bookmarkStart w:id="52" w:name="audience"/>
     <w:p>
       <w:pPr>
         <w:pStyle w:val="Heading2"/>
@@ -7661,8 +7723,8 @@
         <w:t xml:space="preserve">1. Audience</w:t>
       </w:r>
     </w:p>
-    <w:bookmarkEnd w:id="51"/>
-    <w:bookmarkStart w:id="52" w:name="vision"/>
+    <w:bookmarkEnd w:id="52"/>
+    <w:bookmarkStart w:id="53" w:name="vision"/>
     <w:p>
       <w:pPr>
         <w:pStyle w:val="Heading2"/>
@@ -7680,8 +7742,8 @@
         <w:t xml:space="preserve">2. Vision</w:t>
       </w:r>
     </w:p>
-    <w:bookmarkEnd w:id="52"/>
-    <w:bookmarkStart w:id="53" w:name="competitor-audit"/>
+    <w:bookmarkEnd w:id="53"/>
+    <w:bookmarkStart w:id="54" w:name="competitor-audit"/>
     <w:p>
       <w:pPr>
         <w:pStyle w:val="Heading2"/>
@@ -7699,8 +7761,8 @@
         <w:t xml:space="preserve">3. Competitor Audit</w:t>
       </w:r>
     </w:p>
-    <w:bookmarkEnd w:id="53"/>
-    <w:bookmarkStart w:id="54" w:name="seo"/>
+    <w:bookmarkEnd w:id="54"/>
+    <w:bookmarkStart w:id="55" w:name="seo"/>
     <w:p>
       <w:pPr>
         <w:pStyle w:val="Heading2"/>
@@ -7718,8 +7780,8 @@
         <w:t xml:space="preserve">4. SEO</w:t>
       </w:r>
     </w:p>
-    <w:bookmarkEnd w:id="54"/>
-    <w:bookmarkStart w:id="55" w:name="aeo"/>
+    <w:bookmarkEnd w:id="55"/>
+    <w:bookmarkStart w:id="56" w:name="aeo"/>
     <w:p>
       <w:pPr>
         <w:pStyle w:val="Heading2"/>
@@ -7737,8 +7799,8 @@
         <w:t xml:space="preserve">5. AEO</w:t>
       </w:r>
     </w:p>
-    <w:bookmarkEnd w:id="55"/>
-    <w:bookmarkStart w:id="56" w:name="paid-ad-recommendations"/>
+    <w:bookmarkEnd w:id="56"/>
+    <w:bookmarkStart w:id="57" w:name="paid-ad-recommendations"/>
     <w:p>
       <w:pPr>
         <w:pStyle w:val="Heading2"/>
@@ -7756,8 +7818,8 @@
         <w:t xml:space="preserve">6. Paid Ad Recommendations</w:t>
       </w:r>
     </w:p>
-    <w:bookmarkEnd w:id="56"/>
-    <w:bookmarkStart w:id="57" w:name="email-lifecycle-and-crm-1"/>
+    <w:bookmarkEnd w:id="57"/>
+    <w:bookmarkStart w:id="58" w:name="email-lifecycle-and-crm-1"/>
     <w:p>
       <w:pPr>
         <w:pStyle w:val="Heading2"/>
@@ -7775,8 +7837,8 @@
         <w:t xml:space="preserve">7. Email, Lifecycle, and CRM</w:t>
       </w:r>
     </w:p>
-    <w:bookmarkEnd w:id="57"/>
-    <w:bookmarkStart w:id="58" w:name="conversion-optimisation"/>
+    <w:bookmarkEnd w:id="58"/>
+    <w:bookmarkStart w:id="59" w:name="conversion-optimisation"/>
     <w:p>
       <w:pPr>
         <w:pStyle w:val="Heading2"/>
@@ -7794,8 +7856,8 @@
         <w:t xml:space="preserve">8. Conversion Optimisation</w:t>
       </w:r>
     </w:p>
-    <w:bookmarkEnd w:id="58"/>
-    <w:bookmarkStart w:id="59" w:name="analytics-and-tracking"/>
+    <w:bookmarkEnd w:id="59"/>
+    <w:bookmarkStart w:id="60" w:name="analytics-and-tracking"/>
     <w:p>
       <w:pPr>
         <w:pStyle w:val="Heading2"/>
@@ -7813,8 +7875,8 @@
         <w:t xml:space="preserve">9. Analytics and Tracking</w:t>
       </w:r>
     </w:p>
-    <w:bookmarkEnd w:id="59"/>
-    <w:bookmarkStart w:id="60" w:name="prioritised-action-items"/>
+    <w:bookmarkEnd w:id="60"/>
+    <w:bookmarkStart w:id="61" w:name="prioritised-action-items"/>
     <w:p>
       <w:pPr>
         <w:pStyle w:val="Heading2"/>
@@ -7832,8 +7894,8 @@
         <w:t xml:space="preserve">10. Prioritised Action Items</w:t>
       </w:r>
     </w:p>
-    <w:bookmarkEnd w:id="60"/>
-    <w:bookmarkStart w:id="61" w:name="access-grant-checklist"/>
+    <w:bookmarkEnd w:id="61"/>
+    <w:bookmarkStart w:id="62" w:name="access-grant-checklist"/>
     <w:p>
       <w:pPr>
         <w:pStyle w:val="Heading2"/>
@@ -7859,8 +7921,8 @@
         <w:t xml:space="preserve">(Only appears if any Internal-layer section is stubbed)</w:t>
       </w:r>
     </w:p>
-    <w:bookmarkEnd w:id="61"/>
-    <w:bookmarkStart w:id="62" w:name="conclusion"/>
+    <w:bookmarkEnd w:id="62"/>
+    <w:bookmarkStart w:id="63" w:name="conclusion"/>
     <w:p>
       <w:pPr>
         <w:pStyle w:val="Heading2"/>
@@ -8028,8 +8090,8 @@
         </w:pict>
       </w:r>
     </w:p>
-    <w:bookmarkEnd w:id="62"/>
-    <w:bookmarkStart w:id="63" w:name="step-8.-merge-into-actions.md"/>
+    <w:bookmarkEnd w:id="63"/>
+    <w:bookmarkStart w:id="64" w:name="step-8.-merge-into-actions.md"/>
     <w:p>
       <w:pPr>
         <w:pStyle w:val="Heading2"/>
@@ -8089,8 +8151,8 @@
         </w:pict>
       </w:r>
     </w:p>
-    <w:bookmarkEnd w:id="63"/>
-    <w:bookmarkStart w:id="64" w:name="step-9.-commit-optional"/>
+    <w:bookmarkEnd w:id="64"/>
+    <w:bookmarkStart w:id="65" w:name="step-9.-commit-optional"/>
     <w:p>
       <w:pPr>
         <w:pStyle w:val="Heading2"/>
@@ -8134,8 +8196,8 @@
         </w:pict>
       </w:r>
     </w:p>
-    <w:bookmarkEnd w:id="64"/>
-    <w:bookmarkStart w:id="65" w:name="Xeca2479b337d7d1fd5c99a168897a2be1cc83b5"/>
+    <w:bookmarkEnd w:id="65"/>
+    <w:bookmarkStart w:id="66" w:name="Xeca2479b337d7d1fd5c99a168897a2be1cc83b5"/>
     <w:p>
       <w:pPr>
         <w:pStyle w:val="Heading2"/>
@@ -8265,8 +8327,8 @@
         </w:pict>
       </w:r>
     </w:p>
-    <w:bookmarkEnd w:id="65"/>
-    <w:bookmarkStart w:id="66" w:name="acceptance-criteria"/>
+    <w:bookmarkEnd w:id="66"/>
+    <w:bookmarkStart w:id="67" w:name="acceptance-criteria"/>
     <w:p>
       <w:pPr>
         <w:pStyle w:val="Heading2"/>
@@ -8363,8 +8425,8 @@
         </w:pict>
       </w:r>
     </w:p>
-    <w:bookmarkEnd w:id="66"/>
-    <w:bookmarkStart w:id="67" w:name="what-to-do-with-the-output"/>
+    <w:bookmarkEnd w:id="67"/>
+    <w:bookmarkStart w:id="68" w:name="what-to-do-with-the-output"/>
     <w:p>
       <w:pPr>
         <w:pStyle w:val="Heading2"/>
@@ -8428,8 +8490,8 @@
         <w:t xml:space="preserve">```</w:t>
       </w:r>
     </w:p>
-    <w:bookmarkEnd w:id="67"/>
     <w:bookmarkEnd w:id="68"/>
+    <w:bookmarkEnd w:id="69"/>
     <w:sectPr>
       <w:footnotePr>
         <w:numRestart w:val="eachSect"/>

</xml_diff>